<commit_message>
Update design doc: related work, verified model cutoffs, effective-cutoff check, control-group limits
Co-Authored-By: Claude Sonnet 5.5 <noreply@anthropic.com>
Claude-Session: https://claude.ai/code/session_015MZUD41psp6knHtKmwofCK
</commit_message>
<xml_diff>
--- a/retraining_loop_research_design.docx
+++ b/retraining_loop_research_design.docx
@@ -362,7 +362,7 @@
           <w:sz w:val="21"/>
           <w:szCs w:val="21"/>
         </w:rPr>
-        <w:t xml:space="preserve">선행연구는 크게 세 갈래다. 어느 것도 이 연구의 질문을 직접 검증하지 않았다는 점은 제한된 웹 검색에 근거하므로, 투고 전에 Google Scholar, SSRN, arXiv에서 다시 확인해야 한다.</w:t>
+        <w:t xml:space="preserve">선행연구는 크게 다섯 갈래다. 어느 것도 이 연구의 질문을 직접 검증하지 않았다는 점은 제한된 웹 검색에 근거하므로, 투고 전에 Google Scholar, SSRN, arXiv에서 다시 확인해야 한다.</w:t>
       </w:r>
     </w:p>
     <w:tbl>
@@ -743,7 +743,7 @@
                 <w:sz w:val="19"/>
                 <w:szCs w:val="19"/>
               </w:rPr>
-              <w:t xml:space="preserve">arXiv 2311.16822 (자기 소비 학습 순환)</w:t>
+              <w:t xml:space="preserve">arXiv 2311.16822 (자기 소비 학습 순환); Shumailov et al., Nature, 2024 (2차 보도 기준: 합성 데이터로 학습한 모델이 열화하고 사람 데이터를 약 10% 섞으면 열화가 크게 늦춰짐)</w:t>
             </w:r>
           </w:p>
         </w:tc>
@@ -775,7 +775,203 @@
                 <w:sz w:val="19"/>
                 <w:szCs w:val="19"/>
               </w:rPr>
-              <w:t xml:space="preserve">합성 데이터 오염에 초점이 있다. 사람 지식 공급 감소를 영역별로 실증하지 않았다.</w:t>
+              <w:t xml:space="preserve">합성 데이터가 사람 데이터를 대체하는 경우를 다룬다. 현실에서는 두 데이터가 함께 쌓인다는 반론이 있다. 사람 지식 공급 감소를 영역별로 실증하지 않았다.</w:t>
+            </w:r>
+          </w:p>
+        </w:tc>
+      </w:tr>
+      <w:tr>
+        <w:tc>
+          <w:tcPr>
+            <w:tcW w:type="dxa" w:w="2700"/>
+            <w:tcBorders>
+              <w:top w:val="single" w:color="BBBBBB" w:sz="4"/>
+              <w:left w:val="single" w:color="BBBBBB" w:sz="4"/>
+              <w:bottom w:val="single" w:color="BBBBBB" w:sz="4"/>
+              <w:right w:val="single" w:color="BBBBBB" w:sz="4"/>
+            </w:tcBorders>
+            <w:tcMar>
+              <w:top w:type="dxa" w:w="70"/>
+              <w:left w:type="dxa" w:w="100"/>
+              <w:bottom w:type="dxa" w:w="70"/>
+              <w:right w:type="dxa" w:w="100"/>
+            </w:tcMar>
+          </w:tcPr>
+          <w:p>
+            <w:pPr>
+              <w:spacing w:after="0" w:line="280"/>
+            </w:pPr>
+            <w:r>
+              <w:rPr>
+                <w:rFonts w:ascii="Malgun Gothic" w:cs="Malgun Gothic" w:eastAsia="Malgun Gothic" w:hAnsi="Malgun Gothic"/>
+                <w:b w:val="false"/>
+                <w:bCs w:val="false"/>
+                <w:sz w:val="19"/>
+                <w:szCs w:val="19"/>
+              </w:rPr>
+              <w:t xml:space="preserve">최신 지식, 라이브러리 버전별 성능</w:t>
+            </w:r>
+          </w:p>
+        </w:tc>
+        <w:tc>
+          <w:tcPr>
+            <w:tcW w:type="dxa" w:w="2700"/>
+            <w:tcBorders>
+              <w:top w:val="single" w:color="BBBBBB" w:sz="4"/>
+              <w:left w:val="single" w:color="BBBBBB" w:sz="4"/>
+              <w:bottom w:val="single" w:color="BBBBBB" w:sz="4"/>
+              <w:right w:val="single" w:color="BBBBBB" w:sz="4"/>
+            </w:tcBorders>
+            <w:tcMar>
+              <w:top w:type="dxa" w:w="70"/>
+              <w:left w:type="dxa" w:w="100"/>
+              <w:bottom w:type="dxa" w:w="70"/>
+              <w:right w:type="dxa" w:w="100"/>
+            </w:tcMar>
+          </w:tcPr>
+          <w:p>
+            <w:pPr>
+              <w:spacing w:after="0" w:line="280"/>
+            </w:pPr>
+            <w:r>
+              <w:rPr>
+                <w:rFonts w:ascii="Malgun Gothic" w:cs="Malgun Gothic" w:eastAsia="Malgun Gothic" w:hAnsi="Malgun Gothic"/>
+                <w:b w:val="false"/>
+                <w:bCs w:val="false"/>
+                <w:sz w:val="19"/>
+                <w:szCs w:val="19"/>
+              </w:rPr>
+              <w:t xml:space="preserve">LibEvoBench; VersiCode; GitChameleon (요약 페이지 기준, 원문 확인 필요)</w:t>
+            </w:r>
+          </w:p>
+        </w:tc>
+        <w:tc>
+          <w:tcPr>
+            <w:tcW w:type="dxa" w:w="3960"/>
+            <w:tcBorders>
+              <w:top w:val="single" w:color="BBBBBB" w:sz="4"/>
+              <w:left w:val="single" w:color="BBBBBB" w:sz="4"/>
+              <w:bottom w:val="single" w:color="BBBBBB" w:sz="4"/>
+              <w:right w:val="single" w:color="BBBBBB" w:sz="4"/>
+            </w:tcBorders>
+            <w:tcMar>
+              <w:top w:type="dxa" w:w="70"/>
+              <w:left w:type="dxa" w:w="100"/>
+              <w:bottom w:type="dxa" w:w="70"/>
+              <w:right w:type="dxa" w:w="100"/>
+            </w:tcMar>
+          </w:tcPr>
+          <w:p>
+            <w:pPr>
+              <w:spacing w:after="0" w:line="280"/>
+            </w:pPr>
+            <w:r>
+              <w:rPr>
+                <w:rFonts w:ascii="Malgun Gothic" w:cs="Malgun Gothic" w:eastAsia="Malgun Gothic" w:hAnsi="Malgun Gothic"/>
+                <w:b w:val="false"/>
+                <w:bCs w:val="false"/>
+                <w:sz w:val="19"/>
+                <w:szCs w:val="19"/>
+              </w:rPr>
+              <w:t xml:space="preserve">모델이 최신 API 버전에 약하고 문서를 주면 크게 개선됨을 측정한다. 원인이 사람 Q&amp;A 감소인지는 다루지 않는다. 본 연구는 이 격차의 태그 간 차이를 질문 감소로 설명하려 한다.</w:t>
+            </w:r>
+          </w:p>
+        </w:tc>
+      </w:tr>
+      <w:tr>
+        <w:tc>
+          <w:tcPr>
+            <w:tcW w:type="dxa" w:w="2700"/>
+            <w:tcBorders>
+              <w:top w:val="single" w:color="BBBBBB" w:sz="4"/>
+              <w:left w:val="single" w:color="BBBBBB" w:sz="4"/>
+              <w:bottom w:val="single" w:color="BBBBBB" w:sz="4"/>
+              <w:right w:val="single" w:color="BBBBBB" w:sz="4"/>
+            </w:tcBorders>
+            <w:tcMar>
+              <w:top w:type="dxa" w:w="70"/>
+              <w:left w:type="dxa" w:w="100"/>
+              <w:bottom w:type="dxa" w:w="70"/>
+              <w:right w:type="dxa" w:w="100"/>
+            </w:tcMar>
+          </w:tcPr>
+          <w:p>
+            <w:pPr>
+              <w:spacing w:after="0" w:line="280"/>
+            </w:pPr>
+            <w:r>
+              <w:rPr>
+                <w:rFonts w:ascii="Malgun Gothic" w:cs="Malgun Gothic" w:eastAsia="Malgun Gothic" w:hAnsi="Malgun Gothic"/>
+                <w:b w:val="false"/>
+                <w:bCs w:val="false"/>
+                <w:sz w:val="19"/>
+                <w:szCs w:val="19"/>
+              </w:rPr>
+              <w:t xml:space="preserve">실효 학습 시점</w:t>
+            </w:r>
+          </w:p>
+        </w:tc>
+        <w:tc>
+          <w:tcPr>
+            <w:tcW w:type="dxa" w:w="2700"/>
+            <w:tcBorders>
+              <w:top w:val="single" w:color="BBBBBB" w:sz="4"/>
+              <w:left w:val="single" w:color="BBBBBB" w:sz="4"/>
+              <w:bottom w:val="single" w:color="BBBBBB" w:sz="4"/>
+              <w:right w:val="single" w:color="BBBBBB" w:sz="4"/>
+            </w:tcBorders>
+            <w:tcMar>
+              <w:top w:type="dxa" w:w="70"/>
+              <w:left w:type="dxa" w:w="100"/>
+              <w:bottom w:type="dxa" w:w="70"/>
+              <w:right w:type="dxa" w:w="100"/>
+            </w:tcMar>
+          </w:tcPr>
+          <w:p>
+            <w:pPr>
+              <w:spacing w:after="0" w:line="280"/>
+            </w:pPr>
+            <w:r>
+              <w:rPr>
+                <w:rFonts w:ascii="Malgun Gothic" w:cs="Malgun Gothic" w:eastAsia="Malgun Gothic" w:hAnsi="Malgun Gothic"/>
+                <w:b w:val="false"/>
+                <w:bCs w:val="false"/>
+                <w:sz w:val="19"/>
+                <w:szCs w:val="19"/>
+              </w:rPr>
+              <w:t xml:space="preserve">Cheng et al., Dated Data (arXiv 2403.12958)</w:t>
+            </w:r>
+          </w:p>
+        </w:tc>
+        <w:tc>
+          <w:tcPr>
+            <w:tcW w:type="dxa" w:w="3960"/>
+            <w:tcBorders>
+              <w:top w:val="single" w:color="BBBBBB" w:sz="4"/>
+              <w:left w:val="single" w:color="BBBBBB" w:sz="4"/>
+              <w:bottom w:val="single" w:color="BBBBBB" w:sz="4"/>
+              <w:right w:val="single" w:color="BBBBBB" w:sz="4"/>
+            </w:tcBorders>
+            <w:tcMar>
+              <w:top w:type="dxa" w:w="70"/>
+              <w:left w:type="dxa" w:w="100"/>
+              <w:bottom w:type="dxa" w:w="70"/>
+              <w:right w:type="dxa" w:w="100"/>
+            </w:tcMar>
+          </w:tcPr>
+          <w:p>
+            <w:pPr>
+              <w:spacing w:after="0" w:line="280"/>
+            </w:pPr>
+            <w:r>
+              <w:rPr>
+                <w:rFonts w:ascii="Malgun Gothic" w:cs="Malgun Gothic" w:eastAsia="Malgun Gothic" w:hAnsi="Malgun Gothic"/>
+                <w:b w:val="false"/>
+                <w:bCs w:val="false"/>
+                <w:sz w:val="19"/>
+                <w:szCs w:val="19"/>
+              </w:rPr>
+              <w:t xml:space="preserve">공개된 학습 시점과 모델이 실제로 아는 시점(실효 학습 시점)이 다를 수 있음을 보였다. 본 연구의 대조군과 처치군 구분에 직접 영향을 준다.</w:t>
             </w:r>
           </w:p>
         </w:tc>
@@ -785,6 +981,19 @@
       <w:pPr>
         <w:spacing w:after="80"/>
       </w:pPr>
+    </w:p>
+    <w:p>
+      <w:pPr>
+        <w:spacing w:after="120" w:line="320"/>
+      </w:pPr>
+      <w:r>
+        <w:rPr>
+          <w:rFonts w:ascii="Malgun Gothic" w:cs="Malgun Gothic" w:eastAsia="Malgun Gothic" w:hAnsi="Malgun Gothic"/>
+          <w:sz w:val="21"/>
+          <w:szCs w:val="21"/>
+        </w:rPr>
+        <w:t xml:space="preserve">결과 변수 쪽에서 가장 가까운 연구는 최신 라이브러리 버전별 성능을 측정한 벤치마크 계열이다. 심사자는 "이미 알려진 최신성 격차를 다시 잰 것 아닌가"를 물을 것이므로, 본 연구는 격차의 존재가 아니라 격차의 태그 간 차이가 질문 감소와 연관되는지를 기여로 내세운다. 이 점에서 처치가 되는 질문 감소 데이터와 모델 학습 시점 대조가 핵심이다.</w:t>
+      </w:r>
     </w:p>
     <w:p>
       <w:pPr>
@@ -1828,7 +2037,1239 @@
           <w:sz w:val="21"/>
           <w:szCs w:val="21"/>
         </w:rPr>
-        <w:t xml:space="preserve">모델 집합: 학습 시점이 ChatGPT 출시 이전인 모델(대조군)과 이후인 모델(처치군)을 각각 4개 이상 확보한다. 학습 시점은 각 사의 공식 문서로 확인해야 하며, 확인 전에는 확정하지 않는다.</w:t>
+        <w:t xml:space="preserve">모델 집합: 학습 시점은 각 사 공식 문서로 확인했다(표 참조). 대조군(출시 이전 학습)은 GPT-3.5 계열(2021년 9월, OpenAI 모델 페이지는 계열 단위로 적혀 있고 0613 스냅샷은 목록에 없음)과 Llama 2(2022년 9월, Meta 모델 카드)이며, Llama 2는 OpenRouter에 없어 자체 구동이 필요하다. 전환군은 Llama 3.x(2023년 3월에서 12월)와 GPT-4o(2023년 10월), 처치군은 GPT-4.1(2024년 6월), Phi-4(2024년 6월), Gemma 3와 Llama 4(2024년 8월)다.</w:t>
+      </w:r>
+    </w:p>
+    <w:tbl>
+      <w:tblPr>
+        <w:tblW w:type="dxa" w:w="9360"/>
+        <w:tblBorders>
+          <w:top w:val="single" w:color="auto" w:sz="4"/>
+          <w:left w:val="single" w:color="auto" w:sz="4"/>
+          <w:bottom w:val="single" w:color="auto" w:sz="4"/>
+          <w:right w:val="single" w:color="auto" w:sz="4"/>
+          <w:insideH w:val="single" w:color="auto" w:sz="4"/>
+          <w:insideV w:val="single" w:color="auto" w:sz="4"/>
+        </w:tblBorders>
+      </w:tblPr>
+      <w:tblGrid>
+        <w:gridCol w:w="2300"/>
+        <w:gridCol w:w="2000"/>
+        <w:gridCol w:w="2400"/>
+        <w:gridCol w:w="2660"/>
+      </w:tblGrid>
+      <w:tr>
+        <w:trPr>
+          <w:tblHeader/>
+        </w:trPr>
+        <w:tc>
+          <w:tcPr>
+            <w:tcW w:type="dxa" w:w="2300"/>
+            <w:tcBorders>
+              <w:top w:val="single" w:color="BBBBBB" w:sz="4"/>
+              <w:left w:val="single" w:color="BBBBBB" w:sz="4"/>
+              <w:bottom w:val="single" w:color="BBBBBB" w:sz="4"/>
+              <w:right w:val="single" w:color="BBBBBB" w:sz="4"/>
+            </w:tcBorders>
+            <w:shd w:fill="E8EEF4" w:color="auto" w:val="clear"/>
+            <w:tcMar>
+              <w:top w:type="dxa" w:w="70"/>
+              <w:left w:type="dxa" w:w="100"/>
+              <w:bottom w:type="dxa" w:w="70"/>
+              <w:right w:type="dxa" w:w="100"/>
+            </w:tcMar>
+          </w:tcPr>
+          <w:p>
+            <w:pPr>
+              <w:spacing w:after="0" w:line="280"/>
+            </w:pPr>
+            <w:r>
+              <w:rPr>
+                <w:rFonts w:ascii="Malgun Gothic" w:cs="Malgun Gothic" w:eastAsia="Malgun Gothic" w:hAnsi="Malgun Gothic"/>
+                <w:b/>
+                <w:bCs/>
+                <w:sz w:val="19"/>
+                <w:szCs w:val="19"/>
+              </w:rPr>
+              <w:t xml:space="preserve">모델</w:t>
+            </w:r>
+          </w:p>
+        </w:tc>
+        <w:tc>
+          <w:tcPr>
+            <w:tcW w:type="dxa" w:w="2000"/>
+            <w:tcBorders>
+              <w:top w:val="single" w:color="BBBBBB" w:sz="4"/>
+              <w:left w:val="single" w:color="BBBBBB" w:sz="4"/>
+              <w:bottom w:val="single" w:color="BBBBBB" w:sz="4"/>
+              <w:right w:val="single" w:color="BBBBBB" w:sz="4"/>
+            </w:tcBorders>
+            <w:shd w:fill="E8EEF4" w:color="auto" w:val="clear"/>
+            <w:tcMar>
+              <w:top w:type="dxa" w:w="70"/>
+              <w:left w:type="dxa" w:w="100"/>
+              <w:bottom w:type="dxa" w:w="70"/>
+              <w:right w:type="dxa" w:w="100"/>
+            </w:tcMar>
+          </w:tcPr>
+          <w:p>
+            <w:pPr>
+              <w:spacing w:after="0" w:line="280"/>
+            </w:pPr>
+            <w:r>
+              <w:rPr>
+                <w:rFonts w:ascii="Malgun Gothic" w:cs="Malgun Gothic" w:eastAsia="Malgun Gothic" w:hAnsi="Malgun Gothic"/>
+                <w:b/>
+                <w:bCs/>
+                <w:sz w:val="19"/>
+                <w:szCs w:val="19"/>
+              </w:rPr>
+              <w:t xml:space="preserve">공식 학습 시점</w:t>
+            </w:r>
+          </w:p>
+        </w:tc>
+        <w:tc>
+          <w:tcPr>
+            <w:tcW w:type="dxa" w:w="2400"/>
+            <w:tcBorders>
+              <w:top w:val="single" w:color="BBBBBB" w:sz="4"/>
+              <w:left w:val="single" w:color="BBBBBB" w:sz="4"/>
+              <w:bottom w:val="single" w:color="BBBBBB" w:sz="4"/>
+              <w:right w:val="single" w:color="BBBBBB" w:sz="4"/>
+            </w:tcBorders>
+            <w:shd w:fill="E8EEF4" w:color="auto" w:val="clear"/>
+            <w:tcMar>
+              <w:top w:type="dxa" w:w="70"/>
+              <w:left w:type="dxa" w:w="100"/>
+              <w:bottom w:type="dxa" w:w="70"/>
+              <w:right w:type="dxa" w:w="100"/>
+            </w:tcMar>
+          </w:tcPr>
+          <w:p>
+            <w:pPr>
+              <w:spacing w:after="0" w:line="280"/>
+            </w:pPr>
+            <w:r>
+              <w:rPr>
+                <w:rFonts w:ascii="Malgun Gothic" w:cs="Malgun Gothic" w:eastAsia="Malgun Gothic" w:hAnsi="Malgun Gothic"/>
+                <w:b/>
+                <w:bCs/>
+                <w:sz w:val="19"/>
+                <w:szCs w:val="19"/>
+              </w:rPr>
+              <w:t xml:space="preserve">출처</w:t>
+            </w:r>
+          </w:p>
+        </w:tc>
+        <w:tc>
+          <w:tcPr>
+            <w:tcW w:type="dxa" w:w="2660"/>
+            <w:tcBorders>
+              <w:top w:val="single" w:color="BBBBBB" w:sz="4"/>
+              <w:left w:val="single" w:color="BBBBBB" w:sz="4"/>
+              <w:bottom w:val="single" w:color="BBBBBB" w:sz="4"/>
+              <w:right w:val="single" w:color="BBBBBB" w:sz="4"/>
+            </w:tcBorders>
+            <w:shd w:fill="E8EEF4" w:color="auto" w:val="clear"/>
+            <w:tcMar>
+              <w:top w:type="dxa" w:w="70"/>
+              <w:left w:type="dxa" w:w="100"/>
+              <w:bottom w:type="dxa" w:w="70"/>
+              <w:right w:type="dxa" w:w="100"/>
+            </w:tcMar>
+          </w:tcPr>
+          <w:p>
+            <w:pPr>
+              <w:spacing w:after="0" w:line="280"/>
+            </w:pPr>
+            <w:r>
+              <w:rPr>
+                <w:rFonts w:ascii="Malgun Gothic" w:cs="Malgun Gothic" w:eastAsia="Malgun Gothic" w:hAnsi="Malgun Gothic"/>
+                <w:b/>
+                <w:bCs/>
+                <w:sz w:val="19"/>
+                <w:szCs w:val="19"/>
+              </w:rPr>
+              <w:t xml:space="preserve">구분</w:t>
+            </w:r>
+          </w:p>
+        </w:tc>
+      </w:tr>
+      <w:tr>
+        <w:tc>
+          <w:tcPr>
+            <w:tcW w:type="dxa" w:w="2300"/>
+            <w:tcBorders>
+              <w:top w:val="single" w:color="BBBBBB" w:sz="4"/>
+              <w:left w:val="single" w:color="BBBBBB" w:sz="4"/>
+              <w:bottom w:val="single" w:color="BBBBBB" w:sz="4"/>
+              <w:right w:val="single" w:color="BBBBBB" w:sz="4"/>
+            </w:tcBorders>
+            <w:tcMar>
+              <w:top w:type="dxa" w:w="70"/>
+              <w:left w:type="dxa" w:w="100"/>
+              <w:bottom w:type="dxa" w:w="70"/>
+              <w:right w:type="dxa" w:w="100"/>
+            </w:tcMar>
+          </w:tcPr>
+          <w:p>
+            <w:pPr>
+              <w:spacing w:after="0" w:line="280"/>
+            </w:pPr>
+            <w:r>
+              <w:rPr>
+                <w:rFonts w:ascii="Malgun Gothic" w:cs="Malgun Gothic" w:eastAsia="Malgun Gothic" w:hAnsi="Malgun Gothic"/>
+                <w:b w:val="false"/>
+                <w:bCs w:val="false"/>
+                <w:sz w:val="19"/>
+                <w:szCs w:val="19"/>
+              </w:rPr>
+              <w:t xml:space="preserve">GPT-3.5 계열</w:t>
+            </w:r>
+          </w:p>
+        </w:tc>
+        <w:tc>
+          <w:tcPr>
+            <w:tcW w:type="dxa" w:w="2000"/>
+            <w:tcBorders>
+              <w:top w:val="single" w:color="BBBBBB" w:sz="4"/>
+              <w:left w:val="single" w:color="BBBBBB" w:sz="4"/>
+              <w:bottom w:val="single" w:color="BBBBBB" w:sz="4"/>
+              <w:right w:val="single" w:color="BBBBBB" w:sz="4"/>
+            </w:tcBorders>
+            <w:tcMar>
+              <w:top w:type="dxa" w:w="70"/>
+              <w:left w:type="dxa" w:w="100"/>
+              <w:bottom w:type="dxa" w:w="70"/>
+              <w:right w:type="dxa" w:w="100"/>
+            </w:tcMar>
+          </w:tcPr>
+          <w:p>
+            <w:pPr>
+              <w:spacing w:after="0" w:line="280"/>
+            </w:pPr>
+            <w:r>
+              <w:rPr>
+                <w:rFonts w:ascii="Malgun Gothic" w:cs="Malgun Gothic" w:eastAsia="Malgun Gothic" w:hAnsi="Malgun Gothic"/>
+                <w:b w:val="false"/>
+                <w:bCs w:val="false"/>
+                <w:sz w:val="19"/>
+                <w:szCs w:val="19"/>
+              </w:rPr>
+              <w:t xml:space="preserve">2021년 9월</w:t>
+            </w:r>
+          </w:p>
+        </w:tc>
+        <w:tc>
+          <w:tcPr>
+            <w:tcW w:type="dxa" w:w="2400"/>
+            <w:tcBorders>
+              <w:top w:val="single" w:color="BBBBBB" w:sz="4"/>
+              <w:left w:val="single" w:color="BBBBBB" w:sz="4"/>
+              <w:bottom w:val="single" w:color="BBBBBB" w:sz="4"/>
+              <w:right w:val="single" w:color="BBBBBB" w:sz="4"/>
+            </w:tcBorders>
+            <w:tcMar>
+              <w:top w:type="dxa" w:w="70"/>
+              <w:left w:type="dxa" w:w="100"/>
+              <w:bottom w:type="dxa" w:w="70"/>
+              <w:right w:type="dxa" w:w="100"/>
+            </w:tcMar>
+          </w:tcPr>
+          <w:p>
+            <w:pPr>
+              <w:spacing w:after="0" w:line="280"/>
+            </w:pPr>
+            <w:r>
+              <w:rPr>
+                <w:rFonts w:ascii="Malgun Gothic" w:cs="Malgun Gothic" w:eastAsia="Malgun Gothic" w:hAnsi="Malgun Gothic"/>
+                <w:b w:val="false"/>
+                <w:bCs w:val="false"/>
+                <w:sz w:val="19"/>
+                <w:szCs w:val="19"/>
+              </w:rPr>
+              <w:t xml:space="preserve">OpenAI 모델 페이지</w:t>
+            </w:r>
+          </w:p>
+        </w:tc>
+        <w:tc>
+          <w:tcPr>
+            <w:tcW w:type="dxa" w:w="2660"/>
+            <w:tcBorders>
+              <w:top w:val="single" w:color="BBBBBB" w:sz="4"/>
+              <w:left w:val="single" w:color="BBBBBB" w:sz="4"/>
+              <w:bottom w:val="single" w:color="BBBBBB" w:sz="4"/>
+              <w:right w:val="single" w:color="BBBBBB" w:sz="4"/>
+            </w:tcBorders>
+            <w:tcMar>
+              <w:top w:type="dxa" w:w="70"/>
+              <w:left w:type="dxa" w:w="100"/>
+              <w:bottom w:type="dxa" w:w="70"/>
+              <w:right w:type="dxa" w:w="100"/>
+            </w:tcMar>
+          </w:tcPr>
+          <w:p>
+            <w:pPr>
+              <w:spacing w:after="0" w:line="280"/>
+            </w:pPr>
+            <w:r>
+              <w:rPr>
+                <w:rFonts w:ascii="Malgun Gothic" w:cs="Malgun Gothic" w:eastAsia="Malgun Gothic" w:hAnsi="Malgun Gothic"/>
+                <w:b w:val="false"/>
+                <w:bCs w:val="false"/>
+                <w:sz w:val="19"/>
+                <w:szCs w:val="19"/>
+              </w:rPr>
+              <w:t xml:space="preserve">대조군</w:t>
+            </w:r>
+          </w:p>
+        </w:tc>
+      </w:tr>
+      <w:tr>
+        <w:tc>
+          <w:tcPr>
+            <w:tcW w:type="dxa" w:w="2300"/>
+            <w:tcBorders>
+              <w:top w:val="single" w:color="BBBBBB" w:sz="4"/>
+              <w:left w:val="single" w:color="BBBBBB" w:sz="4"/>
+              <w:bottom w:val="single" w:color="BBBBBB" w:sz="4"/>
+              <w:right w:val="single" w:color="BBBBBB" w:sz="4"/>
+            </w:tcBorders>
+            <w:tcMar>
+              <w:top w:type="dxa" w:w="70"/>
+              <w:left w:type="dxa" w:w="100"/>
+              <w:bottom w:type="dxa" w:w="70"/>
+              <w:right w:type="dxa" w:w="100"/>
+            </w:tcMar>
+          </w:tcPr>
+          <w:p>
+            <w:pPr>
+              <w:spacing w:after="0" w:line="280"/>
+            </w:pPr>
+            <w:r>
+              <w:rPr>
+                <w:rFonts w:ascii="Malgun Gothic" w:cs="Malgun Gothic" w:eastAsia="Malgun Gothic" w:hAnsi="Malgun Gothic"/>
+                <w:b w:val="false"/>
+                <w:bCs w:val="false"/>
+                <w:sz w:val="19"/>
+                <w:szCs w:val="19"/>
+              </w:rPr>
+              <w:t xml:space="preserve">Llama 2</w:t>
+            </w:r>
+          </w:p>
+        </w:tc>
+        <w:tc>
+          <w:tcPr>
+            <w:tcW w:type="dxa" w:w="2000"/>
+            <w:tcBorders>
+              <w:top w:val="single" w:color="BBBBBB" w:sz="4"/>
+              <w:left w:val="single" w:color="BBBBBB" w:sz="4"/>
+              <w:bottom w:val="single" w:color="BBBBBB" w:sz="4"/>
+              <w:right w:val="single" w:color="BBBBBB" w:sz="4"/>
+            </w:tcBorders>
+            <w:tcMar>
+              <w:top w:type="dxa" w:w="70"/>
+              <w:left w:type="dxa" w:w="100"/>
+              <w:bottom w:type="dxa" w:w="70"/>
+              <w:right w:type="dxa" w:w="100"/>
+            </w:tcMar>
+          </w:tcPr>
+          <w:p>
+            <w:pPr>
+              <w:spacing w:after="0" w:line="280"/>
+            </w:pPr>
+            <w:r>
+              <w:rPr>
+                <w:rFonts w:ascii="Malgun Gothic" w:cs="Malgun Gothic" w:eastAsia="Malgun Gothic" w:hAnsi="Malgun Gothic"/>
+                <w:b w:val="false"/>
+                <w:bCs w:val="false"/>
+                <w:sz w:val="19"/>
+                <w:szCs w:val="19"/>
+              </w:rPr>
+              <w:t xml:space="preserve">2022년 9월</w:t>
+            </w:r>
+          </w:p>
+        </w:tc>
+        <w:tc>
+          <w:tcPr>
+            <w:tcW w:type="dxa" w:w="2400"/>
+            <w:tcBorders>
+              <w:top w:val="single" w:color="BBBBBB" w:sz="4"/>
+              <w:left w:val="single" w:color="BBBBBB" w:sz="4"/>
+              <w:bottom w:val="single" w:color="BBBBBB" w:sz="4"/>
+              <w:right w:val="single" w:color="BBBBBB" w:sz="4"/>
+            </w:tcBorders>
+            <w:tcMar>
+              <w:top w:type="dxa" w:w="70"/>
+              <w:left w:type="dxa" w:w="100"/>
+              <w:bottom w:type="dxa" w:w="70"/>
+              <w:right w:type="dxa" w:w="100"/>
+            </w:tcMar>
+          </w:tcPr>
+          <w:p>
+            <w:pPr>
+              <w:spacing w:after="0" w:line="280"/>
+            </w:pPr>
+            <w:r>
+              <w:rPr>
+                <w:rFonts w:ascii="Malgun Gothic" w:cs="Malgun Gothic" w:eastAsia="Malgun Gothic" w:hAnsi="Malgun Gothic"/>
+                <w:b w:val="false"/>
+                <w:bCs w:val="false"/>
+                <w:sz w:val="19"/>
+                <w:szCs w:val="19"/>
+              </w:rPr>
+              <w:t xml:space="preserve">Meta 모델 카드</w:t>
+            </w:r>
+          </w:p>
+        </w:tc>
+        <w:tc>
+          <w:tcPr>
+            <w:tcW w:type="dxa" w:w="2660"/>
+            <w:tcBorders>
+              <w:top w:val="single" w:color="BBBBBB" w:sz="4"/>
+              <w:left w:val="single" w:color="BBBBBB" w:sz="4"/>
+              <w:bottom w:val="single" w:color="BBBBBB" w:sz="4"/>
+              <w:right w:val="single" w:color="BBBBBB" w:sz="4"/>
+            </w:tcBorders>
+            <w:tcMar>
+              <w:top w:type="dxa" w:w="70"/>
+              <w:left w:type="dxa" w:w="100"/>
+              <w:bottom w:type="dxa" w:w="70"/>
+              <w:right w:type="dxa" w:w="100"/>
+            </w:tcMar>
+          </w:tcPr>
+          <w:p>
+            <w:pPr>
+              <w:spacing w:after="0" w:line="280"/>
+            </w:pPr>
+            <w:r>
+              <w:rPr>
+                <w:rFonts w:ascii="Malgun Gothic" w:cs="Malgun Gothic" w:eastAsia="Malgun Gothic" w:hAnsi="Malgun Gothic"/>
+                <w:b w:val="false"/>
+                <w:bCs w:val="false"/>
+                <w:sz w:val="19"/>
+                <w:szCs w:val="19"/>
+              </w:rPr>
+              <w:t xml:space="preserve">대조군(자체 구동)</w:t>
+            </w:r>
+          </w:p>
+        </w:tc>
+      </w:tr>
+      <w:tr>
+        <w:tc>
+          <w:tcPr>
+            <w:tcW w:type="dxa" w:w="2300"/>
+            <w:tcBorders>
+              <w:top w:val="single" w:color="BBBBBB" w:sz="4"/>
+              <w:left w:val="single" w:color="BBBBBB" w:sz="4"/>
+              <w:bottom w:val="single" w:color="BBBBBB" w:sz="4"/>
+              <w:right w:val="single" w:color="BBBBBB" w:sz="4"/>
+            </w:tcBorders>
+            <w:tcMar>
+              <w:top w:type="dxa" w:w="70"/>
+              <w:left w:type="dxa" w:w="100"/>
+              <w:bottom w:type="dxa" w:w="70"/>
+              <w:right w:type="dxa" w:w="100"/>
+            </w:tcMar>
+          </w:tcPr>
+          <w:p>
+            <w:pPr>
+              <w:spacing w:after="0" w:line="280"/>
+            </w:pPr>
+            <w:r>
+              <w:rPr>
+                <w:rFonts w:ascii="Malgun Gothic" w:cs="Malgun Gothic" w:eastAsia="Malgun Gothic" w:hAnsi="Malgun Gothic"/>
+                <w:b w:val="false"/>
+                <w:bCs w:val="false"/>
+                <w:sz w:val="19"/>
+                <w:szCs w:val="19"/>
+              </w:rPr>
+              <w:t xml:space="preserve">Llama 3 8B / 70B</w:t>
+            </w:r>
+          </w:p>
+        </w:tc>
+        <w:tc>
+          <w:tcPr>
+            <w:tcW w:type="dxa" w:w="2000"/>
+            <w:tcBorders>
+              <w:top w:val="single" w:color="BBBBBB" w:sz="4"/>
+              <w:left w:val="single" w:color="BBBBBB" w:sz="4"/>
+              <w:bottom w:val="single" w:color="BBBBBB" w:sz="4"/>
+              <w:right w:val="single" w:color="BBBBBB" w:sz="4"/>
+            </w:tcBorders>
+            <w:tcMar>
+              <w:top w:type="dxa" w:w="70"/>
+              <w:left w:type="dxa" w:w="100"/>
+              <w:bottom w:type="dxa" w:w="70"/>
+              <w:right w:type="dxa" w:w="100"/>
+            </w:tcMar>
+          </w:tcPr>
+          <w:p>
+            <w:pPr>
+              <w:spacing w:after="0" w:line="280"/>
+            </w:pPr>
+            <w:r>
+              <w:rPr>
+                <w:rFonts w:ascii="Malgun Gothic" w:cs="Malgun Gothic" w:eastAsia="Malgun Gothic" w:hAnsi="Malgun Gothic"/>
+                <w:b w:val="false"/>
+                <w:bCs w:val="false"/>
+                <w:sz w:val="19"/>
+                <w:szCs w:val="19"/>
+              </w:rPr>
+              <w:t xml:space="preserve">2023년 3월 / 12월</w:t>
+            </w:r>
+          </w:p>
+        </w:tc>
+        <w:tc>
+          <w:tcPr>
+            <w:tcW w:type="dxa" w:w="2400"/>
+            <w:tcBorders>
+              <w:top w:val="single" w:color="BBBBBB" w:sz="4"/>
+              <w:left w:val="single" w:color="BBBBBB" w:sz="4"/>
+              <w:bottom w:val="single" w:color="BBBBBB" w:sz="4"/>
+              <w:right w:val="single" w:color="BBBBBB" w:sz="4"/>
+            </w:tcBorders>
+            <w:tcMar>
+              <w:top w:type="dxa" w:w="70"/>
+              <w:left w:type="dxa" w:w="100"/>
+              <w:bottom w:type="dxa" w:w="70"/>
+              <w:right w:type="dxa" w:w="100"/>
+            </w:tcMar>
+          </w:tcPr>
+          <w:p>
+            <w:pPr>
+              <w:spacing w:after="0" w:line="280"/>
+            </w:pPr>
+            <w:r>
+              <w:rPr>
+                <w:rFonts w:ascii="Malgun Gothic" w:cs="Malgun Gothic" w:eastAsia="Malgun Gothic" w:hAnsi="Malgun Gothic"/>
+                <w:b w:val="false"/>
+                <w:bCs w:val="false"/>
+                <w:sz w:val="19"/>
+                <w:szCs w:val="19"/>
+              </w:rPr>
+              <w:t xml:space="preserve">Meta 모델 카드</w:t>
+            </w:r>
+          </w:p>
+        </w:tc>
+        <w:tc>
+          <w:tcPr>
+            <w:tcW w:type="dxa" w:w="2660"/>
+            <w:tcBorders>
+              <w:top w:val="single" w:color="BBBBBB" w:sz="4"/>
+              <w:left w:val="single" w:color="BBBBBB" w:sz="4"/>
+              <w:bottom w:val="single" w:color="BBBBBB" w:sz="4"/>
+              <w:right w:val="single" w:color="BBBBBB" w:sz="4"/>
+            </w:tcBorders>
+            <w:tcMar>
+              <w:top w:type="dxa" w:w="70"/>
+              <w:left w:type="dxa" w:w="100"/>
+              <w:bottom w:type="dxa" w:w="70"/>
+              <w:right w:type="dxa" w:w="100"/>
+            </w:tcMar>
+          </w:tcPr>
+          <w:p>
+            <w:pPr>
+              <w:spacing w:after="0" w:line="280"/>
+            </w:pPr>
+            <w:r>
+              <w:rPr>
+                <w:rFonts w:ascii="Malgun Gothic" w:cs="Malgun Gothic" w:eastAsia="Malgun Gothic" w:hAnsi="Malgun Gothic"/>
+                <w:b w:val="false"/>
+                <w:bCs w:val="false"/>
+                <w:sz w:val="19"/>
+                <w:szCs w:val="19"/>
+              </w:rPr>
+              <w:t xml:space="preserve">전환군</w:t>
+            </w:r>
+          </w:p>
+        </w:tc>
+      </w:tr>
+      <w:tr>
+        <w:tc>
+          <w:tcPr>
+            <w:tcW w:type="dxa" w:w="2300"/>
+            <w:tcBorders>
+              <w:top w:val="single" w:color="BBBBBB" w:sz="4"/>
+              <w:left w:val="single" w:color="BBBBBB" w:sz="4"/>
+              <w:bottom w:val="single" w:color="BBBBBB" w:sz="4"/>
+              <w:right w:val="single" w:color="BBBBBB" w:sz="4"/>
+            </w:tcBorders>
+            <w:tcMar>
+              <w:top w:type="dxa" w:w="70"/>
+              <w:left w:type="dxa" w:w="100"/>
+              <w:bottom w:type="dxa" w:w="70"/>
+              <w:right w:type="dxa" w:w="100"/>
+            </w:tcMar>
+          </w:tcPr>
+          <w:p>
+            <w:pPr>
+              <w:spacing w:after="0" w:line="280"/>
+            </w:pPr>
+            <w:r>
+              <w:rPr>
+                <w:rFonts w:ascii="Malgun Gothic" w:cs="Malgun Gothic" w:eastAsia="Malgun Gothic" w:hAnsi="Malgun Gothic"/>
+                <w:b w:val="false"/>
+                <w:bCs w:val="false"/>
+                <w:sz w:val="19"/>
+                <w:szCs w:val="19"/>
+              </w:rPr>
+              <w:t xml:space="preserve">Llama 3.1, 3.2, 3.3</w:t>
+            </w:r>
+          </w:p>
+        </w:tc>
+        <w:tc>
+          <w:tcPr>
+            <w:tcW w:type="dxa" w:w="2000"/>
+            <w:tcBorders>
+              <w:top w:val="single" w:color="BBBBBB" w:sz="4"/>
+              <w:left w:val="single" w:color="BBBBBB" w:sz="4"/>
+              <w:bottom w:val="single" w:color="BBBBBB" w:sz="4"/>
+              <w:right w:val="single" w:color="BBBBBB" w:sz="4"/>
+            </w:tcBorders>
+            <w:tcMar>
+              <w:top w:type="dxa" w:w="70"/>
+              <w:left w:type="dxa" w:w="100"/>
+              <w:bottom w:type="dxa" w:w="70"/>
+              <w:right w:type="dxa" w:w="100"/>
+            </w:tcMar>
+          </w:tcPr>
+          <w:p>
+            <w:pPr>
+              <w:spacing w:after="0" w:line="280"/>
+            </w:pPr>
+            <w:r>
+              <w:rPr>
+                <w:rFonts w:ascii="Malgun Gothic" w:cs="Malgun Gothic" w:eastAsia="Malgun Gothic" w:hAnsi="Malgun Gothic"/>
+                <w:b w:val="false"/>
+                <w:bCs w:val="false"/>
+                <w:sz w:val="19"/>
+                <w:szCs w:val="19"/>
+              </w:rPr>
+              <w:t xml:space="preserve">2023년 12월</w:t>
+            </w:r>
+          </w:p>
+        </w:tc>
+        <w:tc>
+          <w:tcPr>
+            <w:tcW w:type="dxa" w:w="2400"/>
+            <w:tcBorders>
+              <w:top w:val="single" w:color="BBBBBB" w:sz="4"/>
+              <w:left w:val="single" w:color="BBBBBB" w:sz="4"/>
+              <w:bottom w:val="single" w:color="BBBBBB" w:sz="4"/>
+              <w:right w:val="single" w:color="BBBBBB" w:sz="4"/>
+            </w:tcBorders>
+            <w:tcMar>
+              <w:top w:type="dxa" w:w="70"/>
+              <w:left w:type="dxa" w:w="100"/>
+              <w:bottom w:type="dxa" w:w="70"/>
+              <w:right w:type="dxa" w:w="100"/>
+            </w:tcMar>
+          </w:tcPr>
+          <w:p>
+            <w:pPr>
+              <w:spacing w:after="0" w:line="280"/>
+            </w:pPr>
+            <w:r>
+              <w:rPr>
+                <w:rFonts w:ascii="Malgun Gothic" w:cs="Malgun Gothic" w:eastAsia="Malgun Gothic" w:hAnsi="Malgun Gothic"/>
+                <w:b w:val="false"/>
+                <w:bCs w:val="false"/>
+                <w:sz w:val="19"/>
+                <w:szCs w:val="19"/>
+              </w:rPr>
+              <w:t xml:space="preserve">Meta 모델 카드</w:t>
+            </w:r>
+          </w:p>
+        </w:tc>
+        <w:tc>
+          <w:tcPr>
+            <w:tcW w:type="dxa" w:w="2660"/>
+            <w:tcBorders>
+              <w:top w:val="single" w:color="BBBBBB" w:sz="4"/>
+              <w:left w:val="single" w:color="BBBBBB" w:sz="4"/>
+              <w:bottom w:val="single" w:color="BBBBBB" w:sz="4"/>
+              <w:right w:val="single" w:color="BBBBBB" w:sz="4"/>
+            </w:tcBorders>
+            <w:tcMar>
+              <w:top w:type="dxa" w:w="70"/>
+              <w:left w:type="dxa" w:w="100"/>
+              <w:bottom w:type="dxa" w:w="70"/>
+              <w:right w:type="dxa" w:w="100"/>
+            </w:tcMar>
+          </w:tcPr>
+          <w:p>
+            <w:pPr>
+              <w:spacing w:after="0" w:line="280"/>
+            </w:pPr>
+            <w:r>
+              <w:rPr>
+                <w:rFonts w:ascii="Malgun Gothic" w:cs="Malgun Gothic" w:eastAsia="Malgun Gothic" w:hAnsi="Malgun Gothic"/>
+                <w:b w:val="false"/>
+                <w:bCs w:val="false"/>
+                <w:sz w:val="19"/>
+                <w:szCs w:val="19"/>
+              </w:rPr>
+              <w:t xml:space="preserve">전환군</w:t>
+            </w:r>
+          </w:p>
+        </w:tc>
+      </w:tr>
+      <w:tr>
+        <w:tc>
+          <w:tcPr>
+            <w:tcW w:type="dxa" w:w="2300"/>
+            <w:tcBorders>
+              <w:top w:val="single" w:color="BBBBBB" w:sz="4"/>
+              <w:left w:val="single" w:color="BBBBBB" w:sz="4"/>
+              <w:bottom w:val="single" w:color="BBBBBB" w:sz="4"/>
+              <w:right w:val="single" w:color="BBBBBB" w:sz="4"/>
+            </w:tcBorders>
+            <w:tcMar>
+              <w:top w:type="dxa" w:w="70"/>
+              <w:left w:type="dxa" w:w="100"/>
+              <w:bottom w:type="dxa" w:w="70"/>
+              <w:right w:type="dxa" w:w="100"/>
+            </w:tcMar>
+          </w:tcPr>
+          <w:p>
+            <w:pPr>
+              <w:spacing w:after="0" w:line="280"/>
+            </w:pPr>
+            <w:r>
+              <w:rPr>
+                <w:rFonts w:ascii="Malgun Gothic" w:cs="Malgun Gothic" w:eastAsia="Malgun Gothic" w:hAnsi="Malgun Gothic"/>
+                <w:b w:val="false"/>
+                <w:bCs w:val="false"/>
+                <w:sz w:val="19"/>
+                <w:szCs w:val="19"/>
+              </w:rPr>
+              <w:t xml:space="preserve">GPT-4o</w:t>
+            </w:r>
+          </w:p>
+        </w:tc>
+        <w:tc>
+          <w:tcPr>
+            <w:tcW w:type="dxa" w:w="2000"/>
+            <w:tcBorders>
+              <w:top w:val="single" w:color="BBBBBB" w:sz="4"/>
+              <w:left w:val="single" w:color="BBBBBB" w:sz="4"/>
+              <w:bottom w:val="single" w:color="BBBBBB" w:sz="4"/>
+              <w:right w:val="single" w:color="BBBBBB" w:sz="4"/>
+            </w:tcBorders>
+            <w:tcMar>
+              <w:top w:type="dxa" w:w="70"/>
+              <w:left w:type="dxa" w:w="100"/>
+              <w:bottom w:type="dxa" w:w="70"/>
+              <w:right w:type="dxa" w:w="100"/>
+            </w:tcMar>
+          </w:tcPr>
+          <w:p>
+            <w:pPr>
+              <w:spacing w:after="0" w:line="280"/>
+            </w:pPr>
+            <w:r>
+              <w:rPr>
+                <w:rFonts w:ascii="Malgun Gothic" w:cs="Malgun Gothic" w:eastAsia="Malgun Gothic" w:hAnsi="Malgun Gothic"/>
+                <w:b w:val="false"/>
+                <w:bCs w:val="false"/>
+                <w:sz w:val="19"/>
+                <w:szCs w:val="19"/>
+              </w:rPr>
+              <w:t xml:space="preserve">2023년 10월</w:t>
+            </w:r>
+          </w:p>
+        </w:tc>
+        <w:tc>
+          <w:tcPr>
+            <w:tcW w:type="dxa" w:w="2400"/>
+            <w:tcBorders>
+              <w:top w:val="single" w:color="BBBBBB" w:sz="4"/>
+              <w:left w:val="single" w:color="BBBBBB" w:sz="4"/>
+              <w:bottom w:val="single" w:color="BBBBBB" w:sz="4"/>
+              <w:right w:val="single" w:color="BBBBBB" w:sz="4"/>
+            </w:tcBorders>
+            <w:tcMar>
+              <w:top w:type="dxa" w:w="70"/>
+              <w:left w:type="dxa" w:w="100"/>
+              <w:bottom w:type="dxa" w:w="70"/>
+              <w:right w:type="dxa" w:w="100"/>
+            </w:tcMar>
+          </w:tcPr>
+          <w:p>
+            <w:pPr>
+              <w:spacing w:after="0" w:line="280"/>
+            </w:pPr>
+            <w:r>
+              <w:rPr>
+                <w:rFonts w:ascii="Malgun Gothic" w:cs="Malgun Gothic" w:eastAsia="Malgun Gothic" w:hAnsi="Malgun Gothic"/>
+                <w:b w:val="false"/>
+                <w:bCs w:val="false"/>
+                <w:sz w:val="19"/>
+                <w:szCs w:val="19"/>
+              </w:rPr>
+              <w:t xml:space="preserve">OpenAI 모델 페이지</w:t>
+            </w:r>
+          </w:p>
+        </w:tc>
+        <w:tc>
+          <w:tcPr>
+            <w:tcW w:type="dxa" w:w="2660"/>
+            <w:tcBorders>
+              <w:top w:val="single" w:color="BBBBBB" w:sz="4"/>
+              <w:left w:val="single" w:color="BBBBBB" w:sz="4"/>
+              <w:bottom w:val="single" w:color="BBBBBB" w:sz="4"/>
+              <w:right w:val="single" w:color="BBBBBB" w:sz="4"/>
+            </w:tcBorders>
+            <w:tcMar>
+              <w:top w:type="dxa" w:w="70"/>
+              <w:left w:type="dxa" w:w="100"/>
+              <w:bottom w:type="dxa" w:w="70"/>
+              <w:right w:type="dxa" w:w="100"/>
+            </w:tcMar>
+          </w:tcPr>
+          <w:p>
+            <w:pPr>
+              <w:spacing w:after="0" w:line="280"/>
+            </w:pPr>
+            <w:r>
+              <w:rPr>
+                <w:rFonts w:ascii="Malgun Gothic" w:cs="Malgun Gothic" w:eastAsia="Malgun Gothic" w:hAnsi="Malgun Gothic"/>
+                <w:b w:val="false"/>
+                <w:bCs w:val="false"/>
+                <w:sz w:val="19"/>
+                <w:szCs w:val="19"/>
+              </w:rPr>
+              <w:t xml:space="preserve">전환군</w:t>
+            </w:r>
+          </w:p>
+        </w:tc>
+      </w:tr>
+      <w:tr>
+        <w:tc>
+          <w:tcPr>
+            <w:tcW w:type="dxa" w:w="2300"/>
+            <w:tcBorders>
+              <w:top w:val="single" w:color="BBBBBB" w:sz="4"/>
+              <w:left w:val="single" w:color="BBBBBB" w:sz="4"/>
+              <w:bottom w:val="single" w:color="BBBBBB" w:sz="4"/>
+              <w:right w:val="single" w:color="BBBBBB" w:sz="4"/>
+            </w:tcBorders>
+            <w:tcMar>
+              <w:top w:type="dxa" w:w="70"/>
+              <w:left w:type="dxa" w:w="100"/>
+              <w:bottom w:type="dxa" w:w="70"/>
+              <w:right w:type="dxa" w:w="100"/>
+            </w:tcMar>
+          </w:tcPr>
+          <w:p>
+            <w:pPr>
+              <w:spacing w:after="0" w:line="280"/>
+            </w:pPr>
+            <w:r>
+              <w:rPr>
+                <w:rFonts w:ascii="Malgun Gothic" w:cs="Malgun Gothic" w:eastAsia="Malgun Gothic" w:hAnsi="Malgun Gothic"/>
+                <w:b w:val="false"/>
+                <w:bCs w:val="false"/>
+                <w:sz w:val="19"/>
+                <w:szCs w:val="19"/>
+              </w:rPr>
+              <w:t xml:space="preserve">GPT-4.1</w:t>
+            </w:r>
+          </w:p>
+        </w:tc>
+        <w:tc>
+          <w:tcPr>
+            <w:tcW w:type="dxa" w:w="2000"/>
+            <w:tcBorders>
+              <w:top w:val="single" w:color="BBBBBB" w:sz="4"/>
+              <w:left w:val="single" w:color="BBBBBB" w:sz="4"/>
+              <w:bottom w:val="single" w:color="BBBBBB" w:sz="4"/>
+              <w:right w:val="single" w:color="BBBBBB" w:sz="4"/>
+            </w:tcBorders>
+            <w:tcMar>
+              <w:top w:type="dxa" w:w="70"/>
+              <w:left w:type="dxa" w:w="100"/>
+              <w:bottom w:type="dxa" w:w="70"/>
+              <w:right w:type="dxa" w:w="100"/>
+            </w:tcMar>
+          </w:tcPr>
+          <w:p>
+            <w:pPr>
+              <w:spacing w:after="0" w:line="280"/>
+            </w:pPr>
+            <w:r>
+              <w:rPr>
+                <w:rFonts w:ascii="Malgun Gothic" w:cs="Malgun Gothic" w:eastAsia="Malgun Gothic" w:hAnsi="Malgun Gothic"/>
+                <w:b w:val="false"/>
+                <w:bCs w:val="false"/>
+                <w:sz w:val="19"/>
+                <w:szCs w:val="19"/>
+              </w:rPr>
+              <w:t xml:space="preserve">2024년 6월</w:t>
+            </w:r>
+          </w:p>
+        </w:tc>
+        <w:tc>
+          <w:tcPr>
+            <w:tcW w:type="dxa" w:w="2400"/>
+            <w:tcBorders>
+              <w:top w:val="single" w:color="BBBBBB" w:sz="4"/>
+              <w:left w:val="single" w:color="BBBBBB" w:sz="4"/>
+              <w:bottom w:val="single" w:color="BBBBBB" w:sz="4"/>
+              <w:right w:val="single" w:color="BBBBBB" w:sz="4"/>
+            </w:tcBorders>
+            <w:tcMar>
+              <w:top w:type="dxa" w:w="70"/>
+              <w:left w:type="dxa" w:w="100"/>
+              <w:bottom w:type="dxa" w:w="70"/>
+              <w:right w:type="dxa" w:w="100"/>
+            </w:tcMar>
+          </w:tcPr>
+          <w:p>
+            <w:pPr>
+              <w:spacing w:after="0" w:line="280"/>
+            </w:pPr>
+            <w:r>
+              <w:rPr>
+                <w:rFonts w:ascii="Malgun Gothic" w:cs="Malgun Gothic" w:eastAsia="Malgun Gothic" w:hAnsi="Malgun Gothic"/>
+                <w:b w:val="false"/>
+                <w:bCs w:val="false"/>
+                <w:sz w:val="19"/>
+                <w:szCs w:val="19"/>
+              </w:rPr>
+              <w:t xml:space="preserve">OpenAI 모델 페이지</w:t>
+            </w:r>
+          </w:p>
+        </w:tc>
+        <w:tc>
+          <w:tcPr>
+            <w:tcW w:type="dxa" w:w="2660"/>
+            <w:tcBorders>
+              <w:top w:val="single" w:color="BBBBBB" w:sz="4"/>
+              <w:left w:val="single" w:color="BBBBBB" w:sz="4"/>
+              <w:bottom w:val="single" w:color="BBBBBB" w:sz="4"/>
+              <w:right w:val="single" w:color="BBBBBB" w:sz="4"/>
+            </w:tcBorders>
+            <w:tcMar>
+              <w:top w:type="dxa" w:w="70"/>
+              <w:left w:type="dxa" w:w="100"/>
+              <w:bottom w:type="dxa" w:w="70"/>
+              <w:right w:type="dxa" w:w="100"/>
+            </w:tcMar>
+          </w:tcPr>
+          <w:p>
+            <w:pPr>
+              <w:spacing w:after="0" w:line="280"/>
+            </w:pPr>
+            <w:r>
+              <w:rPr>
+                <w:rFonts w:ascii="Malgun Gothic" w:cs="Malgun Gothic" w:eastAsia="Malgun Gothic" w:hAnsi="Malgun Gothic"/>
+                <w:b w:val="false"/>
+                <w:bCs w:val="false"/>
+                <w:sz w:val="19"/>
+                <w:szCs w:val="19"/>
+              </w:rPr>
+              <w:t xml:space="preserve">처치군</w:t>
+            </w:r>
+          </w:p>
+        </w:tc>
+      </w:tr>
+      <w:tr>
+        <w:tc>
+          <w:tcPr>
+            <w:tcW w:type="dxa" w:w="2300"/>
+            <w:tcBorders>
+              <w:top w:val="single" w:color="BBBBBB" w:sz="4"/>
+              <w:left w:val="single" w:color="BBBBBB" w:sz="4"/>
+              <w:bottom w:val="single" w:color="BBBBBB" w:sz="4"/>
+              <w:right w:val="single" w:color="BBBBBB" w:sz="4"/>
+            </w:tcBorders>
+            <w:tcMar>
+              <w:top w:type="dxa" w:w="70"/>
+              <w:left w:type="dxa" w:w="100"/>
+              <w:bottom w:type="dxa" w:w="70"/>
+              <w:right w:type="dxa" w:w="100"/>
+            </w:tcMar>
+          </w:tcPr>
+          <w:p>
+            <w:pPr>
+              <w:spacing w:after="0" w:line="280"/>
+            </w:pPr>
+            <w:r>
+              <w:rPr>
+                <w:rFonts w:ascii="Malgun Gothic" w:cs="Malgun Gothic" w:eastAsia="Malgun Gothic" w:hAnsi="Malgun Gothic"/>
+                <w:b w:val="false"/>
+                <w:bCs w:val="false"/>
+                <w:sz w:val="19"/>
+                <w:szCs w:val="19"/>
+              </w:rPr>
+              <w:t xml:space="preserve">Phi-4</w:t>
+            </w:r>
+          </w:p>
+        </w:tc>
+        <w:tc>
+          <w:tcPr>
+            <w:tcW w:type="dxa" w:w="2000"/>
+            <w:tcBorders>
+              <w:top w:val="single" w:color="BBBBBB" w:sz="4"/>
+              <w:left w:val="single" w:color="BBBBBB" w:sz="4"/>
+              <w:bottom w:val="single" w:color="BBBBBB" w:sz="4"/>
+              <w:right w:val="single" w:color="BBBBBB" w:sz="4"/>
+            </w:tcBorders>
+            <w:tcMar>
+              <w:top w:type="dxa" w:w="70"/>
+              <w:left w:type="dxa" w:w="100"/>
+              <w:bottom w:type="dxa" w:w="70"/>
+              <w:right w:type="dxa" w:w="100"/>
+            </w:tcMar>
+          </w:tcPr>
+          <w:p>
+            <w:pPr>
+              <w:spacing w:after="0" w:line="280"/>
+            </w:pPr>
+            <w:r>
+              <w:rPr>
+                <w:rFonts w:ascii="Malgun Gothic" w:cs="Malgun Gothic" w:eastAsia="Malgun Gothic" w:hAnsi="Malgun Gothic"/>
+                <w:b w:val="false"/>
+                <w:bCs w:val="false"/>
+                <w:sz w:val="19"/>
+                <w:szCs w:val="19"/>
+              </w:rPr>
+              <w:t xml:space="preserve">2024년 6월 이전</w:t>
+            </w:r>
+          </w:p>
+        </w:tc>
+        <w:tc>
+          <w:tcPr>
+            <w:tcW w:type="dxa" w:w="2400"/>
+            <w:tcBorders>
+              <w:top w:val="single" w:color="BBBBBB" w:sz="4"/>
+              <w:left w:val="single" w:color="BBBBBB" w:sz="4"/>
+              <w:bottom w:val="single" w:color="BBBBBB" w:sz="4"/>
+              <w:right w:val="single" w:color="BBBBBB" w:sz="4"/>
+            </w:tcBorders>
+            <w:tcMar>
+              <w:top w:type="dxa" w:w="70"/>
+              <w:left w:type="dxa" w:w="100"/>
+              <w:bottom w:type="dxa" w:w="70"/>
+              <w:right w:type="dxa" w:w="100"/>
+            </w:tcMar>
+          </w:tcPr>
+          <w:p>
+            <w:pPr>
+              <w:spacing w:after="0" w:line="280"/>
+            </w:pPr>
+            <w:r>
+              <w:rPr>
+                <w:rFonts w:ascii="Malgun Gothic" w:cs="Malgun Gothic" w:eastAsia="Malgun Gothic" w:hAnsi="Malgun Gothic"/>
+                <w:b w:val="false"/>
+                <w:bCs w:val="false"/>
+                <w:sz w:val="19"/>
+                <w:szCs w:val="19"/>
+              </w:rPr>
+              <w:t xml:space="preserve">HF 모델 카드</w:t>
+            </w:r>
+          </w:p>
+        </w:tc>
+        <w:tc>
+          <w:tcPr>
+            <w:tcW w:type="dxa" w:w="2660"/>
+            <w:tcBorders>
+              <w:top w:val="single" w:color="BBBBBB" w:sz="4"/>
+              <w:left w:val="single" w:color="BBBBBB" w:sz="4"/>
+              <w:bottom w:val="single" w:color="BBBBBB" w:sz="4"/>
+              <w:right w:val="single" w:color="BBBBBB" w:sz="4"/>
+            </w:tcBorders>
+            <w:tcMar>
+              <w:top w:type="dxa" w:w="70"/>
+              <w:left w:type="dxa" w:w="100"/>
+              <w:bottom w:type="dxa" w:w="70"/>
+              <w:right w:type="dxa" w:w="100"/>
+            </w:tcMar>
+          </w:tcPr>
+          <w:p>
+            <w:pPr>
+              <w:spacing w:after="0" w:line="280"/>
+            </w:pPr>
+            <w:r>
+              <w:rPr>
+                <w:rFonts w:ascii="Malgun Gothic" w:cs="Malgun Gothic" w:eastAsia="Malgun Gothic" w:hAnsi="Malgun Gothic"/>
+                <w:b w:val="false"/>
+                <w:bCs w:val="false"/>
+                <w:sz w:val="19"/>
+                <w:szCs w:val="19"/>
+              </w:rPr>
+              <w:t xml:space="preserve">처치군</w:t>
+            </w:r>
+          </w:p>
+        </w:tc>
+      </w:tr>
+      <w:tr>
+        <w:tc>
+          <w:tcPr>
+            <w:tcW w:type="dxa" w:w="2300"/>
+            <w:tcBorders>
+              <w:top w:val="single" w:color="BBBBBB" w:sz="4"/>
+              <w:left w:val="single" w:color="BBBBBB" w:sz="4"/>
+              <w:bottom w:val="single" w:color="BBBBBB" w:sz="4"/>
+              <w:right w:val="single" w:color="BBBBBB" w:sz="4"/>
+            </w:tcBorders>
+            <w:tcMar>
+              <w:top w:type="dxa" w:w="70"/>
+              <w:left w:type="dxa" w:w="100"/>
+              <w:bottom w:type="dxa" w:w="70"/>
+              <w:right w:type="dxa" w:w="100"/>
+            </w:tcMar>
+          </w:tcPr>
+          <w:p>
+            <w:pPr>
+              <w:spacing w:after="0" w:line="280"/>
+            </w:pPr>
+            <w:r>
+              <w:rPr>
+                <w:rFonts w:ascii="Malgun Gothic" w:cs="Malgun Gothic" w:eastAsia="Malgun Gothic" w:hAnsi="Malgun Gothic"/>
+                <w:b w:val="false"/>
+                <w:bCs w:val="false"/>
+                <w:sz w:val="19"/>
+                <w:szCs w:val="19"/>
+              </w:rPr>
+              <w:t xml:space="preserve">Gemma 3 / Llama 4</w:t>
+            </w:r>
+          </w:p>
+        </w:tc>
+        <w:tc>
+          <w:tcPr>
+            <w:tcW w:type="dxa" w:w="2000"/>
+            <w:tcBorders>
+              <w:top w:val="single" w:color="BBBBBB" w:sz="4"/>
+              <w:left w:val="single" w:color="BBBBBB" w:sz="4"/>
+              <w:bottom w:val="single" w:color="BBBBBB" w:sz="4"/>
+              <w:right w:val="single" w:color="BBBBBB" w:sz="4"/>
+            </w:tcBorders>
+            <w:tcMar>
+              <w:top w:type="dxa" w:w="70"/>
+              <w:left w:type="dxa" w:w="100"/>
+              <w:bottom w:type="dxa" w:w="70"/>
+              <w:right w:type="dxa" w:w="100"/>
+            </w:tcMar>
+          </w:tcPr>
+          <w:p>
+            <w:pPr>
+              <w:spacing w:after="0" w:line="280"/>
+            </w:pPr>
+            <w:r>
+              <w:rPr>
+                <w:rFonts w:ascii="Malgun Gothic" w:cs="Malgun Gothic" w:eastAsia="Malgun Gothic" w:hAnsi="Malgun Gothic"/>
+                <w:b w:val="false"/>
+                <w:bCs w:val="false"/>
+                <w:sz w:val="19"/>
+                <w:szCs w:val="19"/>
+              </w:rPr>
+              <w:t xml:space="preserve">2024년 8월</w:t>
+            </w:r>
+          </w:p>
+        </w:tc>
+        <w:tc>
+          <w:tcPr>
+            <w:tcW w:type="dxa" w:w="2400"/>
+            <w:tcBorders>
+              <w:top w:val="single" w:color="BBBBBB" w:sz="4"/>
+              <w:left w:val="single" w:color="BBBBBB" w:sz="4"/>
+              <w:bottom w:val="single" w:color="BBBBBB" w:sz="4"/>
+              <w:right w:val="single" w:color="BBBBBB" w:sz="4"/>
+            </w:tcBorders>
+            <w:tcMar>
+              <w:top w:type="dxa" w:w="70"/>
+              <w:left w:type="dxa" w:w="100"/>
+              <w:bottom w:type="dxa" w:w="70"/>
+              <w:right w:type="dxa" w:w="100"/>
+            </w:tcMar>
+          </w:tcPr>
+          <w:p>
+            <w:pPr>
+              <w:spacing w:after="0" w:line="280"/>
+            </w:pPr>
+            <w:r>
+              <w:rPr>
+                <w:rFonts w:ascii="Malgun Gothic" w:cs="Malgun Gothic" w:eastAsia="Malgun Gothic" w:hAnsi="Malgun Gothic"/>
+                <w:b w:val="false"/>
+                <w:bCs w:val="false"/>
+                <w:sz w:val="19"/>
+                <w:szCs w:val="19"/>
+              </w:rPr>
+              <w:t xml:space="preserve">각 사 모델 카드</w:t>
+            </w:r>
+          </w:p>
+        </w:tc>
+        <w:tc>
+          <w:tcPr>
+            <w:tcW w:type="dxa" w:w="2660"/>
+            <w:tcBorders>
+              <w:top w:val="single" w:color="BBBBBB" w:sz="4"/>
+              <w:left w:val="single" w:color="BBBBBB" w:sz="4"/>
+              <w:bottom w:val="single" w:color="BBBBBB" w:sz="4"/>
+              <w:right w:val="single" w:color="BBBBBB" w:sz="4"/>
+            </w:tcBorders>
+            <w:tcMar>
+              <w:top w:type="dxa" w:w="70"/>
+              <w:left w:type="dxa" w:w="100"/>
+              <w:bottom w:type="dxa" w:w="70"/>
+              <w:right w:type="dxa" w:w="100"/>
+            </w:tcMar>
+          </w:tcPr>
+          <w:p>
+            <w:pPr>
+              <w:spacing w:after="0" w:line="280"/>
+            </w:pPr>
+            <w:r>
+              <w:rPr>
+                <w:rFonts w:ascii="Malgun Gothic" w:cs="Malgun Gothic" w:eastAsia="Malgun Gothic" w:hAnsi="Malgun Gothic"/>
+                <w:b w:val="false"/>
+                <w:bCs w:val="false"/>
+                <w:sz w:val="19"/>
+                <w:szCs w:val="19"/>
+              </w:rPr>
+              <w:t xml:space="preserve">처치군</w:t>
+            </w:r>
+          </w:p>
+        </w:tc>
+      </w:tr>
+    </w:tbl>
+    <w:p>
+      <w:pPr>
+        <w:spacing w:after="80"/>
+      </w:pPr>
+    </w:p>
+    <w:p>
+      <w:pPr>
+        <w:spacing w:after="120" w:line="320"/>
+      </w:pPr>
+      <w:r>
+        <w:rPr>
+          <w:rFonts w:ascii="Malgun Gothic" w:cs="Malgun Gothic" w:eastAsia="Malgun Gothic" w:hAnsi="Malgun Gothic"/>
+          <w:sz w:val="21"/>
+          <w:szCs w:val="21"/>
+        </w:rPr>
+        <w:t xml:space="preserve">제외하거나 보류하는 모델이 있다. GPT-4는 OpenAI 페이지가 2023년 12월로 적었지만 2023년 3월에 출시된 모델의 학습 시점일 수 없어(현재 별칭의 값으로 보임) 스냅샷별 학습 시점을 확인하기 전에는 쓰지 않는다. Qwen, DeepSeek, Mistral, Gemma 2는 공식 모델 카드에 학습 시점이 없고 2차 출처끼리도 값이 달라, 민감도 분석에만 쓴다.</w:t>
+      </w:r>
+    </w:p>
+    <w:p>
+      <w:pPr>
+        <w:pStyle w:val="ListParagraph"/>
+        <w:numPr>
+          <w:ilvl w:val="0"/>
+          <w:numId w:val="3"/>
+        </w:numPr>
+        <w:spacing w:after="80" w:line="300"/>
+      </w:pPr>
+      <w:r>
+        <w:rPr>
+          <w:rFonts w:ascii="Malgun Gothic" w:cs="Malgun Gothic" w:eastAsia="Malgun Gothic" w:hAnsi="Malgun Gothic"/>
+          <w:sz w:val="21"/>
+          <w:szCs w:val="21"/>
+        </w:rPr>
+        <w:t xml:space="preserve">실효 학습 시점 점검: 공개된 학습 시점이 실제로 모델이 아는 시점과 다를 수 있으므로(Cheng et al.), 오픈 가중치 모델은 날짜별 문서 버전의 perplexity로 실효 학습 시점을 추정해 공개 시점과 비교한다. API 전용 모델은 이 방법을 쓸 수 없으므로 공개된 시점을 쓰고, 시점을 앞뒤로 옮긴 민감도 분석을 보고한다.</w:t>
       </w:r>
     </w:p>
     <w:p>
@@ -2496,6 +3937,24 @@
           <w:sz w:val="21"/>
           <w:szCs w:val="21"/>
         </w:rPr>
+        <w:t xml:space="preserve">연속 노출 버전: 모델이 감소 구간을 얼마나 학습했는지(학습 시점 직전 1년간 감소의 누적량)를 PostModel 대신 연속 변수로 쓴다. 전환군을 이분법으로 처리하지 않아도 된다.</w:t>
+      </w:r>
+    </w:p>
+    <w:p>
+      <w:pPr>
+        <w:pStyle w:val="ListParagraph"/>
+        <w:numPr>
+          <w:ilvl w:val="0"/>
+          <w:numId w:val="2"/>
+        </w:numPr>
+        <w:spacing w:after="80" w:line="300"/>
+      </w:pPr>
+      <w:r>
+        <w:rPr>
+          <w:rFonts w:ascii="Malgun Gothic" w:cs="Malgun Gothic" w:eastAsia="Malgun Gothic" w:hAnsi="Malgun Gothic"/>
+          <w:sz w:val="21"/>
+          <w:szCs w:val="21"/>
+        </w:rPr>
         <w:t xml:space="preserve">모델 세대별 윈도우 버전: 처치를 모델 학습 시점 직전 구간 대비 질문 감소로 두고 모델마다 따로 추정한다.</w:t>
       </w:r>
     </w:p>
@@ -3253,6 +4712,300 @@
                 <w:sz w:val="19"/>
                 <w:szCs w:val="19"/>
               </w:rPr>
+              <w:t xml:space="preserve">학습 시점의 신뢰도</w:t>
+            </w:r>
+          </w:p>
+        </w:tc>
+        <w:tc>
+          <w:tcPr>
+            <w:tcW w:type="dxa" w:w="3560"/>
+            <w:tcBorders>
+              <w:top w:val="single" w:color="BBBBBB" w:sz="4"/>
+              <w:left w:val="single" w:color="BBBBBB" w:sz="4"/>
+              <w:bottom w:val="single" w:color="BBBBBB" w:sz="4"/>
+              <w:right w:val="single" w:color="BBBBBB" w:sz="4"/>
+            </w:tcBorders>
+            <w:tcMar>
+              <w:top w:type="dxa" w:w="70"/>
+              <w:left w:type="dxa" w:w="100"/>
+              <w:bottom w:type="dxa" w:w="70"/>
+              <w:right w:type="dxa" w:w="100"/>
+            </w:tcMar>
+          </w:tcPr>
+          <w:p>
+            <w:pPr>
+              <w:spacing w:after="0" w:line="280"/>
+            </w:pPr>
+            <w:r>
+              <w:rPr>
+                <w:rFonts w:ascii="Malgun Gothic" w:cs="Malgun Gothic" w:eastAsia="Malgun Gothic" w:hAnsi="Malgun Gothic"/>
+                <w:b w:val="false"/>
+                <w:bCs w:val="false"/>
+                <w:sz w:val="19"/>
+                <w:szCs w:val="19"/>
+              </w:rPr>
+              <w:t xml:space="preserve">공개된 학습 시점이 실효 학습 시점과 다를 수 있다. 어긋나면 대조군과 처치군이 섞인다.</w:t>
+            </w:r>
+          </w:p>
+        </w:tc>
+        <w:tc>
+          <w:tcPr>
+            <w:tcW w:type="dxa" w:w="3600"/>
+            <w:tcBorders>
+              <w:top w:val="single" w:color="BBBBBB" w:sz="4"/>
+              <w:left w:val="single" w:color="BBBBBB" w:sz="4"/>
+              <w:bottom w:val="single" w:color="BBBBBB" w:sz="4"/>
+              <w:right w:val="single" w:color="BBBBBB" w:sz="4"/>
+            </w:tcBorders>
+            <w:tcMar>
+              <w:top w:type="dxa" w:w="70"/>
+              <w:left w:type="dxa" w:w="100"/>
+              <w:bottom w:type="dxa" w:w="70"/>
+              <w:right w:type="dxa" w:w="100"/>
+            </w:tcMar>
+          </w:tcPr>
+          <w:p>
+            <w:pPr>
+              <w:spacing w:after="0" w:line="280"/>
+            </w:pPr>
+            <w:r>
+              <w:rPr>
+                <w:rFonts w:ascii="Malgun Gothic" w:cs="Malgun Gothic" w:eastAsia="Malgun Gothic" w:hAnsi="Malgun Gothic"/>
+                <w:b w:val="false"/>
+                <w:bCs w:val="false"/>
+                <w:sz w:val="19"/>
+                <w:szCs w:val="19"/>
+              </w:rPr>
+              <w:t xml:space="preserve">오픈 가중치 모델은 실효 학습 시점을 추정해 비교하고, 시점을 옮긴 민감도 분석을 보고한다.</w:t>
+            </w:r>
+          </w:p>
+        </w:tc>
+      </w:tr>
+      <w:tr>
+        <w:tc>
+          <w:tcPr>
+            <w:tcW w:type="dxa" w:w="2200"/>
+            <w:tcBorders>
+              <w:top w:val="single" w:color="BBBBBB" w:sz="4"/>
+              <w:left w:val="single" w:color="BBBBBB" w:sz="4"/>
+              <w:bottom w:val="single" w:color="BBBBBB" w:sz="4"/>
+              <w:right w:val="single" w:color="BBBBBB" w:sz="4"/>
+            </w:tcBorders>
+            <w:tcMar>
+              <w:top w:type="dxa" w:w="70"/>
+              <w:left w:type="dxa" w:w="100"/>
+              <w:bottom w:type="dxa" w:w="70"/>
+              <w:right w:type="dxa" w:w="100"/>
+            </w:tcMar>
+          </w:tcPr>
+          <w:p>
+            <w:pPr>
+              <w:spacing w:after="0" w:line="280"/>
+            </w:pPr>
+            <w:r>
+              <w:rPr>
+                <w:rFonts w:ascii="Malgun Gothic" w:cs="Malgun Gothic" w:eastAsia="Malgun Gothic" w:hAnsi="Malgun Gothic"/>
+                <w:b w:val="false"/>
+                <w:bCs w:val="false"/>
+                <w:sz w:val="19"/>
+                <w:szCs w:val="19"/>
+              </w:rPr>
+              <w:t xml:space="preserve">대조군 부족</w:t>
+            </w:r>
+          </w:p>
+        </w:tc>
+        <w:tc>
+          <w:tcPr>
+            <w:tcW w:type="dxa" w:w="3560"/>
+            <w:tcBorders>
+              <w:top w:val="single" w:color="BBBBBB" w:sz="4"/>
+              <w:left w:val="single" w:color="BBBBBB" w:sz="4"/>
+              <w:bottom w:val="single" w:color="BBBBBB" w:sz="4"/>
+              <w:right w:val="single" w:color="BBBBBB" w:sz="4"/>
+            </w:tcBorders>
+            <w:tcMar>
+              <w:top w:type="dxa" w:w="70"/>
+              <w:left w:type="dxa" w:w="100"/>
+              <w:bottom w:type="dxa" w:w="70"/>
+              <w:right w:type="dxa" w:w="100"/>
+            </w:tcMar>
+          </w:tcPr>
+          <w:p>
+            <w:pPr>
+              <w:spacing w:after="0" w:line="280"/>
+            </w:pPr>
+            <w:r>
+              <w:rPr>
+                <w:rFonts w:ascii="Malgun Gothic" w:cs="Malgun Gothic" w:eastAsia="Malgun Gothic" w:hAnsi="Malgun Gothic"/>
+                <w:b w:val="false"/>
+                <w:bCs w:val="false"/>
+                <w:sz w:val="19"/>
+                <w:szCs w:val="19"/>
+              </w:rPr>
+              <w:t xml:space="preserve">OpenRouter에서 출시 이전 학습이 확인된 모델은 GPT-3.5 계열뿐이다. Llama 2는 자체 구동해야 한다.</w:t>
+            </w:r>
+          </w:p>
+        </w:tc>
+        <w:tc>
+          <w:tcPr>
+            <w:tcW w:type="dxa" w:w="3600"/>
+            <w:tcBorders>
+              <w:top w:val="single" w:color="BBBBBB" w:sz="4"/>
+              <w:left w:val="single" w:color="BBBBBB" w:sz="4"/>
+              <w:bottom w:val="single" w:color="BBBBBB" w:sz="4"/>
+              <w:right w:val="single" w:color="BBBBBB" w:sz="4"/>
+            </w:tcBorders>
+            <w:tcMar>
+              <w:top w:type="dxa" w:w="70"/>
+              <w:left w:type="dxa" w:w="100"/>
+              <w:bottom w:type="dxa" w:w="70"/>
+              <w:right w:type="dxa" w:w="100"/>
+            </w:tcMar>
+          </w:tcPr>
+          <w:p>
+            <w:pPr>
+              <w:spacing w:after="0" w:line="280"/>
+            </w:pPr>
+            <w:r>
+              <w:rPr>
+                <w:rFonts w:ascii="Malgun Gothic" w:cs="Malgun Gothic" w:eastAsia="Malgun Gothic" w:hAnsi="Malgun Gothic"/>
+                <w:b w:val="false"/>
+                <w:bCs w:val="false"/>
+                <w:sz w:val="19"/>
+                <w:szCs w:val="19"/>
+              </w:rPr>
+              <w:t xml:space="preserve">Llama 2(7B, 13B, 70B)를 GPU로 구동한다. 대조군이 GPT-3.5 하나뿐이면 모델 특성과 처치가 구분되지 않으므로 이 경우 주 분석을 보류한다.</w:t>
+            </w:r>
+          </w:p>
+        </w:tc>
+      </w:tr>
+      <w:tr>
+        <w:tc>
+          <w:tcPr>
+            <w:tcW w:type="dxa" w:w="2200"/>
+            <w:tcBorders>
+              <w:top w:val="single" w:color="BBBBBB" w:sz="4"/>
+              <w:left w:val="single" w:color="BBBBBB" w:sz="4"/>
+              <w:bottom w:val="single" w:color="BBBBBB" w:sz="4"/>
+              <w:right w:val="single" w:color="BBBBBB" w:sz="4"/>
+            </w:tcBorders>
+            <w:tcMar>
+              <w:top w:type="dxa" w:w="70"/>
+              <w:left w:type="dxa" w:w="100"/>
+              <w:bottom w:type="dxa" w:w="70"/>
+              <w:right w:type="dxa" w:w="100"/>
+            </w:tcMar>
+          </w:tcPr>
+          <w:p>
+            <w:pPr>
+              <w:spacing w:after="0" w:line="280"/>
+            </w:pPr>
+            <w:r>
+              <w:rPr>
+                <w:rFonts w:ascii="Malgun Gothic" w:cs="Malgun Gothic" w:eastAsia="Malgun Gothic" w:hAnsi="Malgun Gothic"/>
+                <w:b w:val="false"/>
+                <w:bCs w:val="false"/>
+                <w:sz w:val="19"/>
+                <w:szCs w:val="19"/>
+              </w:rPr>
+              <w:t xml:space="preserve">기존 최신성 격차와의 혼동</w:t>
+            </w:r>
+          </w:p>
+        </w:tc>
+        <w:tc>
+          <w:tcPr>
+            <w:tcW w:type="dxa" w:w="3560"/>
+            <w:tcBorders>
+              <w:top w:val="single" w:color="BBBBBB" w:sz="4"/>
+              <w:left w:val="single" w:color="BBBBBB" w:sz="4"/>
+              <w:bottom w:val="single" w:color="BBBBBB" w:sz="4"/>
+              <w:right w:val="single" w:color="BBBBBB" w:sz="4"/>
+            </w:tcBorders>
+            <w:tcMar>
+              <w:top w:type="dxa" w:w="70"/>
+              <w:left w:type="dxa" w:w="100"/>
+              <w:bottom w:type="dxa" w:w="70"/>
+              <w:right w:type="dxa" w:w="100"/>
+            </w:tcMar>
+          </w:tcPr>
+          <w:p>
+            <w:pPr>
+              <w:spacing w:after="0" w:line="280"/>
+            </w:pPr>
+            <w:r>
+              <w:rPr>
+                <w:rFonts w:ascii="Malgun Gothic" w:cs="Malgun Gothic" w:eastAsia="Malgun Gothic" w:hAnsi="Malgun Gothic"/>
+                <w:b w:val="false"/>
+                <w:bCs w:val="false"/>
+                <w:sz w:val="19"/>
+                <w:szCs w:val="19"/>
+              </w:rPr>
+              <w:t xml:space="preserve">최신 지식에 약한 현상은 이미 알려져 있다(LibEvoBench 등).</w:t>
+            </w:r>
+          </w:p>
+        </w:tc>
+        <w:tc>
+          <w:tcPr>
+            <w:tcW w:type="dxa" w:w="3600"/>
+            <w:tcBorders>
+              <w:top w:val="single" w:color="BBBBBB" w:sz="4"/>
+              <w:left w:val="single" w:color="BBBBBB" w:sz="4"/>
+              <w:bottom w:val="single" w:color="BBBBBB" w:sz="4"/>
+              <w:right w:val="single" w:color="BBBBBB" w:sz="4"/>
+            </w:tcBorders>
+            <w:tcMar>
+              <w:top w:type="dxa" w:w="70"/>
+              <w:left w:type="dxa" w:w="100"/>
+              <w:bottom w:type="dxa" w:w="70"/>
+              <w:right w:type="dxa" w:w="100"/>
+            </w:tcMar>
+          </w:tcPr>
+          <w:p>
+            <w:pPr>
+              <w:spacing w:after="0" w:line="280"/>
+            </w:pPr>
+            <w:r>
+              <w:rPr>
+                <w:rFonts w:ascii="Malgun Gothic" w:cs="Malgun Gothic" w:eastAsia="Malgun Gothic" w:hAnsi="Malgun Gothic"/>
+                <w:b w:val="false"/>
+                <w:bCs w:val="false"/>
+                <w:sz w:val="19"/>
+                <w:szCs w:val="19"/>
+              </w:rPr>
+              <w:t xml:space="preserve">격차의 수준이 아니라 태그 간 차이와 질문 감소의 연관을 추정한다. 출시 이전 모델의 같은 격차를 기준으로 삼는다.</w:t>
+            </w:r>
+          </w:p>
+        </w:tc>
+      </w:tr>
+      <w:tr>
+        <w:tc>
+          <w:tcPr>
+            <w:tcW w:type="dxa" w:w="2200"/>
+            <w:tcBorders>
+              <w:top w:val="single" w:color="BBBBBB" w:sz="4"/>
+              <w:left w:val="single" w:color="BBBBBB" w:sz="4"/>
+              <w:bottom w:val="single" w:color="BBBBBB" w:sz="4"/>
+              <w:right w:val="single" w:color="BBBBBB" w:sz="4"/>
+            </w:tcBorders>
+            <w:tcMar>
+              <w:top w:type="dxa" w:w="70"/>
+              <w:left w:type="dxa" w:w="100"/>
+              <w:bottom w:type="dxa" w:w="70"/>
+              <w:right w:type="dxa" w:w="100"/>
+            </w:tcMar>
+          </w:tcPr>
+          <w:p>
+            <w:pPr>
+              <w:spacing w:after="0" w:line="280"/>
+            </w:pPr>
+            <w:r>
+              <w:rPr>
+                <w:rFonts w:ascii="Malgun Gothic" w:cs="Malgun Gothic" w:eastAsia="Malgun Gothic" w:hAnsi="Malgun Gothic"/>
+                <w:b w:val="false"/>
+                <w:bCs w:val="false"/>
+                <w:sz w:val="19"/>
+                <w:szCs w:val="19"/>
+              </w:rPr>
               <w:t xml:space="preserve">인과 방향</w:t>
             </w:r>
           </w:p>
@@ -3500,7 +5253,7 @@
           <w:sz w:val="21"/>
           <w:szCs w:val="21"/>
         </w:rPr>
-        <w:t xml:space="preserve">모델별 학습 시점은 공식 문서로 확인해야 하며, 확인 전에는 대조군과 처치군의 모델 구성을 확정할 수 없다.</w:t>
+        <w:t xml:space="preserve">대조군이 얇다. 출시 이전 학습이 확인된 모델은 GPT-3.5 계열과 Llama 2뿐이며 Llama 2는 자체 구동이 필요하다. 학습 시점은 대부분 공식 문서로 확인했으나 GPT-4와 Qwen, DeepSeek, Mistral은 확인하지 못했다.</w:t>
       </w:r>
     </w:p>
     <w:p>
@@ -3674,6 +5427,60 @@
           <w:szCs w:val="21"/>
         </w:rPr>
         <w:t xml:space="preserve">arXiv:2509.05879. Stack Overflow Is Not Dead Yet: Crowd Answers Still Matter. (저자 확인 필요)</w:t>
+      </w:r>
+    </w:p>
+    <w:p>
+      <w:pPr>
+        <w:pStyle w:val="ListParagraph"/>
+        <w:numPr>
+          <w:ilvl w:val="0"/>
+          <w:numId w:val="2"/>
+        </w:numPr>
+        <w:spacing w:after="80" w:line="300"/>
+      </w:pPr>
+      <w:r>
+        <w:rPr>
+          <w:rFonts w:ascii="Malgun Gothic" w:cs="Malgun Gothic" w:eastAsia="Malgun Gothic" w:hAnsi="Malgun Gothic"/>
+          <w:sz w:val="21"/>
+          <w:szCs w:val="21"/>
+        </w:rPr>
+        <w:t xml:space="preserve">Cheng, J. 외. Dated Data: Tracing Knowledge Cutoffs in Large Language Models. arXiv:2403.12958. (저자 전체 확인 필요)</w:t>
+      </w:r>
+    </w:p>
+    <w:p>
+      <w:pPr>
+        <w:pStyle w:val="ListParagraph"/>
+        <w:numPr>
+          <w:ilvl w:val="0"/>
+          <w:numId w:val="2"/>
+        </w:numPr>
+        <w:spacing w:after="80" w:line="300"/>
+      </w:pPr>
+      <w:r>
+        <w:rPr>
+          <w:rFonts w:ascii="Malgun Gothic" w:cs="Malgun Gothic" w:eastAsia="Malgun Gothic" w:hAnsi="Malgun Gothic"/>
+          <w:sz w:val="21"/>
+          <w:szCs w:val="21"/>
+        </w:rPr>
+        <w:t xml:space="preserve">LibEvoBench: Probing Temporal Knowledge Stratification in Code Generation Models. (게재 학회와 저자 확인 필요; 요약 페이지 기준)</w:t>
+      </w:r>
+    </w:p>
+    <w:p>
+      <w:pPr>
+        <w:pStyle w:val="ListParagraph"/>
+        <w:numPr>
+          <w:ilvl w:val="0"/>
+          <w:numId w:val="2"/>
+        </w:numPr>
+        <w:spacing w:after="80" w:line="300"/>
+      </w:pPr>
+      <w:r>
+        <w:rPr>
+          <w:rFonts w:ascii="Malgun Gothic" w:cs="Malgun Gothic" w:eastAsia="Malgun Gothic" w:hAnsi="Malgun Gothic"/>
+          <w:sz w:val="21"/>
+          <w:szCs w:val="21"/>
+        </w:rPr>
+        <w:t xml:space="preserve">Shumailov, I. 외 (2024). Nature. AI models collapse when trained on recursively generated data. (2차 보도로만 확인, 서지 정보 확인 필요)</w:t>
       </w:r>
     </w:p>
     <w:sectPr>

</xml_diff>

<commit_message>
Add verified Claude training cutoffs to model candidates and design doc
Co-Authored-By: Claude Sonnet 5.5 <noreply@anthropic.com>
Claude-Session: https://claude.ai/code/session_015MZUD41psp6knHtKmwofCK
</commit_message>
<xml_diff>
--- a/retraining_loop_research_design.docx
+++ b/retraining_loop_research_design.docx
@@ -2037,7 +2037,7 @@
           <w:sz w:val="21"/>
           <w:szCs w:val="21"/>
         </w:rPr>
-        <w:t xml:space="preserve">모델 집합: 학습 시점은 각 사 공식 문서로 확인했다(표 참조). 대조군(출시 이전 학습)은 GPT-3.5 계열(2021년 9월, OpenAI 모델 페이지는 계열 단위로 적혀 있고 0613 스냅샷은 목록에 없음)과 Llama 2(2022년 9월, Meta 모델 카드)이며, Llama 2는 OpenRouter에 없어 자체 구동이 필요하다. 전환군은 Llama 3.x(2023년 3월에서 12월)와 GPT-4o(2023년 10월), 처치군은 GPT-4.1(2024년 6월), Phi-4(2024년 6월), Gemma 3와 Llama 4(2024년 8월)다.</w:t>
+        <w:t xml:space="preserve">모델 집합: 학습 시점은 각 사 공식 문서로 확인했다(표 참조). 대조군(출시 이전 학습)은 GPT-3.5 계열(2021년 9월, OpenAI 모델 페이지는 계열 단위로 적혀 있고 0613 스냅샷은 목록에 없음)과 Llama 2(2022년 9월, Meta 모델 카드)이며, Llama 2는 OpenRouter에 없어 자체 구동이 필요하다. 전환군은 Llama 3.x(2023년 3월에서 12월)와 GPT-4o(2023년 10월), 처치군은 GPT-4.1(2024년 6월), Phi-4(2024년 6월), Gemma 3와 Llama 4(2024년 8월), Claude 모델(2025년 2월에서 2026년 6월)이다. 제공 중인 Claude 모델은 모두 출시 이전 대조군이 될 수 없지만, 학습 시점이 1년 이상 퍼져 있어 처치군 내부의 용량 비교(감소 구간을 얼마나 학습했는지)에 쓸 수 있다.</w:t>
       </w:r>
     </w:p>
     <w:tbl>
@@ -3199,6 +3199,656 @@
                 <w:szCs w:val="19"/>
               </w:rPr>
               <w:t xml:space="preserve">각 사 모델 카드</w:t>
+            </w:r>
+          </w:p>
+        </w:tc>
+        <w:tc>
+          <w:tcPr>
+            <w:tcW w:type="dxa" w:w="2660"/>
+            <w:tcBorders>
+              <w:top w:val="single" w:color="BBBBBB" w:sz="4"/>
+              <w:left w:val="single" w:color="BBBBBB" w:sz="4"/>
+              <w:bottom w:val="single" w:color="BBBBBB" w:sz="4"/>
+              <w:right w:val="single" w:color="BBBBBB" w:sz="4"/>
+            </w:tcBorders>
+            <w:tcMar>
+              <w:top w:type="dxa" w:w="70"/>
+              <w:left w:type="dxa" w:w="100"/>
+              <w:bottom w:type="dxa" w:w="70"/>
+              <w:right w:type="dxa" w:w="100"/>
+            </w:tcMar>
+          </w:tcPr>
+          <w:p>
+            <w:pPr>
+              <w:spacing w:after="0" w:line="280"/>
+            </w:pPr>
+            <w:r>
+              <w:rPr>
+                <w:rFonts w:ascii="Malgun Gothic" w:cs="Malgun Gothic" w:eastAsia="Malgun Gothic" w:hAnsi="Malgun Gothic"/>
+                <w:b w:val="false"/>
+                <w:bCs w:val="false"/>
+                <w:sz w:val="19"/>
+                <w:szCs w:val="19"/>
+              </w:rPr>
+              <w:t xml:space="preserve">처치군</w:t>
+            </w:r>
+          </w:p>
+        </w:tc>
+      </w:tr>
+      <w:tr>
+        <w:tc>
+          <w:tcPr>
+            <w:tcW w:type="dxa" w:w="2300"/>
+            <w:tcBorders>
+              <w:top w:val="single" w:color="BBBBBB" w:sz="4"/>
+              <w:left w:val="single" w:color="BBBBBB" w:sz="4"/>
+              <w:bottom w:val="single" w:color="BBBBBB" w:sz="4"/>
+              <w:right w:val="single" w:color="BBBBBB" w:sz="4"/>
+            </w:tcBorders>
+            <w:tcMar>
+              <w:top w:type="dxa" w:w="70"/>
+              <w:left w:type="dxa" w:w="100"/>
+              <w:bottom w:type="dxa" w:w="70"/>
+              <w:right w:type="dxa" w:w="100"/>
+            </w:tcMar>
+          </w:tcPr>
+          <w:p>
+            <w:pPr>
+              <w:spacing w:after="0" w:line="280"/>
+            </w:pPr>
+            <w:r>
+              <w:rPr>
+                <w:rFonts w:ascii="Malgun Gothic" w:cs="Malgun Gothic" w:eastAsia="Malgun Gothic" w:hAnsi="Malgun Gothic"/>
+                <w:b w:val="false"/>
+                <w:bCs w:val="false"/>
+                <w:sz w:val="19"/>
+                <w:szCs w:val="19"/>
+              </w:rPr>
+              <w:t xml:space="preserve">Claude Haiku 4.5</w:t>
+            </w:r>
+          </w:p>
+        </w:tc>
+        <w:tc>
+          <w:tcPr>
+            <w:tcW w:type="dxa" w:w="2000"/>
+            <w:tcBorders>
+              <w:top w:val="single" w:color="BBBBBB" w:sz="4"/>
+              <w:left w:val="single" w:color="BBBBBB" w:sz="4"/>
+              <w:bottom w:val="single" w:color="BBBBBB" w:sz="4"/>
+              <w:right w:val="single" w:color="BBBBBB" w:sz="4"/>
+            </w:tcBorders>
+            <w:tcMar>
+              <w:top w:type="dxa" w:w="70"/>
+              <w:left w:type="dxa" w:w="100"/>
+              <w:bottom w:type="dxa" w:w="70"/>
+              <w:right w:type="dxa" w:w="100"/>
+            </w:tcMar>
+          </w:tcPr>
+          <w:p>
+            <w:pPr>
+              <w:spacing w:after="0" w:line="280"/>
+            </w:pPr>
+            <w:r>
+              <w:rPr>
+                <w:rFonts w:ascii="Malgun Gothic" w:cs="Malgun Gothic" w:eastAsia="Malgun Gothic" w:hAnsi="Malgun Gothic"/>
+                <w:b w:val="false"/>
+                <w:bCs w:val="false"/>
+                <w:sz w:val="19"/>
+                <w:szCs w:val="19"/>
+              </w:rPr>
+              <w:t xml:space="preserve">2025년 2월 (학습 데이터 2025년 7월)</w:t>
+            </w:r>
+          </w:p>
+        </w:tc>
+        <w:tc>
+          <w:tcPr>
+            <w:tcW w:type="dxa" w:w="2400"/>
+            <w:tcBorders>
+              <w:top w:val="single" w:color="BBBBBB" w:sz="4"/>
+              <w:left w:val="single" w:color="BBBBBB" w:sz="4"/>
+              <w:bottom w:val="single" w:color="BBBBBB" w:sz="4"/>
+              <w:right w:val="single" w:color="BBBBBB" w:sz="4"/>
+            </w:tcBorders>
+            <w:tcMar>
+              <w:top w:type="dxa" w:w="70"/>
+              <w:left w:type="dxa" w:w="100"/>
+              <w:bottom w:type="dxa" w:w="70"/>
+              <w:right w:type="dxa" w:w="100"/>
+            </w:tcMar>
+          </w:tcPr>
+          <w:p>
+            <w:pPr>
+              <w:spacing w:after="0" w:line="280"/>
+            </w:pPr>
+            <w:r>
+              <w:rPr>
+                <w:rFonts w:ascii="Malgun Gothic" w:cs="Malgun Gothic" w:eastAsia="Malgun Gothic" w:hAnsi="Malgun Gothic"/>
+                <w:b w:val="false"/>
+                <w:bCs w:val="false"/>
+                <w:sz w:val="19"/>
+                <w:szCs w:val="19"/>
+              </w:rPr>
+              <w:t xml:space="preserve">Anthropic 모델 문서</w:t>
+            </w:r>
+          </w:p>
+        </w:tc>
+        <w:tc>
+          <w:tcPr>
+            <w:tcW w:type="dxa" w:w="2660"/>
+            <w:tcBorders>
+              <w:top w:val="single" w:color="BBBBBB" w:sz="4"/>
+              <w:left w:val="single" w:color="BBBBBB" w:sz="4"/>
+              <w:bottom w:val="single" w:color="BBBBBB" w:sz="4"/>
+              <w:right w:val="single" w:color="BBBBBB" w:sz="4"/>
+            </w:tcBorders>
+            <w:tcMar>
+              <w:top w:type="dxa" w:w="70"/>
+              <w:left w:type="dxa" w:w="100"/>
+              <w:bottom w:type="dxa" w:w="70"/>
+              <w:right w:type="dxa" w:w="100"/>
+            </w:tcMar>
+          </w:tcPr>
+          <w:p>
+            <w:pPr>
+              <w:spacing w:after="0" w:line="280"/>
+            </w:pPr>
+            <w:r>
+              <w:rPr>
+                <w:rFonts w:ascii="Malgun Gothic" w:cs="Malgun Gothic" w:eastAsia="Malgun Gothic" w:hAnsi="Malgun Gothic"/>
+                <w:b w:val="false"/>
+                <w:bCs w:val="false"/>
+                <w:sz w:val="19"/>
+                <w:szCs w:val="19"/>
+              </w:rPr>
+              <w:t xml:space="preserve">처치군</w:t>
+            </w:r>
+          </w:p>
+        </w:tc>
+      </w:tr>
+      <w:tr>
+        <w:tc>
+          <w:tcPr>
+            <w:tcW w:type="dxa" w:w="2300"/>
+            <w:tcBorders>
+              <w:top w:val="single" w:color="BBBBBB" w:sz="4"/>
+              <w:left w:val="single" w:color="BBBBBB" w:sz="4"/>
+              <w:bottom w:val="single" w:color="BBBBBB" w:sz="4"/>
+              <w:right w:val="single" w:color="BBBBBB" w:sz="4"/>
+            </w:tcBorders>
+            <w:tcMar>
+              <w:top w:type="dxa" w:w="70"/>
+              <w:left w:type="dxa" w:w="100"/>
+              <w:bottom w:type="dxa" w:w="70"/>
+              <w:right w:type="dxa" w:w="100"/>
+            </w:tcMar>
+          </w:tcPr>
+          <w:p>
+            <w:pPr>
+              <w:spacing w:after="0" w:line="280"/>
+            </w:pPr>
+            <w:r>
+              <w:rPr>
+                <w:rFonts w:ascii="Malgun Gothic" w:cs="Malgun Gothic" w:eastAsia="Malgun Gothic" w:hAnsi="Malgun Gothic"/>
+                <w:b w:val="false"/>
+                <w:bCs w:val="false"/>
+                <w:sz w:val="19"/>
+                <w:szCs w:val="19"/>
+              </w:rPr>
+              <w:t xml:space="preserve">Claude Opus 4.5 / 4.6</w:t>
+            </w:r>
+          </w:p>
+        </w:tc>
+        <w:tc>
+          <w:tcPr>
+            <w:tcW w:type="dxa" w:w="2000"/>
+            <w:tcBorders>
+              <w:top w:val="single" w:color="BBBBBB" w:sz="4"/>
+              <w:left w:val="single" w:color="BBBBBB" w:sz="4"/>
+              <w:bottom w:val="single" w:color="BBBBBB" w:sz="4"/>
+              <w:right w:val="single" w:color="BBBBBB" w:sz="4"/>
+            </w:tcBorders>
+            <w:tcMar>
+              <w:top w:type="dxa" w:w="70"/>
+              <w:left w:type="dxa" w:w="100"/>
+              <w:bottom w:type="dxa" w:w="70"/>
+              <w:right w:type="dxa" w:w="100"/>
+            </w:tcMar>
+          </w:tcPr>
+          <w:p>
+            <w:pPr>
+              <w:spacing w:after="0" w:line="280"/>
+            </w:pPr>
+            <w:r>
+              <w:rPr>
+                <w:rFonts w:ascii="Malgun Gothic" w:cs="Malgun Gothic" w:eastAsia="Malgun Gothic" w:hAnsi="Malgun Gothic"/>
+                <w:b w:val="false"/>
+                <w:bCs w:val="false"/>
+                <w:sz w:val="19"/>
+                <w:szCs w:val="19"/>
+              </w:rPr>
+              <w:t xml:space="preserve">2025년 5월 (학습 데이터 2025년 8월)</w:t>
+            </w:r>
+          </w:p>
+        </w:tc>
+        <w:tc>
+          <w:tcPr>
+            <w:tcW w:type="dxa" w:w="2400"/>
+            <w:tcBorders>
+              <w:top w:val="single" w:color="BBBBBB" w:sz="4"/>
+              <w:left w:val="single" w:color="BBBBBB" w:sz="4"/>
+              <w:bottom w:val="single" w:color="BBBBBB" w:sz="4"/>
+              <w:right w:val="single" w:color="BBBBBB" w:sz="4"/>
+            </w:tcBorders>
+            <w:tcMar>
+              <w:top w:type="dxa" w:w="70"/>
+              <w:left w:type="dxa" w:w="100"/>
+              <w:bottom w:type="dxa" w:w="70"/>
+              <w:right w:type="dxa" w:w="100"/>
+            </w:tcMar>
+          </w:tcPr>
+          <w:p>
+            <w:pPr>
+              <w:spacing w:after="0" w:line="280"/>
+            </w:pPr>
+            <w:r>
+              <w:rPr>
+                <w:rFonts w:ascii="Malgun Gothic" w:cs="Malgun Gothic" w:eastAsia="Malgun Gothic" w:hAnsi="Malgun Gothic"/>
+                <w:b w:val="false"/>
+                <w:bCs w:val="false"/>
+                <w:sz w:val="19"/>
+                <w:szCs w:val="19"/>
+              </w:rPr>
+              <w:t xml:space="preserve">Anthropic 모델 문서</w:t>
+            </w:r>
+          </w:p>
+        </w:tc>
+        <w:tc>
+          <w:tcPr>
+            <w:tcW w:type="dxa" w:w="2660"/>
+            <w:tcBorders>
+              <w:top w:val="single" w:color="BBBBBB" w:sz="4"/>
+              <w:left w:val="single" w:color="BBBBBB" w:sz="4"/>
+              <w:bottom w:val="single" w:color="BBBBBB" w:sz="4"/>
+              <w:right w:val="single" w:color="BBBBBB" w:sz="4"/>
+            </w:tcBorders>
+            <w:tcMar>
+              <w:top w:type="dxa" w:w="70"/>
+              <w:left w:type="dxa" w:w="100"/>
+              <w:bottom w:type="dxa" w:w="70"/>
+              <w:right w:type="dxa" w:w="100"/>
+            </w:tcMar>
+          </w:tcPr>
+          <w:p>
+            <w:pPr>
+              <w:spacing w:after="0" w:line="280"/>
+            </w:pPr>
+            <w:r>
+              <w:rPr>
+                <w:rFonts w:ascii="Malgun Gothic" w:cs="Malgun Gothic" w:eastAsia="Malgun Gothic" w:hAnsi="Malgun Gothic"/>
+                <w:b w:val="false"/>
+                <w:bCs w:val="false"/>
+                <w:sz w:val="19"/>
+                <w:szCs w:val="19"/>
+              </w:rPr>
+              <w:t xml:space="preserve">처치군</w:t>
+            </w:r>
+          </w:p>
+        </w:tc>
+      </w:tr>
+      <w:tr>
+        <w:tc>
+          <w:tcPr>
+            <w:tcW w:type="dxa" w:w="2300"/>
+            <w:tcBorders>
+              <w:top w:val="single" w:color="BBBBBB" w:sz="4"/>
+              <w:left w:val="single" w:color="BBBBBB" w:sz="4"/>
+              <w:bottom w:val="single" w:color="BBBBBB" w:sz="4"/>
+              <w:right w:val="single" w:color="BBBBBB" w:sz="4"/>
+            </w:tcBorders>
+            <w:tcMar>
+              <w:top w:type="dxa" w:w="70"/>
+              <w:left w:type="dxa" w:w="100"/>
+              <w:bottom w:type="dxa" w:w="70"/>
+              <w:right w:type="dxa" w:w="100"/>
+            </w:tcMar>
+          </w:tcPr>
+          <w:p>
+            <w:pPr>
+              <w:spacing w:after="0" w:line="280"/>
+            </w:pPr>
+            <w:r>
+              <w:rPr>
+                <w:rFonts w:ascii="Malgun Gothic" w:cs="Malgun Gothic" w:eastAsia="Malgun Gothic" w:hAnsi="Malgun Gothic"/>
+                <w:b w:val="false"/>
+                <w:bCs w:val="false"/>
+                <w:sz w:val="19"/>
+                <w:szCs w:val="19"/>
+              </w:rPr>
+              <w:t xml:space="preserve">Claude Sonnet 4.6</w:t>
+            </w:r>
+          </w:p>
+        </w:tc>
+        <w:tc>
+          <w:tcPr>
+            <w:tcW w:type="dxa" w:w="2000"/>
+            <w:tcBorders>
+              <w:top w:val="single" w:color="BBBBBB" w:sz="4"/>
+              <w:left w:val="single" w:color="BBBBBB" w:sz="4"/>
+              <w:bottom w:val="single" w:color="BBBBBB" w:sz="4"/>
+              <w:right w:val="single" w:color="BBBBBB" w:sz="4"/>
+            </w:tcBorders>
+            <w:tcMar>
+              <w:top w:type="dxa" w:w="70"/>
+              <w:left w:type="dxa" w:w="100"/>
+              <w:bottom w:type="dxa" w:w="70"/>
+              <w:right w:type="dxa" w:w="100"/>
+            </w:tcMar>
+          </w:tcPr>
+          <w:p>
+            <w:pPr>
+              <w:spacing w:after="0" w:line="280"/>
+            </w:pPr>
+            <w:r>
+              <w:rPr>
+                <w:rFonts w:ascii="Malgun Gothic" w:cs="Malgun Gothic" w:eastAsia="Malgun Gothic" w:hAnsi="Malgun Gothic"/>
+                <w:b w:val="false"/>
+                <w:bCs w:val="false"/>
+                <w:sz w:val="19"/>
+                <w:szCs w:val="19"/>
+              </w:rPr>
+              <w:t xml:space="preserve">2025년 8월 (학습 데이터 2026년 1월)</w:t>
+            </w:r>
+          </w:p>
+        </w:tc>
+        <w:tc>
+          <w:tcPr>
+            <w:tcW w:type="dxa" w:w="2400"/>
+            <w:tcBorders>
+              <w:top w:val="single" w:color="BBBBBB" w:sz="4"/>
+              <w:left w:val="single" w:color="BBBBBB" w:sz="4"/>
+              <w:bottom w:val="single" w:color="BBBBBB" w:sz="4"/>
+              <w:right w:val="single" w:color="BBBBBB" w:sz="4"/>
+            </w:tcBorders>
+            <w:tcMar>
+              <w:top w:type="dxa" w:w="70"/>
+              <w:left w:type="dxa" w:w="100"/>
+              <w:bottom w:type="dxa" w:w="70"/>
+              <w:right w:type="dxa" w:w="100"/>
+            </w:tcMar>
+          </w:tcPr>
+          <w:p>
+            <w:pPr>
+              <w:spacing w:after="0" w:line="280"/>
+            </w:pPr>
+            <w:r>
+              <w:rPr>
+                <w:rFonts w:ascii="Malgun Gothic" w:cs="Malgun Gothic" w:eastAsia="Malgun Gothic" w:hAnsi="Malgun Gothic"/>
+                <w:b w:val="false"/>
+                <w:bCs w:val="false"/>
+                <w:sz w:val="19"/>
+                <w:szCs w:val="19"/>
+              </w:rPr>
+              <w:t xml:space="preserve">Anthropic 모델 문서</w:t>
+            </w:r>
+          </w:p>
+        </w:tc>
+        <w:tc>
+          <w:tcPr>
+            <w:tcW w:type="dxa" w:w="2660"/>
+            <w:tcBorders>
+              <w:top w:val="single" w:color="BBBBBB" w:sz="4"/>
+              <w:left w:val="single" w:color="BBBBBB" w:sz="4"/>
+              <w:bottom w:val="single" w:color="BBBBBB" w:sz="4"/>
+              <w:right w:val="single" w:color="BBBBBB" w:sz="4"/>
+            </w:tcBorders>
+            <w:tcMar>
+              <w:top w:type="dxa" w:w="70"/>
+              <w:left w:type="dxa" w:w="100"/>
+              <w:bottom w:type="dxa" w:w="70"/>
+              <w:right w:type="dxa" w:w="100"/>
+            </w:tcMar>
+          </w:tcPr>
+          <w:p>
+            <w:pPr>
+              <w:spacing w:after="0" w:line="280"/>
+            </w:pPr>
+            <w:r>
+              <w:rPr>
+                <w:rFonts w:ascii="Malgun Gothic" w:cs="Malgun Gothic" w:eastAsia="Malgun Gothic" w:hAnsi="Malgun Gothic"/>
+                <w:b w:val="false"/>
+                <w:bCs w:val="false"/>
+                <w:sz w:val="19"/>
+                <w:szCs w:val="19"/>
+              </w:rPr>
+              <w:t xml:space="preserve">처치군</w:t>
+            </w:r>
+          </w:p>
+        </w:tc>
+      </w:tr>
+      <w:tr>
+        <w:tc>
+          <w:tcPr>
+            <w:tcW w:type="dxa" w:w="2300"/>
+            <w:tcBorders>
+              <w:top w:val="single" w:color="BBBBBB" w:sz="4"/>
+              <w:left w:val="single" w:color="BBBBBB" w:sz="4"/>
+              <w:bottom w:val="single" w:color="BBBBBB" w:sz="4"/>
+              <w:right w:val="single" w:color="BBBBBB" w:sz="4"/>
+            </w:tcBorders>
+            <w:tcMar>
+              <w:top w:type="dxa" w:w="70"/>
+              <w:left w:type="dxa" w:w="100"/>
+              <w:bottom w:type="dxa" w:w="70"/>
+              <w:right w:type="dxa" w:w="100"/>
+            </w:tcMar>
+          </w:tcPr>
+          <w:p>
+            <w:pPr>
+              <w:spacing w:after="0" w:line="280"/>
+            </w:pPr>
+            <w:r>
+              <w:rPr>
+                <w:rFonts w:ascii="Malgun Gothic" w:cs="Malgun Gothic" w:eastAsia="Malgun Gothic" w:hAnsi="Malgun Gothic"/>
+                <w:b w:val="false"/>
+                <w:bCs w:val="false"/>
+                <w:sz w:val="19"/>
+                <w:szCs w:val="19"/>
+              </w:rPr>
+              <w:t xml:space="preserve">Claude Opus 4.7, 4.8, Sonnet 5</w:t>
+            </w:r>
+          </w:p>
+        </w:tc>
+        <w:tc>
+          <w:tcPr>
+            <w:tcW w:type="dxa" w:w="2000"/>
+            <w:tcBorders>
+              <w:top w:val="single" w:color="BBBBBB" w:sz="4"/>
+              <w:left w:val="single" w:color="BBBBBB" w:sz="4"/>
+              <w:bottom w:val="single" w:color="BBBBBB" w:sz="4"/>
+              <w:right w:val="single" w:color="BBBBBB" w:sz="4"/>
+            </w:tcBorders>
+            <w:tcMar>
+              <w:top w:type="dxa" w:w="70"/>
+              <w:left w:type="dxa" w:w="100"/>
+              <w:bottom w:type="dxa" w:w="70"/>
+              <w:right w:type="dxa" w:w="100"/>
+            </w:tcMar>
+          </w:tcPr>
+          <w:p>
+            <w:pPr>
+              <w:spacing w:after="0" w:line="280"/>
+            </w:pPr>
+            <w:r>
+              <w:rPr>
+                <w:rFonts w:ascii="Malgun Gothic" w:cs="Malgun Gothic" w:eastAsia="Malgun Gothic" w:hAnsi="Malgun Gothic"/>
+                <w:b w:val="false"/>
+                <w:bCs w:val="false"/>
+                <w:sz w:val="19"/>
+                <w:szCs w:val="19"/>
+              </w:rPr>
+              <w:t xml:space="preserve">2026년 1월</w:t>
+            </w:r>
+          </w:p>
+        </w:tc>
+        <w:tc>
+          <w:tcPr>
+            <w:tcW w:type="dxa" w:w="2400"/>
+            <w:tcBorders>
+              <w:top w:val="single" w:color="BBBBBB" w:sz="4"/>
+              <w:left w:val="single" w:color="BBBBBB" w:sz="4"/>
+              <w:bottom w:val="single" w:color="BBBBBB" w:sz="4"/>
+              <w:right w:val="single" w:color="BBBBBB" w:sz="4"/>
+            </w:tcBorders>
+            <w:tcMar>
+              <w:top w:type="dxa" w:w="70"/>
+              <w:left w:type="dxa" w:w="100"/>
+              <w:bottom w:type="dxa" w:w="70"/>
+              <w:right w:type="dxa" w:w="100"/>
+            </w:tcMar>
+          </w:tcPr>
+          <w:p>
+            <w:pPr>
+              <w:spacing w:after="0" w:line="280"/>
+            </w:pPr>
+            <w:r>
+              <w:rPr>
+                <w:rFonts w:ascii="Malgun Gothic" w:cs="Malgun Gothic" w:eastAsia="Malgun Gothic" w:hAnsi="Malgun Gothic"/>
+                <w:b w:val="false"/>
+                <w:bCs w:val="false"/>
+                <w:sz w:val="19"/>
+                <w:szCs w:val="19"/>
+              </w:rPr>
+              <w:t xml:space="preserve">Anthropic 모델 문서</w:t>
+            </w:r>
+          </w:p>
+        </w:tc>
+        <w:tc>
+          <w:tcPr>
+            <w:tcW w:type="dxa" w:w="2660"/>
+            <w:tcBorders>
+              <w:top w:val="single" w:color="BBBBBB" w:sz="4"/>
+              <w:left w:val="single" w:color="BBBBBB" w:sz="4"/>
+              <w:bottom w:val="single" w:color="BBBBBB" w:sz="4"/>
+              <w:right w:val="single" w:color="BBBBBB" w:sz="4"/>
+            </w:tcBorders>
+            <w:tcMar>
+              <w:top w:type="dxa" w:w="70"/>
+              <w:left w:type="dxa" w:w="100"/>
+              <w:bottom w:type="dxa" w:w="70"/>
+              <w:right w:type="dxa" w:w="100"/>
+            </w:tcMar>
+          </w:tcPr>
+          <w:p>
+            <w:pPr>
+              <w:spacing w:after="0" w:line="280"/>
+            </w:pPr>
+            <w:r>
+              <w:rPr>
+                <w:rFonts w:ascii="Malgun Gothic" w:cs="Malgun Gothic" w:eastAsia="Malgun Gothic" w:hAnsi="Malgun Gothic"/>
+                <w:b w:val="false"/>
+                <w:bCs w:val="false"/>
+                <w:sz w:val="19"/>
+                <w:szCs w:val="19"/>
+              </w:rPr>
+              <w:t xml:space="preserve">처치군</w:t>
+            </w:r>
+          </w:p>
+        </w:tc>
+      </w:tr>
+      <w:tr>
+        <w:tc>
+          <w:tcPr>
+            <w:tcW w:type="dxa" w:w="2300"/>
+            <w:tcBorders>
+              <w:top w:val="single" w:color="BBBBBB" w:sz="4"/>
+              <w:left w:val="single" w:color="BBBBBB" w:sz="4"/>
+              <w:bottom w:val="single" w:color="BBBBBB" w:sz="4"/>
+              <w:right w:val="single" w:color="BBBBBB" w:sz="4"/>
+            </w:tcBorders>
+            <w:tcMar>
+              <w:top w:type="dxa" w:w="70"/>
+              <w:left w:type="dxa" w:w="100"/>
+              <w:bottom w:type="dxa" w:w="70"/>
+              <w:right w:type="dxa" w:w="100"/>
+            </w:tcMar>
+          </w:tcPr>
+          <w:p>
+            <w:pPr>
+              <w:spacing w:after="0" w:line="280"/>
+            </w:pPr>
+            <w:r>
+              <w:rPr>
+                <w:rFonts w:ascii="Malgun Gothic" w:cs="Malgun Gothic" w:eastAsia="Malgun Gothic" w:hAnsi="Malgun Gothic"/>
+                <w:b w:val="false"/>
+                <w:bCs w:val="false"/>
+                <w:sz w:val="19"/>
+                <w:szCs w:val="19"/>
+              </w:rPr>
+              <w:t xml:space="preserve">Claude 5.5 계열</w:t>
+            </w:r>
+          </w:p>
+        </w:tc>
+        <w:tc>
+          <w:tcPr>
+            <w:tcW w:type="dxa" w:w="2000"/>
+            <w:tcBorders>
+              <w:top w:val="single" w:color="BBBBBB" w:sz="4"/>
+              <w:left w:val="single" w:color="BBBBBB" w:sz="4"/>
+              <w:bottom w:val="single" w:color="BBBBBB" w:sz="4"/>
+              <w:right w:val="single" w:color="BBBBBB" w:sz="4"/>
+            </w:tcBorders>
+            <w:tcMar>
+              <w:top w:type="dxa" w:w="70"/>
+              <w:left w:type="dxa" w:w="100"/>
+              <w:bottom w:type="dxa" w:w="70"/>
+              <w:right w:type="dxa" w:w="100"/>
+            </w:tcMar>
+          </w:tcPr>
+          <w:p>
+            <w:pPr>
+              <w:spacing w:after="0" w:line="280"/>
+            </w:pPr>
+            <w:r>
+              <w:rPr>
+                <w:rFonts w:ascii="Malgun Gothic" w:cs="Malgun Gothic" w:eastAsia="Malgun Gothic" w:hAnsi="Malgun Gothic"/>
+                <w:b w:val="false"/>
+                <w:bCs w:val="false"/>
+                <w:sz w:val="19"/>
+                <w:szCs w:val="19"/>
+              </w:rPr>
+              <w:t xml:space="preserve">2026년 6월</w:t>
+            </w:r>
+          </w:p>
+        </w:tc>
+        <w:tc>
+          <w:tcPr>
+            <w:tcW w:type="dxa" w:w="2400"/>
+            <w:tcBorders>
+              <w:top w:val="single" w:color="BBBBBB" w:sz="4"/>
+              <w:left w:val="single" w:color="BBBBBB" w:sz="4"/>
+              <w:bottom w:val="single" w:color="BBBBBB" w:sz="4"/>
+              <w:right w:val="single" w:color="BBBBBB" w:sz="4"/>
+            </w:tcBorders>
+            <w:tcMar>
+              <w:top w:type="dxa" w:w="70"/>
+              <w:left w:type="dxa" w:w="100"/>
+              <w:bottom w:type="dxa" w:w="70"/>
+              <w:right w:type="dxa" w:w="100"/>
+            </w:tcMar>
+          </w:tcPr>
+          <w:p>
+            <w:pPr>
+              <w:spacing w:after="0" w:line="280"/>
+            </w:pPr>
+            <w:r>
+              <w:rPr>
+                <w:rFonts w:ascii="Malgun Gothic" w:cs="Malgun Gothic" w:eastAsia="Malgun Gothic" w:hAnsi="Malgun Gothic"/>
+                <w:b w:val="false"/>
+                <w:bCs w:val="false"/>
+                <w:sz w:val="19"/>
+                <w:szCs w:val="19"/>
+              </w:rPr>
+              <w:t xml:space="preserve">Anthropic 모델 문서</w:t>
             </w:r>
           </w:p>
         </w:tc>

</xml_diff>

<commit_message>
Design doc: add AI adoption intensity section (Economic Index, SO survey), threats, limits
Co-Authored-By: Claude Sonnet 5.5 <noreply@anthropic.com>
Claude-Session: https://claude.ai/code/session_015MZUD41psp6knHtKmwofCK
</commit_message>
<xml_diff>
--- a/retraining_loop_research_design.docx
+++ b/retraining_loop_research_design.docx
@@ -1863,6 +1863,1885 @@
     </w:tbl>
     <w:p>
       <w:pPr>
+        <w:pStyle w:val="Heading2"/>
+        <w:spacing w:after="100" w:before="200"/>
+      </w:pPr>
+      <w:r>
+        <w:rPr>
+          <w:rFonts w:ascii="Malgun Gothic" w:cs="Malgun Gothic" w:eastAsia="Malgun Gothic" w:hAnsi="Malgun Gothic"/>
+          <w:b/>
+          <w:bCs/>
+          <w:sz w:val="23"/>
+          <w:szCs w:val="23"/>
+        </w:rPr>
+        <w:t xml:space="preserve">4.3 AI 채택 강도 (통제 변수와 메커니즘 변수)</w:t>
+      </w:r>
+    </w:p>
+    <w:p>
+      <w:pPr>
+        <w:spacing w:after="120" w:line="320"/>
+      </w:pPr>
+      <w:r>
+        <w:rPr>
+          <w:rFonts w:ascii="Malgun Gothic" w:cs="Malgun Gothic" w:eastAsia="Malgun Gothic" w:hAnsi="Malgun Gothic"/>
+          <w:sz w:val="21"/>
+          <w:szCs w:val="21"/>
+        </w:rPr>
+        <w:t xml:space="preserve">질문 감소는 모델 역량뿐 아니라 사람들이 AI를 실제로 얼마나 쓰는지에도 달려 있다. 태그 단위의 AI 사용 강도를 직접 측정한 공개 자료는 없었으므로, 다음 두 자료를 점검했다.</w:t>
+      </w:r>
+    </w:p>
+    <w:p>
+      <w:pPr>
+        <w:pStyle w:val="ListParagraph"/>
+        <w:numPr>
+          <w:ilvl w:val="0"/>
+          <w:numId w:val="2"/>
+        </w:numPr>
+        <w:spacing w:after="80" w:line="300"/>
+      </w:pPr>
+      <w:r>
+        <w:rPr>
+          <w:rFonts w:ascii="Malgun Gothic" w:cs="Malgun Gothic" w:eastAsia="Malgun Gothic" w:hAnsi="Malgun Gothic"/>
+          <w:b/>
+          <w:bCs/>
+          <w:sz w:val="21"/>
+          <w:szCs w:val="21"/>
+        </w:rPr>
+        <w:t xml:space="preserve">Anthropic Economic Index: </w:t>
+      </w:r>
+      <w:r>
+        <w:rPr>
+          <w:rFonts w:ascii="Malgun Gothic" w:cs="Malgun Gothic" w:eastAsia="Malgun Gothic" w:hAnsi="Malgun Gothic"/>
+          <w:sz w:val="21"/>
+          <w:szCs w:val="21"/>
+        </w:rPr>
+        <w:t xml:space="preserve">CC-BY-4.0으로 공개되며 소프트웨어 개발이 전체 대화의 11.5%(claude.ai), 18.0%(API)를 차지하는 집계 추세를 준다. 그러나 기술 이름이 노드인 항목은 React, SQL 쿼리, CSS 스타일링, JavaScript, Git 워크플로 정도이고 Python, Java, C++ 등은 없다. API 자료는 Claude Code를 제외한다. 이 자료는 모든 태그에 같은 값이 들어가는 집계 채택 추세로만 쓸 수 있고, 태그 간 차이를 식별하는 데는 쓸 수 없다.</w:t>
+      </w:r>
+    </w:p>
+    <w:p>
+      <w:pPr>
+        <w:pStyle w:val="ListParagraph"/>
+        <w:numPr>
+          <w:ilvl w:val="0"/>
+          <w:numId w:val="2"/>
+        </w:numPr>
+        <w:spacing w:after="80" w:line="300"/>
+      </w:pPr>
+      <w:r>
+        <w:rPr>
+          <w:rFonts w:ascii="Malgun Gothic" w:cs="Malgun Gothic" w:eastAsia="Malgun Gothic" w:hAnsi="Malgun Gothic"/>
+          <w:b/>
+          <w:bCs/>
+          <w:sz w:val="21"/>
+          <w:szCs w:val="21"/>
+        </w:rPr>
+        <w:t xml:space="preserve">Stack Overflow 개발자 설문(2023년에서 2026년, ODbL): </w:t>
+      </w:r>
+      <w:r>
+        <w:rPr>
+          <w:rFonts w:ascii="Malgun Gothic" w:cs="Malgun Gothic" w:eastAsia="Malgun Gothic" w:hAnsi="Malgun Gothic"/>
+          <w:sz w:val="21"/>
+          <w:szCs w:val="21"/>
+        </w:rPr>
+        <w:t xml:space="preserve">응답자별로 사용 언어와 AI 사용이 함께 있어 언어별 AI 사용률을 만들 수 있다. 2023년에서 2025년에는 "그 언어로 일하는 사람 중 AI 도구를 쓰는 비율"이고, 2026년에는 언어별로 AI를 쓴 언어를 직접 묻는다(LanguagesUsedAI). 언어 단위만 있어 상위 30개 태그 중 8개(Python, JavaScript, Java, C++, SQL, PHP, C#, R)만 연결된다.</w:t>
+      </w:r>
+    </w:p>
+    <w:tbl>
+      <w:tblPr>
+        <w:tblW w:type="dxa" w:w="9360"/>
+        <w:tblBorders>
+          <w:top w:val="single" w:color="auto" w:sz="4"/>
+          <w:left w:val="single" w:color="auto" w:sz="4"/>
+          <w:bottom w:val="single" w:color="auto" w:sz="4"/>
+          <w:right w:val="single" w:color="auto" w:sz="4"/>
+          <w:insideH w:val="single" w:color="auto" w:sz="4"/>
+          <w:insideV w:val="single" w:color="auto" w:sz="4"/>
+        </w:tblBorders>
+      </w:tblPr>
+      <w:tblGrid>
+        <w:gridCol w:w="2200"/>
+        <w:gridCol w:w="1500"/>
+        <w:gridCol w:w="1500"/>
+        <w:gridCol w:w="1500"/>
+        <w:gridCol w:w="1500"/>
+        <w:gridCol w:w="1160"/>
+      </w:tblGrid>
+      <w:tr>
+        <w:trPr>
+          <w:tblHeader/>
+        </w:trPr>
+        <w:tc>
+          <w:tcPr>
+            <w:tcW w:type="dxa" w:w="2200"/>
+            <w:tcBorders>
+              <w:top w:val="single" w:color="BBBBBB" w:sz="4"/>
+              <w:left w:val="single" w:color="BBBBBB" w:sz="4"/>
+              <w:bottom w:val="single" w:color="BBBBBB" w:sz="4"/>
+              <w:right w:val="single" w:color="BBBBBB" w:sz="4"/>
+            </w:tcBorders>
+            <w:shd w:fill="E8EEF4" w:color="auto" w:val="clear"/>
+            <w:tcMar>
+              <w:top w:type="dxa" w:w="70"/>
+              <w:left w:type="dxa" w:w="100"/>
+              <w:bottom w:type="dxa" w:w="70"/>
+              <w:right w:type="dxa" w:w="100"/>
+            </w:tcMar>
+          </w:tcPr>
+          <w:p>
+            <w:pPr>
+              <w:spacing w:after="0" w:line="280"/>
+            </w:pPr>
+            <w:r>
+              <w:rPr>
+                <w:rFonts w:ascii="Malgun Gothic" w:cs="Malgun Gothic" w:eastAsia="Malgun Gothic" w:hAnsi="Malgun Gothic"/>
+                <w:b/>
+                <w:bCs/>
+                <w:sz w:val="19"/>
+                <w:szCs w:val="19"/>
+              </w:rPr>
+              <w:t xml:space="preserve">언어</w:t>
+            </w:r>
+          </w:p>
+        </w:tc>
+        <w:tc>
+          <w:tcPr>
+            <w:tcW w:type="dxa" w:w="1500"/>
+            <w:tcBorders>
+              <w:top w:val="single" w:color="BBBBBB" w:sz="4"/>
+              <w:left w:val="single" w:color="BBBBBB" w:sz="4"/>
+              <w:bottom w:val="single" w:color="BBBBBB" w:sz="4"/>
+              <w:right w:val="single" w:color="BBBBBB" w:sz="4"/>
+            </w:tcBorders>
+            <w:shd w:fill="E8EEF4" w:color="auto" w:val="clear"/>
+            <w:tcMar>
+              <w:top w:type="dxa" w:w="70"/>
+              <w:left w:type="dxa" w:w="100"/>
+              <w:bottom w:type="dxa" w:w="70"/>
+              <w:right w:type="dxa" w:w="100"/>
+            </w:tcMar>
+          </w:tcPr>
+          <w:p>
+            <w:pPr>
+              <w:spacing w:after="0" w:line="280"/>
+            </w:pPr>
+            <w:r>
+              <w:rPr>
+                <w:rFonts w:ascii="Malgun Gothic" w:cs="Malgun Gothic" w:eastAsia="Malgun Gothic" w:hAnsi="Malgun Gothic"/>
+                <w:b/>
+                <w:bCs/>
+                <w:sz w:val="19"/>
+                <w:szCs w:val="19"/>
+              </w:rPr>
+              <w:t xml:space="preserve">2023</w:t>
+            </w:r>
+          </w:p>
+        </w:tc>
+        <w:tc>
+          <w:tcPr>
+            <w:tcW w:type="dxa" w:w="1500"/>
+            <w:tcBorders>
+              <w:top w:val="single" w:color="BBBBBB" w:sz="4"/>
+              <w:left w:val="single" w:color="BBBBBB" w:sz="4"/>
+              <w:bottom w:val="single" w:color="BBBBBB" w:sz="4"/>
+              <w:right w:val="single" w:color="BBBBBB" w:sz="4"/>
+            </w:tcBorders>
+            <w:shd w:fill="E8EEF4" w:color="auto" w:val="clear"/>
+            <w:tcMar>
+              <w:top w:type="dxa" w:w="70"/>
+              <w:left w:type="dxa" w:w="100"/>
+              <w:bottom w:type="dxa" w:w="70"/>
+              <w:right w:type="dxa" w:w="100"/>
+            </w:tcMar>
+          </w:tcPr>
+          <w:p>
+            <w:pPr>
+              <w:spacing w:after="0" w:line="280"/>
+            </w:pPr>
+            <w:r>
+              <w:rPr>
+                <w:rFonts w:ascii="Malgun Gothic" w:cs="Malgun Gothic" w:eastAsia="Malgun Gothic" w:hAnsi="Malgun Gothic"/>
+                <w:b/>
+                <w:bCs/>
+                <w:sz w:val="19"/>
+                <w:szCs w:val="19"/>
+              </w:rPr>
+              <w:t xml:space="preserve">2024</w:t>
+            </w:r>
+          </w:p>
+        </w:tc>
+        <w:tc>
+          <w:tcPr>
+            <w:tcW w:type="dxa" w:w="1500"/>
+            <w:tcBorders>
+              <w:top w:val="single" w:color="BBBBBB" w:sz="4"/>
+              <w:left w:val="single" w:color="BBBBBB" w:sz="4"/>
+              <w:bottom w:val="single" w:color="BBBBBB" w:sz="4"/>
+              <w:right w:val="single" w:color="BBBBBB" w:sz="4"/>
+            </w:tcBorders>
+            <w:shd w:fill="E8EEF4" w:color="auto" w:val="clear"/>
+            <w:tcMar>
+              <w:top w:type="dxa" w:w="70"/>
+              <w:left w:type="dxa" w:w="100"/>
+              <w:bottom w:type="dxa" w:w="70"/>
+              <w:right w:type="dxa" w:w="100"/>
+            </w:tcMar>
+          </w:tcPr>
+          <w:p>
+            <w:pPr>
+              <w:spacing w:after="0" w:line="280"/>
+            </w:pPr>
+            <w:r>
+              <w:rPr>
+                <w:rFonts w:ascii="Malgun Gothic" w:cs="Malgun Gothic" w:eastAsia="Malgun Gothic" w:hAnsi="Malgun Gothic"/>
+                <w:b/>
+                <w:bCs/>
+                <w:sz w:val="19"/>
+                <w:szCs w:val="19"/>
+              </w:rPr>
+              <w:t xml:space="preserve">2025</w:t>
+            </w:r>
+          </w:p>
+        </w:tc>
+        <w:tc>
+          <w:tcPr>
+            <w:tcW w:type="dxa" w:w="1500"/>
+            <w:tcBorders>
+              <w:top w:val="single" w:color="BBBBBB" w:sz="4"/>
+              <w:left w:val="single" w:color="BBBBBB" w:sz="4"/>
+              <w:bottom w:val="single" w:color="BBBBBB" w:sz="4"/>
+              <w:right w:val="single" w:color="BBBBBB" w:sz="4"/>
+            </w:tcBorders>
+            <w:shd w:fill="E8EEF4" w:color="auto" w:val="clear"/>
+            <w:tcMar>
+              <w:top w:type="dxa" w:w="70"/>
+              <w:left w:type="dxa" w:w="100"/>
+              <w:bottom w:type="dxa" w:w="70"/>
+              <w:right w:type="dxa" w:w="100"/>
+            </w:tcMar>
+          </w:tcPr>
+          <w:p>
+            <w:pPr>
+              <w:spacing w:after="0" w:line="280"/>
+            </w:pPr>
+            <w:r>
+              <w:rPr>
+                <w:rFonts w:ascii="Malgun Gothic" w:cs="Malgun Gothic" w:eastAsia="Malgun Gothic" w:hAnsi="Malgun Gothic"/>
+                <w:b/>
+                <w:bCs/>
+                <w:sz w:val="19"/>
+                <w:szCs w:val="19"/>
+              </w:rPr>
+              <w:t xml:space="preserve">2026</w:t>
+            </w:r>
+          </w:p>
+        </w:tc>
+        <w:tc>
+          <w:tcPr>
+            <w:tcW w:type="dxa" w:w="1160"/>
+            <w:tcBorders>
+              <w:top w:val="single" w:color="BBBBBB" w:sz="4"/>
+              <w:left w:val="single" w:color="BBBBBB" w:sz="4"/>
+              <w:bottom w:val="single" w:color="BBBBBB" w:sz="4"/>
+              <w:right w:val="single" w:color="BBBBBB" w:sz="4"/>
+            </w:tcBorders>
+            <w:shd w:fill="E8EEF4" w:color="auto" w:val="clear"/>
+            <w:tcMar>
+              <w:top w:type="dxa" w:w="70"/>
+              <w:left w:type="dxa" w:w="100"/>
+              <w:bottom w:type="dxa" w:w="70"/>
+              <w:right w:type="dxa" w:w="100"/>
+            </w:tcMar>
+          </w:tcPr>
+          <w:p>
+            <w:pPr>
+              <w:spacing w:after="0" w:line="280"/>
+            </w:pPr>
+            <w:r>
+              <w:rPr>
+                <w:rFonts w:ascii="Malgun Gothic" w:cs="Malgun Gothic" w:eastAsia="Malgun Gothic" w:hAnsi="Malgun Gothic"/>
+                <w:b/>
+                <w:bCs/>
+                <w:sz w:val="19"/>
+                <w:szCs w:val="19"/>
+              </w:rPr>
+              <w:t xml:space="preserve">질문 감소(로그)</w:t>
+            </w:r>
+          </w:p>
+        </w:tc>
+      </w:tr>
+      <w:tr>
+        <w:tc>
+          <w:tcPr>
+            <w:tcW w:type="dxa" w:w="2200"/>
+            <w:tcBorders>
+              <w:top w:val="single" w:color="BBBBBB" w:sz="4"/>
+              <w:left w:val="single" w:color="BBBBBB" w:sz="4"/>
+              <w:bottom w:val="single" w:color="BBBBBB" w:sz="4"/>
+              <w:right w:val="single" w:color="BBBBBB" w:sz="4"/>
+            </w:tcBorders>
+            <w:tcMar>
+              <w:top w:type="dxa" w:w="70"/>
+              <w:left w:type="dxa" w:w="100"/>
+              <w:bottom w:type="dxa" w:w="70"/>
+              <w:right w:type="dxa" w:w="100"/>
+            </w:tcMar>
+          </w:tcPr>
+          <w:p>
+            <w:pPr>
+              <w:spacing w:after="0" w:line="280"/>
+            </w:pPr>
+            <w:r>
+              <w:rPr>
+                <w:rFonts w:ascii="Malgun Gothic" w:cs="Malgun Gothic" w:eastAsia="Malgun Gothic" w:hAnsi="Malgun Gothic"/>
+                <w:b w:val="false"/>
+                <w:bCs w:val="false"/>
+                <w:sz w:val="19"/>
+                <w:szCs w:val="19"/>
+              </w:rPr>
+              <w:t xml:space="preserve">Python</w:t>
+            </w:r>
+          </w:p>
+        </w:tc>
+        <w:tc>
+          <w:tcPr>
+            <w:tcW w:type="dxa" w:w="1500"/>
+            <w:tcBorders>
+              <w:top w:val="single" w:color="BBBBBB" w:sz="4"/>
+              <w:left w:val="single" w:color="BBBBBB" w:sz="4"/>
+              <w:bottom w:val="single" w:color="BBBBBB" w:sz="4"/>
+              <w:right w:val="single" w:color="BBBBBB" w:sz="4"/>
+            </w:tcBorders>
+            <w:tcMar>
+              <w:top w:type="dxa" w:w="70"/>
+              <w:left w:type="dxa" w:w="100"/>
+              <w:bottom w:type="dxa" w:w="70"/>
+              <w:right w:type="dxa" w:w="100"/>
+            </w:tcMar>
+          </w:tcPr>
+          <w:p>
+            <w:pPr>
+              <w:spacing w:after="0" w:line="280"/>
+            </w:pPr>
+            <w:r>
+              <w:rPr>
+                <w:rFonts w:ascii="Malgun Gothic" w:cs="Malgun Gothic" w:eastAsia="Malgun Gothic" w:hAnsi="Malgun Gothic"/>
+                <w:b w:val="false"/>
+                <w:bCs w:val="false"/>
+                <w:sz w:val="19"/>
+                <w:szCs w:val="19"/>
+              </w:rPr>
+              <w:t xml:space="preserve">48.3%</w:t>
+            </w:r>
+          </w:p>
+        </w:tc>
+        <w:tc>
+          <w:tcPr>
+            <w:tcW w:type="dxa" w:w="1500"/>
+            <w:tcBorders>
+              <w:top w:val="single" w:color="BBBBBB" w:sz="4"/>
+              <w:left w:val="single" w:color="BBBBBB" w:sz="4"/>
+              <w:bottom w:val="single" w:color="BBBBBB" w:sz="4"/>
+              <w:right w:val="single" w:color="BBBBBB" w:sz="4"/>
+            </w:tcBorders>
+            <w:tcMar>
+              <w:top w:type="dxa" w:w="70"/>
+              <w:left w:type="dxa" w:w="100"/>
+              <w:bottom w:type="dxa" w:w="70"/>
+              <w:right w:type="dxa" w:w="100"/>
+            </w:tcMar>
+          </w:tcPr>
+          <w:p>
+            <w:pPr>
+              <w:spacing w:after="0" w:line="280"/>
+            </w:pPr>
+            <w:r>
+              <w:rPr>
+                <w:rFonts w:ascii="Malgun Gothic" w:cs="Malgun Gothic" w:eastAsia="Malgun Gothic" w:hAnsi="Malgun Gothic"/>
+                <w:b w:val="false"/>
+                <w:bCs w:val="false"/>
+                <w:sz w:val="19"/>
+                <w:szCs w:val="19"/>
+              </w:rPr>
+              <w:t xml:space="preserve">64.1%</w:t>
+            </w:r>
+          </w:p>
+        </w:tc>
+        <w:tc>
+          <w:tcPr>
+            <w:tcW w:type="dxa" w:w="1500"/>
+            <w:tcBorders>
+              <w:top w:val="single" w:color="BBBBBB" w:sz="4"/>
+              <w:left w:val="single" w:color="BBBBBB" w:sz="4"/>
+              <w:bottom w:val="single" w:color="BBBBBB" w:sz="4"/>
+              <w:right w:val="single" w:color="BBBBBB" w:sz="4"/>
+            </w:tcBorders>
+            <w:tcMar>
+              <w:top w:type="dxa" w:w="70"/>
+              <w:left w:type="dxa" w:w="100"/>
+              <w:bottom w:type="dxa" w:w="70"/>
+              <w:right w:type="dxa" w:w="100"/>
+            </w:tcMar>
+          </w:tcPr>
+          <w:p>
+            <w:pPr>
+              <w:spacing w:after="0" w:line="280"/>
+            </w:pPr>
+            <w:r>
+              <w:rPr>
+                <w:rFonts w:ascii="Malgun Gothic" w:cs="Malgun Gothic" w:eastAsia="Malgun Gothic" w:hAnsi="Malgun Gothic"/>
+                <w:b w:val="false"/>
+                <w:bCs w:val="false"/>
+                <w:sz w:val="19"/>
+                <w:szCs w:val="19"/>
+              </w:rPr>
+              <w:t xml:space="preserve">80.0%</w:t>
+            </w:r>
+          </w:p>
+        </w:tc>
+        <w:tc>
+          <w:tcPr>
+            <w:tcW w:type="dxa" w:w="1500"/>
+            <w:tcBorders>
+              <w:top w:val="single" w:color="BBBBBB" w:sz="4"/>
+              <w:left w:val="single" w:color="BBBBBB" w:sz="4"/>
+              <w:bottom w:val="single" w:color="BBBBBB" w:sz="4"/>
+              <w:right w:val="single" w:color="BBBBBB" w:sz="4"/>
+            </w:tcBorders>
+            <w:tcMar>
+              <w:top w:type="dxa" w:w="70"/>
+              <w:left w:type="dxa" w:w="100"/>
+              <w:bottom w:type="dxa" w:w="70"/>
+              <w:right w:type="dxa" w:w="100"/>
+            </w:tcMar>
+          </w:tcPr>
+          <w:p>
+            <w:pPr>
+              <w:spacing w:after="0" w:line="280"/>
+            </w:pPr>
+            <w:r>
+              <w:rPr>
+                <w:rFonts w:ascii="Malgun Gothic" w:cs="Malgun Gothic" w:eastAsia="Malgun Gothic" w:hAnsi="Malgun Gothic"/>
+                <w:b w:val="false"/>
+                <w:bCs w:val="false"/>
+                <w:sz w:val="19"/>
+                <w:szCs w:val="19"/>
+              </w:rPr>
+              <w:t xml:space="preserve">82.8%</w:t>
+            </w:r>
+          </w:p>
+        </w:tc>
+        <w:tc>
+          <w:tcPr>
+            <w:tcW w:type="dxa" w:w="1160"/>
+            <w:tcBorders>
+              <w:top w:val="single" w:color="BBBBBB" w:sz="4"/>
+              <w:left w:val="single" w:color="BBBBBB" w:sz="4"/>
+              <w:bottom w:val="single" w:color="BBBBBB" w:sz="4"/>
+              <w:right w:val="single" w:color="BBBBBB" w:sz="4"/>
+            </w:tcBorders>
+            <w:tcMar>
+              <w:top w:type="dxa" w:w="70"/>
+              <w:left w:type="dxa" w:w="100"/>
+              <w:bottom w:type="dxa" w:w="70"/>
+              <w:right w:type="dxa" w:w="100"/>
+            </w:tcMar>
+          </w:tcPr>
+          <w:p>
+            <w:pPr>
+              <w:spacing w:after="0" w:line="280"/>
+            </w:pPr>
+            <w:r>
+              <w:rPr>
+                <w:rFonts w:ascii="Malgun Gothic" w:cs="Malgun Gothic" w:eastAsia="Malgun Gothic" w:hAnsi="Malgun Gothic"/>
+                <w:b w:val="false"/>
+                <w:bCs w:val="false"/>
+                <w:sz w:val="19"/>
+                <w:szCs w:val="19"/>
+              </w:rPr>
+              <w:t xml:space="preserve">−2.75</w:t>
+            </w:r>
+          </w:p>
+        </w:tc>
+      </w:tr>
+      <w:tr>
+        <w:tc>
+          <w:tcPr>
+            <w:tcW w:type="dxa" w:w="2200"/>
+            <w:tcBorders>
+              <w:top w:val="single" w:color="BBBBBB" w:sz="4"/>
+              <w:left w:val="single" w:color="BBBBBB" w:sz="4"/>
+              <w:bottom w:val="single" w:color="BBBBBB" w:sz="4"/>
+              <w:right w:val="single" w:color="BBBBBB" w:sz="4"/>
+            </w:tcBorders>
+            <w:tcMar>
+              <w:top w:type="dxa" w:w="70"/>
+              <w:left w:type="dxa" w:w="100"/>
+              <w:bottom w:type="dxa" w:w="70"/>
+              <w:right w:type="dxa" w:w="100"/>
+            </w:tcMar>
+          </w:tcPr>
+          <w:p>
+            <w:pPr>
+              <w:spacing w:after="0" w:line="280"/>
+            </w:pPr>
+            <w:r>
+              <w:rPr>
+                <w:rFonts w:ascii="Malgun Gothic" w:cs="Malgun Gothic" w:eastAsia="Malgun Gothic" w:hAnsi="Malgun Gothic"/>
+                <w:b w:val="false"/>
+                <w:bCs w:val="false"/>
+                <w:sz w:val="19"/>
+                <w:szCs w:val="19"/>
+              </w:rPr>
+              <w:t xml:space="preserve">JavaScript</w:t>
+            </w:r>
+          </w:p>
+        </w:tc>
+        <w:tc>
+          <w:tcPr>
+            <w:tcW w:type="dxa" w:w="1500"/>
+            <w:tcBorders>
+              <w:top w:val="single" w:color="BBBBBB" w:sz="4"/>
+              <w:left w:val="single" w:color="BBBBBB" w:sz="4"/>
+              <w:bottom w:val="single" w:color="BBBBBB" w:sz="4"/>
+              <w:right w:val="single" w:color="BBBBBB" w:sz="4"/>
+            </w:tcBorders>
+            <w:tcMar>
+              <w:top w:type="dxa" w:w="70"/>
+              <w:left w:type="dxa" w:w="100"/>
+              <w:bottom w:type="dxa" w:w="70"/>
+              <w:right w:type="dxa" w:w="100"/>
+            </w:tcMar>
+          </w:tcPr>
+          <w:p>
+            <w:pPr>
+              <w:spacing w:after="0" w:line="280"/>
+            </w:pPr>
+            <w:r>
+              <w:rPr>
+                <w:rFonts w:ascii="Malgun Gothic" w:cs="Malgun Gothic" w:eastAsia="Malgun Gothic" w:hAnsi="Malgun Gothic"/>
+                <w:b w:val="false"/>
+                <w:bCs w:val="false"/>
+                <w:sz w:val="19"/>
+                <w:szCs w:val="19"/>
+              </w:rPr>
+              <w:t xml:space="preserve">48.7%</w:t>
+            </w:r>
+          </w:p>
+        </w:tc>
+        <w:tc>
+          <w:tcPr>
+            <w:tcW w:type="dxa" w:w="1500"/>
+            <w:tcBorders>
+              <w:top w:val="single" w:color="BBBBBB" w:sz="4"/>
+              <w:left w:val="single" w:color="BBBBBB" w:sz="4"/>
+              <w:bottom w:val="single" w:color="BBBBBB" w:sz="4"/>
+              <w:right w:val="single" w:color="BBBBBB" w:sz="4"/>
+            </w:tcBorders>
+            <w:tcMar>
+              <w:top w:type="dxa" w:w="70"/>
+              <w:left w:type="dxa" w:w="100"/>
+              <w:bottom w:type="dxa" w:w="70"/>
+              <w:right w:type="dxa" w:w="100"/>
+            </w:tcMar>
+          </w:tcPr>
+          <w:p>
+            <w:pPr>
+              <w:spacing w:after="0" w:line="280"/>
+            </w:pPr>
+            <w:r>
+              <w:rPr>
+                <w:rFonts w:ascii="Malgun Gothic" w:cs="Malgun Gothic" w:eastAsia="Malgun Gothic" w:hAnsi="Malgun Gothic"/>
+                <w:b w:val="false"/>
+                <w:bCs w:val="false"/>
+                <w:sz w:val="19"/>
+                <w:szCs w:val="19"/>
+              </w:rPr>
+              <w:t xml:space="preserve">65.4%</w:t>
+            </w:r>
+          </w:p>
+        </w:tc>
+        <w:tc>
+          <w:tcPr>
+            <w:tcW w:type="dxa" w:w="1500"/>
+            <w:tcBorders>
+              <w:top w:val="single" w:color="BBBBBB" w:sz="4"/>
+              <w:left w:val="single" w:color="BBBBBB" w:sz="4"/>
+              <w:bottom w:val="single" w:color="BBBBBB" w:sz="4"/>
+              <w:right w:val="single" w:color="BBBBBB" w:sz="4"/>
+            </w:tcBorders>
+            <w:tcMar>
+              <w:top w:type="dxa" w:w="70"/>
+              <w:left w:type="dxa" w:w="100"/>
+              <w:bottom w:type="dxa" w:w="70"/>
+              <w:right w:type="dxa" w:w="100"/>
+            </w:tcMar>
+          </w:tcPr>
+          <w:p>
+            <w:pPr>
+              <w:spacing w:after="0" w:line="280"/>
+            </w:pPr>
+            <w:r>
+              <w:rPr>
+                <w:rFonts w:ascii="Malgun Gothic" w:cs="Malgun Gothic" w:eastAsia="Malgun Gothic" w:hAnsi="Malgun Gothic"/>
+                <w:b w:val="false"/>
+                <w:bCs w:val="false"/>
+                <w:sz w:val="19"/>
+                <w:szCs w:val="19"/>
+              </w:rPr>
+              <w:t xml:space="preserve">81.1%</w:t>
+            </w:r>
+          </w:p>
+        </w:tc>
+        <w:tc>
+          <w:tcPr>
+            <w:tcW w:type="dxa" w:w="1500"/>
+            <w:tcBorders>
+              <w:top w:val="single" w:color="BBBBBB" w:sz="4"/>
+              <w:left w:val="single" w:color="BBBBBB" w:sz="4"/>
+              <w:bottom w:val="single" w:color="BBBBBB" w:sz="4"/>
+              <w:right w:val="single" w:color="BBBBBB" w:sz="4"/>
+            </w:tcBorders>
+            <w:tcMar>
+              <w:top w:type="dxa" w:w="70"/>
+              <w:left w:type="dxa" w:w="100"/>
+              <w:bottom w:type="dxa" w:w="70"/>
+              <w:right w:type="dxa" w:w="100"/>
+            </w:tcMar>
+          </w:tcPr>
+          <w:p>
+            <w:pPr>
+              <w:spacing w:after="0" w:line="280"/>
+            </w:pPr>
+            <w:r>
+              <w:rPr>
+                <w:rFonts w:ascii="Malgun Gothic" w:cs="Malgun Gothic" w:eastAsia="Malgun Gothic" w:hAnsi="Malgun Gothic"/>
+                <w:b w:val="false"/>
+                <w:bCs w:val="false"/>
+                <w:sz w:val="19"/>
+                <w:szCs w:val="19"/>
+              </w:rPr>
+              <w:t xml:space="preserve">79.1%</w:t>
+            </w:r>
+          </w:p>
+        </w:tc>
+        <w:tc>
+          <w:tcPr>
+            <w:tcW w:type="dxa" w:w="1160"/>
+            <w:tcBorders>
+              <w:top w:val="single" w:color="BBBBBB" w:sz="4"/>
+              <w:left w:val="single" w:color="BBBBBB" w:sz="4"/>
+              <w:bottom w:val="single" w:color="BBBBBB" w:sz="4"/>
+              <w:right w:val="single" w:color="BBBBBB" w:sz="4"/>
+            </w:tcBorders>
+            <w:tcMar>
+              <w:top w:type="dxa" w:w="70"/>
+              <w:left w:type="dxa" w:w="100"/>
+              <w:bottom w:type="dxa" w:w="70"/>
+              <w:right w:type="dxa" w:w="100"/>
+            </w:tcMar>
+          </w:tcPr>
+          <w:p>
+            <w:pPr>
+              <w:spacing w:after="0" w:line="280"/>
+            </w:pPr>
+            <w:r>
+              <w:rPr>
+                <w:rFonts w:ascii="Malgun Gothic" w:cs="Malgun Gothic" w:eastAsia="Malgun Gothic" w:hAnsi="Malgun Gothic"/>
+                <w:b w:val="false"/>
+                <w:bCs w:val="false"/>
+                <w:sz w:val="19"/>
+                <w:szCs w:val="19"/>
+              </w:rPr>
+              <w:t xml:space="preserve">−3.13</w:t>
+            </w:r>
+          </w:p>
+        </w:tc>
+      </w:tr>
+      <w:tr>
+        <w:tc>
+          <w:tcPr>
+            <w:tcW w:type="dxa" w:w="2200"/>
+            <w:tcBorders>
+              <w:top w:val="single" w:color="BBBBBB" w:sz="4"/>
+              <w:left w:val="single" w:color="BBBBBB" w:sz="4"/>
+              <w:bottom w:val="single" w:color="BBBBBB" w:sz="4"/>
+              <w:right w:val="single" w:color="BBBBBB" w:sz="4"/>
+            </w:tcBorders>
+            <w:tcMar>
+              <w:top w:type="dxa" w:w="70"/>
+              <w:left w:type="dxa" w:w="100"/>
+              <w:bottom w:type="dxa" w:w="70"/>
+              <w:right w:type="dxa" w:w="100"/>
+            </w:tcMar>
+          </w:tcPr>
+          <w:p>
+            <w:pPr>
+              <w:spacing w:after="0" w:line="280"/>
+            </w:pPr>
+            <w:r>
+              <w:rPr>
+                <w:rFonts w:ascii="Malgun Gothic" w:cs="Malgun Gothic" w:eastAsia="Malgun Gothic" w:hAnsi="Malgun Gothic"/>
+                <w:b w:val="false"/>
+                <w:bCs w:val="false"/>
+                <w:sz w:val="19"/>
+                <w:szCs w:val="19"/>
+              </w:rPr>
+              <w:t xml:space="preserve">Java</w:t>
+            </w:r>
+          </w:p>
+        </w:tc>
+        <w:tc>
+          <w:tcPr>
+            <w:tcW w:type="dxa" w:w="1500"/>
+            <w:tcBorders>
+              <w:top w:val="single" w:color="BBBBBB" w:sz="4"/>
+              <w:left w:val="single" w:color="BBBBBB" w:sz="4"/>
+              <w:bottom w:val="single" w:color="BBBBBB" w:sz="4"/>
+              <w:right w:val="single" w:color="BBBBBB" w:sz="4"/>
+            </w:tcBorders>
+            <w:tcMar>
+              <w:top w:type="dxa" w:w="70"/>
+              <w:left w:type="dxa" w:w="100"/>
+              <w:bottom w:type="dxa" w:w="70"/>
+              <w:right w:type="dxa" w:w="100"/>
+            </w:tcMar>
+          </w:tcPr>
+          <w:p>
+            <w:pPr>
+              <w:spacing w:after="0" w:line="280"/>
+            </w:pPr>
+            <w:r>
+              <w:rPr>
+                <w:rFonts w:ascii="Malgun Gothic" w:cs="Malgun Gothic" w:eastAsia="Malgun Gothic" w:hAnsi="Malgun Gothic"/>
+                <w:b w:val="false"/>
+                <w:bCs w:val="false"/>
+                <w:sz w:val="19"/>
+                <w:szCs w:val="19"/>
+              </w:rPr>
+              <w:t xml:space="preserve">44.4%</w:t>
+            </w:r>
+          </w:p>
+        </w:tc>
+        <w:tc>
+          <w:tcPr>
+            <w:tcW w:type="dxa" w:w="1500"/>
+            <w:tcBorders>
+              <w:top w:val="single" w:color="BBBBBB" w:sz="4"/>
+              <w:left w:val="single" w:color="BBBBBB" w:sz="4"/>
+              <w:bottom w:val="single" w:color="BBBBBB" w:sz="4"/>
+              <w:right w:val="single" w:color="BBBBBB" w:sz="4"/>
+            </w:tcBorders>
+            <w:tcMar>
+              <w:top w:type="dxa" w:w="70"/>
+              <w:left w:type="dxa" w:w="100"/>
+              <w:bottom w:type="dxa" w:w="70"/>
+              <w:right w:type="dxa" w:w="100"/>
+            </w:tcMar>
+          </w:tcPr>
+          <w:p>
+            <w:pPr>
+              <w:spacing w:after="0" w:line="280"/>
+            </w:pPr>
+            <w:r>
+              <w:rPr>
+                <w:rFonts w:ascii="Malgun Gothic" w:cs="Malgun Gothic" w:eastAsia="Malgun Gothic" w:hAnsi="Malgun Gothic"/>
+                <w:b w:val="false"/>
+                <w:bCs w:val="false"/>
+                <w:sz w:val="19"/>
+                <w:szCs w:val="19"/>
+              </w:rPr>
+              <w:t xml:space="preserve">62.2%</w:t>
+            </w:r>
+          </w:p>
+        </w:tc>
+        <w:tc>
+          <w:tcPr>
+            <w:tcW w:type="dxa" w:w="1500"/>
+            <w:tcBorders>
+              <w:top w:val="single" w:color="BBBBBB" w:sz="4"/>
+              <w:left w:val="single" w:color="BBBBBB" w:sz="4"/>
+              <w:bottom w:val="single" w:color="BBBBBB" w:sz="4"/>
+              <w:right w:val="single" w:color="BBBBBB" w:sz="4"/>
+            </w:tcBorders>
+            <w:tcMar>
+              <w:top w:type="dxa" w:w="70"/>
+              <w:left w:type="dxa" w:w="100"/>
+              <w:bottom w:type="dxa" w:w="70"/>
+              <w:right w:type="dxa" w:w="100"/>
+            </w:tcMar>
+          </w:tcPr>
+          <w:p>
+            <w:pPr>
+              <w:spacing w:after="0" w:line="280"/>
+            </w:pPr>
+            <w:r>
+              <w:rPr>
+                <w:rFonts w:ascii="Malgun Gothic" w:cs="Malgun Gothic" w:eastAsia="Malgun Gothic" w:hAnsi="Malgun Gothic"/>
+                <w:b w:val="false"/>
+                <w:bCs w:val="false"/>
+                <w:sz w:val="19"/>
+                <w:szCs w:val="19"/>
+              </w:rPr>
+              <w:t xml:space="preserve">79.8%</w:t>
+            </w:r>
+          </w:p>
+        </w:tc>
+        <w:tc>
+          <w:tcPr>
+            <w:tcW w:type="dxa" w:w="1500"/>
+            <w:tcBorders>
+              <w:top w:val="single" w:color="BBBBBB" w:sz="4"/>
+              <w:left w:val="single" w:color="BBBBBB" w:sz="4"/>
+              <w:bottom w:val="single" w:color="BBBBBB" w:sz="4"/>
+              <w:right w:val="single" w:color="BBBBBB" w:sz="4"/>
+            </w:tcBorders>
+            <w:tcMar>
+              <w:top w:type="dxa" w:w="70"/>
+              <w:left w:type="dxa" w:w="100"/>
+              <w:bottom w:type="dxa" w:w="70"/>
+              <w:right w:type="dxa" w:w="100"/>
+            </w:tcMar>
+          </w:tcPr>
+          <w:p>
+            <w:pPr>
+              <w:spacing w:after="0" w:line="280"/>
+            </w:pPr>
+            <w:r>
+              <w:rPr>
+                <w:rFonts w:ascii="Malgun Gothic" w:cs="Malgun Gothic" w:eastAsia="Malgun Gothic" w:hAnsi="Malgun Gothic"/>
+                <w:b w:val="false"/>
+                <w:bCs w:val="false"/>
+                <w:sz w:val="19"/>
+                <w:szCs w:val="19"/>
+              </w:rPr>
+              <w:t xml:space="preserve">68.5%</w:t>
+            </w:r>
+          </w:p>
+        </w:tc>
+        <w:tc>
+          <w:tcPr>
+            <w:tcW w:type="dxa" w:w="1160"/>
+            <w:tcBorders>
+              <w:top w:val="single" w:color="BBBBBB" w:sz="4"/>
+              <w:left w:val="single" w:color="BBBBBB" w:sz="4"/>
+              <w:bottom w:val="single" w:color="BBBBBB" w:sz="4"/>
+              <w:right w:val="single" w:color="BBBBBB" w:sz="4"/>
+            </w:tcBorders>
+            <w:tcMar>
+              <w:top w:type="dxa" w:w="70"/>
+              <w:left w:type="dxa" w:w="100"/>
+              <w:bottom w:type="dxa" w:w="70"/>
+              <w:right w:type="dxa" w:w="100"/>
+            </w:tcMar>
+          </w:tcPr>
+          <w:p>
+            <w:pPr>
+              <w:spacing w:after="0" w:line="280"/>
+            </w:pPr>
+            <w:r>
+              <w:rPr>
+                <w:rFonts w:ascii="Malgun Gothic" w:cs="Malgun Gothic" w:eastAsia="Malgun Gothic" w:hAnsi="Malgun Gothic"/>
+                <w:b w:val="false"/>
+                <w:bCs w:val="false"/>
+                <w:sz w:val="19"/>
+                <w:szCs w:val="19"/>
+              </w:rPr>
+              <w:t xml:space="preserve">−2.43</w:t>
+            </w:r>
+          </w:p>
+        </w:tc>
+      </w:tr>
+      <w:tr>
+        <w:tc>
+          <w:tcPr>
+            <w:tcW w:type="dxa" w:w="2200"/>
+            <w:tcBorders>
+              <w:top w:val="single" w:color="BBBBBB" w:sz="4"/>
+              <w:left w:val="single" w:color="BBBBBB" w:sz="4"/>
+              <w:bottom w:val="single" w:color="BBBBBB" w:sz="4"/>
+              <w:right w:val="single" w:color="BBBBBB" w:sz="4"/>
+            </w:tcBorders>
+            <w:tcMar>
+              <w:top w:type="dxa" w:w="70"/>
+              <w:left w:type="dxa" w:w="100"/>
+              <w:bottom w:type="dxa" w:w="70"/>
+              <w:right w:type="dxa" w:w="100"/>
+            </w:tcMar>
+          </w:tcPr>
+          <w:p>
+            <w:pPr>
+              <w:spacing w:after="0" w:line="280"/>
+            </w:pPr>
+            <w:r>
+              <w:rPr>
+                <w:rFonts w:ascii="Malgun Gothic" w:cs="Malgun Gothic" w:eastAsia="Malgun Gothic" w:hAnsi="Malgun Gothic"/>
+                <w:b w:val="false"/>
+                <w:bCs w:val="false"/>
+                <w:sz w:val="19"/>
+                <w:szCs w:val="19"/>
+              </w:rPr>
+              <w:t xml:space="preserve">C++</w:t>
+            </w:r>
+          </w:p>
+        </w:tc>
+        <w:tc>
+          <w:tcPr>
+            <w:tcW w:type="dxa" w:w="1500"/>
+            <w:tcBorders>
+              <w:top w:val="single" w:color="BBBBBB" w:sz="4"/>
+              <w:left w:val="single" w:color="BBBBBB" w:sz="4"/>
+              <w:bottom w:val="single" w:color="BBBBBB" w:sz="4"/>
+              <w:right w:val="single" w:color="BBBBBB" w:sz="4"/>
+            </w:tcBorders>
+            <w:tcMar>
+              <w:top w:type="dxa" w:w="70"/>
+              <w:left w:type="dxa" w:w="100"/>
+              <w:bottom w:type="dxa" w:w="70"/>
+              <w:right w:type="dxa" w:w="100"/>
+            </w:tcMar>
+          </w:tcPr>
+          <w:p>
+            <w:pPr>
+              <w:spacing w:after="0" w:line="280"/>
+            </w:pPr>
+            <w:r>
+              <w:rPr>
+                <w:rFonts w:ascii="Malgun Gothic" w:cs="Malgun Gothic" w:eastAsia="Malgun Gothic" w:hAnsi="Malgun Gothic"/>
+                <w:b w:val="false"/>
+                <w:bCs w:val="false"/>
+                <w:sz w:val="19"/>
+                <w:szCs w:val="19"/>
+              </w:rPr>
+              <w:t xml:space="preserve">43.1%</w:t>
+            </w:r>
+          </w:p>
+        </w:tc>
+        <w:tc>
+          <w:tcPr>
+            <w:tcW w:type="dxa" w:w="1500"/>
+            <w:tcBorders>
+              <w:top w:val="single" w:color="BBBBBB" w:sz="4"/>
+              <w:left w:val="single" w:color="BBBBBB" w:sz="4"/>
+              <w:bottom w:val="single" w:color="BBBBBB" w:sz="4"/>
+              <w:right w:val="single" w:color="BBBBBB" w:sz="4"/>
+            </w:tcBorders>
+            <w:tcMar>
+              <w:top w:type="dxa" w:w="70"/>
+              <w:left w:type="dxa" w:w="100"/>
+              <w:bottom w:type="dxa" w:w="70"/>
+              <w:right w:type="dxa" w:w="100"/>
+            </w:tcMar>
+          </w:tcPr>
+          <w:p>
+            <w:pPr>
+              <w:spacing w:after="0" w:line="280"/>
+            </w:pPr>
+            <w:r>
+              <w:rPr>
+                <w:rFonts w:ascii="Malgun Gothic" w:cs="Malgun Gothic" w:eastAsia="Malgun Gothic" w:hAnsi="Malgun Gothic"/>
+                <w:b w:val="false"/>
+                <w:bCs w:val="false"/>
+                <w:sz w:val="19"/>
+                <w:szCs w:val="19"/>
+              </w:rPr>
+              <w:t xml:space="preserve">56.9%</w:t>
+            </w:r>
+          </w:p>
+        </w:tc>
+        <w:tc>
+          <w:tcPr>
+            <w:tcW w:type="dxa" w:w="1500"/>
+            <w:tcBorders>
+              <w:top w:val="single" w:color="BBBBBB" w:sz="4"/>
+              <w:left w:val="single" w:color="BBBBBB" w:sz="4"/>
+              <w:bottom w:val="single" w:color="BBBBBB" w:sz="4"/>
+              <w:right w:val="single" w:color="BBBBBB" w:sz="4"/>
+            </w:tcBorders>
+            <w:tcMar>
+              <w:top w:type="dxa" w:w="70"/>
+              <w:left w:type="dxa" w:w="100"/>
+              <w:bottom w:type="dxa" w:w="70"/>
+              <w:right w:type="dxa" w:w="100"/>
+            </w:tcMar>
+          </w:tcPr>
+          <w:p>
+            <w:pPr>
+              <w:spacing w:after="0" w:line="280"/>
+            </w:pPr>
+            <w:r>
+              <w:rPr>
+                <w:rFonts w:ascii="Malgun Gothic" w:cs="Malgun Gothic" w:eastAsia="Malgun Gothic" w:hAnsi="Malgun Gothic"/>
+                <w:b w:val="false"/>
+                <w:bCs w:val="false"/>
+                <w:sz w:val="19"/>
+                <w:szCs w:val="19"/>
+              </w:rPr>
+              <w:t xml:space="preserve">73.0%</w:t>
+            </w:r>
+          </w:p>
+        </w:tc>
+        <w:tc>
+          <w:tcPr>
+            <w:tcW w:type="dxa" w:w="1500"/>
+            <w:tcBorders>
+              <w:top w:val="single" w:color="BBBBBB" w:sz="4"/>
+              <w:left w:val="single" w:color="BBBBBB" w:sz="4"/>
+              <w:bottom w:val="single" w:color="BBBBBB" w:sz="4"/>
+              <w:right w:val="single" w:color="BBBBBB" w:sz="4"/>
+            </w:tcBorders>
+            <w:tcMar>
+              <w:top w:type="dxa" w:w="70"/>
+              <w:left w:type="dxa" w:w="100"/>
+              <w:bottom w:type="dxa" w:w="70"/>
+              <w:right w:type="dxa" w:w="100"/>
+            </w:tcMar>
+          </w:tcPr>
+          <w:p>
+            <w:pPr>
+              <w:spacing w:after="0" w:line="280"/>
+            </w:pPr>
+            <w:r>
+              <w:rPr>
+                <w:rFonts w:ascii="Malgun Gothic" w:cs="Malgun Gothic" w:eastAsia="Malgun Gothic" w:hAnsi="Malgun Gothic"/>
+                <w:b w:val="false"/>
+                <w:bCs w:val="false"/>
+                <w:sz w:val="19"/>
+                <w:szCs w:val="19"/>
+              </w:rPr>
+              <w:t xml:space="preserve">61.3%</w:t>
+            </w:r>
+          </w:p>
+        </w:tc>
+        <w:tc>
+          <w:tcPr>
+            <w:tcW w:type="dxa" w:w="1160"/>
+            <w:tcBorders>
+              <w:top w:val="single" w:color="BBBBBB" w:sz="4"/>
+              <w:left w:val="single" w:color="BBBBBB" w:sz="4"/>
+              <w:bottom w:val="single" w:color="BBBBBB" w:sz="4"/>
+              <w:right w:val="single" w:color="BBBBBB" w:sz="4"/>
+            </w:tcBorders>
+            <w:tcMar>
+              <w:top w:type="dxa" w:w="70"/>
+              <w:left w:type="dxa" w:w="100"/>
+              <w:bottom w:type="dxa" w:w="70"/>
+              <w:right w:type="dxa" w:w="100"/>
+            </w:tcMar>
+          </w:tcPr>
+          <w:p>
+            <w:pPr>
+              <w:spacing w:after="0" w:line="280"/>
+            </w:pPr>
+            <w:r>
+              <w:rPr>
+                <w:rFonts w:ascii="Malgun Gothic" w:cs="Malgun Gothic" w:eastAsia="Malgun Gothic" w:hAnsi="Malgun Gothic"/>
+                <w:b w:val="false"/>
+                <w:bCs w:val="false"/>
+                <w:sz w:val="19"/>
+                <w:szCs w:val="19"/>
+              </w:rPr>
+              <w:t xml:space="preserve">−2.00</w:t>
+            </w:r>
+          </w:p>
+        </w:tc>
+      </w:tr>
+      <w:tr>
+        <w:tc>
+          <w:tcPr>
+            <w:tcW w:type="dxa" w:w="2200"/>
+            <w:tcBorders>
+              <w:top w:val="single" w:color="BBBBBB" w:sz="4"/>
+              <w:left w:val="single" w:color="BBBBBB" w:sz="4"/>
+              <w:bottom w:val="single" w:color="BBBBBB" w:sz="4"/>
+              <w:right w:val="single" w:color="BBBBBB" w:sz="4"/>
+            </w:tcBorders>
+            <w:tcMar>
+              <w:top w:type="dxa" w:w="70"/>
+              <w:left w:type="dxa" w:w="100"/>
+              <w:bottom w:type="dxa" w:w="70"/>
+              <w:right w:type="dxa" w:w="100"/>
+            </w:tcMar>
+          </w:tcPr>
+          <w:p>
+            <w:pPr>
+              <w:spacing w:after="0" w:line="280"/>
+            </w:pPr>
+            <w:r>
+              <w:rPr>
+                <w:rFonts w:ascii="Malgun Gothic" w:cs="Malgun Gothic" w:eastAsia="Malgun Gothic" w:hAnsi="Malgun Gothic"/>
+                <w:b w:val="false"/>
+                <w:bCs w:val="false"/>
+                <w:sz w:val="19"/>
+                <w:szCs w:val="19"/>
+              </w:rPr>
+              <w:t xml:space="preserve">SQL</w:t>
+            </w:r>
+          </w:p>
+        </w:tc>
+        <w:tc>
+          <w:tcPr>
+            <w:tcW w:type="dxa" w:w="1500"/>
+            <w:tcBorders>
+              <w:top w:val="single" w:color="BBBBBB" w:sz="4"/>
+              <w:left w:val="single" w:color="BBBBBB" w:sz="4"/>
+              <w:bottom w:val="single" w:color="BBBBBB" w:sz="4"/>
+              <w:right w:val="single" w:color="BBBBBB" w:sz="4"/>
+            </w:tcBorders>
+            <w:tcMar>
+              <w:top w:type="dxa" w:w="70"/>
+              <w:left w:type="dxa" w:w="100"/>
+              <w:bottom w:type="dxa" w:w="70"/>
+              <w:right w:type="dxa" w:w="100"/>
+            </w:tcMar>
+          </w:tcPr>
+          <w:p>
+            <w:pPr>
+              <w:spacing w:after="0" w:line="280"/>
+            </w:pPr>
+            <w:r>
+              <w:rPr>
+                <w:rFonts w:ascii="Malgun Gothic" w:cs="Malgun Gothic" w:eastAsia="Malgun Gothic" w:hAnsi="Malgun Gothic"/>
+                <w:b w:val="false"/>
+                <w:bCs w:val="false"/>
+                <w:sz w:val="19"/>
+                <w:szCs w:val="19"/>
+              </w:rPr>
+              <w:t xml:space="preserve">45.6%</w:t>
+            </w:r>
+          </w:p>
+        </w:tc>
+        <w:tc>
+          <w:tcPr>
+            <w:tcW w:type="dxa" w:w="1500"/>
+            <w:tcBorders>
+              <w:top w:val="single" w:color="BBBBBB" w:sz="4"/>
+              <w:left w:val="single" w:color="BBBBBB" w:sz="4"/>
+              <w:bottom w:val="single" w:color="BBBBBB" w:sz="4"/>
+              <w:right w:val="single" w:color="BBBBBB" w:sz="4"/>
+            </w:tcBorders>
+            <w:tcMar>
+              <w:top w:type="dxa" w:w="70"/>
+              <w:left w:type="dxa" w:w="100"/>
+              <w:bottom w:type="dxa" w:w="70"/>
+              <w:right w:type="dxa" w:w="100"/>
+            </w:tcMar>
+          </w:tcPr>
+          <w:p>
+            <w:pPr>
+              <w:spacing w:after="0" w:line="280"/>
+            </w:pPr>
+            <w:r>
+              <w:rPr>
+                <w:rFonts w:ascii="Malgun Gothic" w:cs="Malgun Gothic" w:eastAsia="Malgun Gothic" w:hAnsi="Malgun Gothic"/>
+                <w:b w:val="false"/>
+                <w:bCs w:val="false"/>
+                <w:sz w:val="19"/>
+                <w:szCs w:val="19"/>
+              </w:rPr>
+              <w:t xml:space="preserve">63.5%</w:t>
+            </w:r>
+          </w:p>
+        </w:tc>
+        <w:tc>
+          <w:tcPr>
+            <w:tcW w:type="dxa" w:w="1500"/>
+            <w:tcBorders>
+              <w:top w:val="single" w:color="BBBBBB" w:sz="4"/>
+              <w:left w:val="single" w:color="BBBBBB" w:sz="4"/>
+              <w:bottom w:val="single" w:color="BBBBBB" w:sz="4"/>
+              <w:right w:val="single" w:color="BBBBBB" w:sz="4"/>
+            </w:tcBorders>
+            <w:tcMar>
+              <w:top w:type="dxa" w:w="70"/>
+              <w:left w:type="dxa" w:w="100"/>
+              <w:bottom w:type="dxa" w:w="70"/>
+              <w:right w:type="dxa" w:w="100"/>
+            </w:tcMar>
+          </w:tcPr>
+          <w:p>
+            <w:pPr>
+              <w:spacing w:after="0" w:line="280"/>
+            </w:pPr>
+            <w:r>
+              <w:rPr>
+                <w:rFonts w:ascii="Malgun Gothic" w:cs="Malgun Gothic" w:eastAsia="Malgun Gothic" w:hAnsi="Malgun Gothic"/>
+                <w:b w:val="false"/>
+                <w:bCs w:val="false"/>
+                <w:sz w:val="19"/>
+                <w:szCs w:val="19"/>
+              </w:rPr>
+              <w:t xml:space="preserve">80.3%</w:t>
+            </w:r>
+          </w:p>
+        </w:tc>
+        <w:tc>
+          <w:tcPr>
+            <w:tcW w:type="dxa" w:w="1500"/>
+            <w:tcBorders>
+              <w:top w:val="single" w:color="BBBBBB" w:sz="4"/>
+              <w:left w:val="single" w:color="BBBBBB" w:sz="4"/>
+              <w:bottom w:val="single" w:color="BBBBBB" w:sz="4"/>
+              <w:right w:val="single" w:color="BBBBBB" w:sz="4"/>
+            </w:tcBorders>
+            <w:tcMar>
+              <w:top w:type="dxa" w:w="70"/>
+              <w:left w:type="dxa" w:w="100"/>
+              <w:bottom w:type="dxa" w:w="70"/>
+              <w:right w:type="dxa" w:w="100"/>
+            </w:tcMar>
+          </w:tcPr>
+          <w:p>
+            <w:pPr>
+              <w:spacing w:after="0" w:line="280"/>
+            </w:pPr>
+            <w:r>
+              <w:rPr>
+                <w:rFonts w:ascii="Malgun Gothic" w:cs="Malgun Gothic" w:eastAsia="Malgun Gothic" w:hAnsi="Malgun Gothic"/>
+                <w:b w:val="false"/>
+                <w:bCs w:val="false"/>
+                <w:sz w:val="19"/>
+                <w:szCs w:val="19"/>
+              </w:rPr>
+              <w:t xml:space="preserve">66.7%</w:t>
+            </w:r>
+          </w:p>
+        </w:tc>
+        <w:tc>
+          <w:tcPr>
+            <w:tcW w:type="dxa" w:w="1160"/>
+            <w:tcBorders>
+              <w:top w:val="single" w:color="BBBBBB" w:sz="4"/>
+              <w:left w:val="single" w:color="BBBBBB" w:sz="4"/>
+              <w:bottom w:val="single" w:color="BBBBBB" w:sz="4"/>
+              <w:right w:val="single" w:color="BBBBBB" w:sz="4"/>
+            </w:tcBorders>
+            <w:tcMar>
+              <w:top w:type="dxa" w:w="70"/>
+              <w:left w:type="dxa" w:w="100"/>
+              <w:bottom w:type="dxa" w:w="70"/>
+              <w:right w:type="dxa" w:w="100"/>
+            </w:tcMar>
+          </w:tcPr>
+          <w:p>
+            <w:pPr>
+              <w:spacing w:after="0" w:line="280"/>
+            </w:pPr>
+            <w:r>
+              <w:rPr>
+                <w:rFonts w:ascii="Malgun Gothic" w:cs="Malgun Gothic" w:eastAsia="Malgun Gothic" w:hAnsi="Malgun Gothic"/>
+                <w:b w:val="false"/>
+                <w:bCs w:val="false"/>
+                <w:sz w:val="19"/>
+                <w:szCs w:val="19"/>
+              </w:rPr>
+              <w:t xml:space="preserve">−2.89</w:t>
+            </w:r>
+          </w:p>
+        </w:tc>
+      </w:tr>
+      <w:tr>
+        <w:tc>
+          <w:tcPr>
+            <w:tcW w:type="dxa" w:w="2200"/>
+            <w:tcBorders>
+              <w:top w:val="single" w:color="BBBBBB" w:sz="4"/>
+              <w:left w:val="single" w:color="BBBBBB" w:sz="4"/>
+              <w:bottom w:val="single" w:color="BBBBBB" w:sz="4"/>
+              <w:right w:val="single" w:color="BBBBBB" w:sz="4"/>
+            </w:tcBorders>
+            <w:tcMar>
+              <w:top w:type="dxa" w:w="70"/>
+              <w:left w:type="dxa" w:w="100"/>
+              <w:bottom w:type="dxa" w:w="70"/>
+              <w:right w:type="dxa" w:w="100"/>
+            </w:tcMar>
+          </w:tcPr>
+          <w:p>
+            <w:pPr>
+              <w:spacing w:after="0" w:line="280"/>
+            </w:pPr>
+            <w:r>
+              <w:rPr>
+                <w:rFonts w:ascii="Malgun Gothic" w:cs="Malgun Gothic" w:eastAsia="Malgun Gothic" w:hAnsi="Malgun Gothic"/>
+                <w:b w:val="false"/>
+                <w:bCs w:val="false"/>
+                <w:sz w:val="19"/>
+                <w:szCs w:val="19"/>
+              </w:rPr>
+              <w:t xml:space="preserve">PHP</w:t>
+            </w:r>
+          </w:p>
+        </w:tc>
+        <w:tc>
+          <w:tcPr>
+            <w:tcW w:type="dxa" w:w="1500"/>
+            <w:tcBorders>
+              <w:top w:val="single" w:color="BBBBBB" w:sz="4"/>
+              <w:left w:val="single" w:color="BBBBBB" w:sz="4"/>
+              <w:bottom w:val="single" w:color="BBBBBB" w:sz="4"/>
+              <w:right w:val="single" w:color="BBBBBB" w:sz="4"/>
+            </w:tcBorders>
+            <w:tcMar>
+              <w:top w:type="dxa" w:w="70"/>
+              <w:left w:type="dxa" w:w="100"/>
+              <w:bottom w:type="dxa" w:w="70"/>
+              <w:right w:type="dxa" w:w="100"/>
+            </w:tcMar>
+          </w:tcPr>
+          <w:p>
+            <w:pPr>
+              <w:spacing w:after="0" w:line="280"/>
+            </w:pPr>
+            <w:r>
+              <w:rPr>
+                <w:rFonts w:ascii="Malgun Gothic" w:cs="Malgun Gothic" w:eastAsia="Malgun Gothic" w:hAnsi="Malgun Gothic"/>
+                <w:b w:val="false"/>
+                <w:bCs w:val="false"/>
+                <w:sz w:val="19"/>
+                <w:szCs w:val="19"/>
+              </w:rPr>
+              <w:t xml:space="preserve">47.6%</w:t>
+            </w:r>
+          </w:p>
+        </w:tc>
+        <w:tc>
+          <w:tcPr>
+            <w:tcW w:type="dxa" w:w="1500"/>
+            <w:tcBorders>
+              <w:top w:val="single" w:color="BBBBBB" w:sz="4"/>
+              <w:left w:val="single" w:color="BBBBBB" w:sz="4"/>
+              <w:bottom w:val="single" w:color="BBBBBB" w:sz="4"/>
+              <w:right w:val="single" w:color="BBBBBB" w:sz="4"/>
+            </w:tcBorders>
+            <w:tcMar>
+              <w:top w:type="dxa" w:w="70"/>
+              <w:left w:type="dxa" w:w="100"/>
+              <w:bottom w:type="dxa" w:w="70"/>
+              <w:right w:type="dxa" w:w="100"/>
+            </w:tcMar>
+          </w:tcPr>
+          <w:p>
+            <w:pPr>
+              <w:spacing w:after="0" w:line="280"/>
+            </w:pPr>
+            <w:r>
+              <w:rPr>
+                <w:rFonts w:ascii="Malgun Gothic" w:cs="Malgun Gothic" w:eastAsia="Malgun Gothic" w:hAnsi="Malgun Gothic"/>
+                <w:b w:val="false"/>
+                <w:bCs w:val="false"/>
+                <w:sz w:val="19"/>
+                <w:szCs w:val="19"/>
+              </w:rPr>
+              <w:t xml:space="preserve">64.5%</w:t>
+            </w:r>
+          </w:p>
+        </w:tc>
+        <w:tc>
+          <w:tcPr>
+            <w:tcW w:type="dxa" w:w="1500"/>
+            <w:tcBorders>
+              <w:top w:val="single" w:color="BBBBBB" w:sz="4"/>
+              <w:left w:val="single" w:color="BBBBBB" w:sz="4"/>
+              <w:bottom w:val="single" w:color="BBBBBB" w:sz="4"/>
+              <w:right w:val="single" w:color="BBBBBB" w:sz="4"/>
+            </w:tcBorders>
+            <w:tcMar>
+              <w:top w:type="dxa" w:w="70"/>
+              <w:left w:type="dxa" w:w="100"/>
+              <w:bottom w:type="dxa" w:w="70"/>
+              <w:right w:type="dxa" w:w="100"/>
+            </w:tcMar>
+          </w:tcPr>
+          <w:p>
+            <w:pPr>
+              <w:spacing w:after="0" w:line="280"/>
+            </w:pPr>
+            <w:r>
+              <w:rPr>
+                <w:rFonts w:ascii="Malgun Gothic" w:cs="Malgun Gothic" w:eastAsia="Malgun Gothic" w:hAnsi="Malgun Gothic"/>
+                <w:b w:val="false"/>
+                <w:bCs w:val="false"/>
+                <w:sz w:val="19"/>
+                <w:szCs w:val="19"/>
+              </w:rPr>
+              <w:t xml:space="preserve">79.4%</w:t>
+            </w:r>
+          </w:p>
+        </w:tc>
+        <w:tc>
+          <w:tcPr>
+            <w:tcW w:type="dxa" w:w="1500"/>
+            <w:tcBorders>
+              <w:top w:val="single" w:color="BBBBBB" w:sz="4"/>
+              <w:left w:val="single" w:color="BBBBBB" w:sz="4"/>
+              <w:bottom w:val="single" w:color="BBBBBB" w:sz="4"/>
+              <w:right w:val="single" w:color="BBBBBB" w:sz="4"/>
+            </w:tcBorders>
+            <w:tcMar>
+              <w:top w:type="dxa" w:w="70"/>
+              <w:left w:type="dxa" w:w="100"/>
+              <w:bottom w:type="dxa" w:w="70"/>
+              <w:right w:type="dxa" w:w="100"/>
+            </w:tcMar>
+          </w:tcPr>
+          <w:p>
+            <w:pPr>
+              <w:spacing w:after="0" w:line="280"/>
+            </w:pPr>
+            <w:r>
+              <w:rPr>
+                <w:rFonts w:ascii="Malgun Gothic" w:cs="Malgun Gothic" w:eastAsia="Malgun Gothic" w:hAnsi="Malgun Gothic"/>
+                <w:b w:val="false"/>
+                <w:bCs w:val="false"/>
+                <w:sz w:val="19"/>
+                <w:szCs w:val="19"/>
+              </w:rPr>
+              <w:t xml:space="preserve">68.7%</w:t>
+            </w:r>
+          </w:p>
+        </w:tc>
+        <w:tc>
+          <w:tcPr>
+            <w:tcW w:type="dxa" w:w="1160"/>
+            <w:tcBorders>
+              <w:top w:val="single" w:color="BBBBBB" w:sz="4"/>
+              <w:left w:val="single" w:color="BBBBBB" w:sz="4"/>
+              <w:bottom w:val="single" w:color="BBBBBB" w:sz="4"/>
+              <w:right w:val="single" w:color="BBBBBB" w:sz="4"/>
+            </w:tcBorders>
+            <w:tcMar>
+              <w:top w:type="dxa" w:w="70"/>
+              <w:left w:type="dxa" w:w="100"/>
+              <w:bottom w:type="dxa" w:w="70"/>
+              <w:right w:type="dxa" w:w="100"/>
+            </w:tcMar>
+          </w:tcPr>
+          <w:p>
+            <w:pPr>
+              <w:spacing w:after="0" w:line="280"/>
+            </w:pPr>
+            <w:r>
+              <w:rPr>
+                <w:rFonts w:ascii="Malgun Gothic" w:cs="Malgun Gothic" w:eastAsia="Malgun Gothic" w:hAnsi="Malgun Gothic"/>
+                <w:b w:val="false"/>
+                <w:bCs w:val="false"/>
+                <w:sz w:val="19"/>
+                <w:szCs w:val="19"/>
+              </w:rPr>
+              <w:t xml:space="preserve">−2.75</w:t>
+            </w:r>
+          </w:p>
+        </w:tc>
+      </w:tr>
+      <w:tr>
+        <w:tc>
+          <w:tcPr>
+            <w:tcW w:type="dxa" w:w="2200"/>
+            <w:tcBorders>
+              <w:top w:val="single" w:color="BBBBBB" w:sz="4"/>
+              <w:left w:val="single" w:color="BBBBBB" w:sz="4"/>
+              <w:bottom w:val="single" w:color="BBBBBB" w:sz="4"/>
+              <w:right w:val="single" w:color="BBBBBB" w:sz="4"/>
+            </w:tcBorders>
+            <w:tcMar>
+              <w:top w:type="dxa" w:w="70"/>
+              <w:left w:type="dxa" w:w="100"/>
+              <w:bottom w:type="dxa" w:w="70"/>
+              <w:right w:type="dxa" w:w="100"/>
+            </w:tcMar>
+          </w:tcPr>
+          <w:p>
+            <w:pPr>
+              <w:spacing w:after="0" w:line="280"/>
+            </w:pPr>
+            <w:r>
+              <w:rPr>
+                <w:rFonts w:ascii="Malgun Gothic" w:cs="Malgun Gothic" w:eastAsia="Malgun Gothic" w:hAnsi="Malgun Gothic"/>
+                <w:b w:val="false"/>
+                <w:bCs w:val="false"/>
+                <w:sz w:val="19"/>
+                <w:szCs w:val="19"/>
+              </w:rPr>
+              <w:t xml:space="preserve">C#</w:t>
+            </w:r>
+          </w:p>
+        </w:tc>
+        <w:tc>
+          <w:tcPr>
+            <w:tcW w:type="dxa" w:w="1500"/>
+            <w:tcBorders>
+              <w:top w:val="single" w:color="BBBBBB" w:sz="4"/>
+              <w:left w:val="single" w:color="BBBBBB" w:sz="4"/>
+              <w:bottom w:val="single" w:color="BBBBBB" w:sz="4"/>
+              <w:right w:val="single" w:color="BBBBBB" w:sz="4"/>
+            </w:tcBorders>
+            <w:tcMar>
+              <w:top w:type="dxa" w:w="70"/>
+              <w:left w:type="dxa" w:w="100"/>
+              <w:bottom w:type="dxa" w:w="70"/>
+              <w:right w:type="dxa" w:w="100"/>
+            </w:tcMar>
+          </w:tcPr>
+          <w:p>
+            <w:pPr>
+              <w:spacing w:after="0" w:line="280"/>
+            </w:pPr>
+            <w:r>
+              <w:rPr>
+                <w:rFonts w:ascii="Malgun Gothic" w:cs="Malgun Gothic" w:eastAsia="Malgun Gothic" w:hAnsi="Malgun Gothic"/>
+                <w:b w:val="false"/>
+                <w:bCs w:val="false"/>
+                <w:sz w:val="19"/>
+                <w:szCs w:val="19"/>
+              </w:rPr>
+              <w:t xml:space="preserve">44.7%</w:t>
+            </w:r>
+          </w:p>
+        </w:tc>
+        <w:tc>
+          <w:tcPr>
+            <w:tcW w:type="dxa" w:w="1500"/>
+            <w:tcBorders>
+              <w:top w:val="single" w:color="BBBBBB" w:sz="4"/>
+              <w:left w:val="single" w:color="BBBBBB" w:sz="4"/>
+              <w:bottom w:val="single" w:color="BBBBBB" w:sz="4"/>
+              <w:right w:val="single" w:color="BBBBBB" w:sz="4"/>
+            </w:tcBorders>
+            <w:tcMar>
+              <w:top w:type="dxa" w:w="70"/>
+              <w:left w:type="dxa" w:w="100"/>
+              <w:bottom w:type="dxa" w:w="70"/>
+              <w:right w:type="dxa" w:w="100"/>
+            </w:tcMar>
+          </w:tcPr>
+          <w:p>
+            <w:pPr>
+              <w:spacing w:after="0" w:line="280"/>
+            </w:pPr>
+            <w:r>
+              <w:rPr>
+                <w:rFonts w:ascii="Malgun Gothic" w:cs="Malgun Gothic" w:eastAsia="Malgun Gothic" w:hAnsi="Malgun Gothic"/>
+                <w:b w:val="false"/>
+                <w:bCs w:val="false"/>
+                <w:sz w:val="19"/>
+                <w:szCs w:val="19"/>
+              </w:rPr>
+              <w:t xml:space="preserve">61.7%</w:t>
+            </w:r>
+          </w:p>
+        </w:tc>
+        <w:tc>
+          <w:tcPr>
+            <w:tcW w:type="dxa" w:w="1500"/>
+            <w:tcBorders>
+              <w:top w:val="single" w:color="BBBBBB" w:sz="4"/>
+              <w:left w:val="single" w:color="BBBBBB" w:sz="4"/>
+              <w:bottom w:val="single" w:color="BBBBBB" w:sz="4"/>
+              <w:right w:val="single" w:color="BBBBBB" w:sz="4"/>
+            </w:tcBorders>
+            <w:tcMar>
+              <w:top w:type="dxa" w:w="70"/>
+              <w:left w:type="dxa" w:w="100"/>
+              <w:bottom w:type="dxa" w:w="70"/>
+              <w:right w:type="dxa" w:w="100"/>
+            </w:tcMar>
+          </w:tcPr>
+          <w:p>
+            <w:pPr>
+              <w:spacing w:after="0" w:line="280"/>
+            </w:pPr>
+            <w:r>
+              <w:rPr>
+                <w:rFonts w:ascii="Malgun Gothic" w:cs="Malgun Gothic" w:eastAsia="Malgun Gothic" w:hAnsi="Malgun Gothic"/>
+                <w:b w:val="false"/>
+                <w:bCs w:val="false"/>
+                <w:sz w:val="19"/>
+                <w:szCs w:val="19"/>
+              </w:rPr>
+              <w:t xml:space="preserve">79.5%</w:t>
+            </w:r>
+          </w:p>
+        </w:tc>
+        <w:tc>
+          <w:tcPr>
+            <w:tcW w:type="dxa" w:w="1500"/>
+            <w:tcBorders>
+              <w:top w:val="single" w:color="BBBBBB" w:sz="4"/>
+              <w:left w:val="single" w:color="BBBBBB" w:sz="4"/>
+              <w:bottom w:val="single" w:color="BBBBBB" w:sz="4"/>
+              <w:right w:val="single" w:color="BBBBBB" w:sz="4"/>
+            </w:tcBorders>
+            <w:tcMar>
+              <w:top w:type="dxa" w:w="70"/>
+              <w:left w:type="dxa" w:w="100"/>
+              <w:bottom w:type="dxa" w:w="70"/>
+              <w:right w:type="dxa" w:w="100"/>
+            </w:tcMar>
+          </w:tcPr>
+          <w:p>
+            <w:pPr>
+              <w:spacing w:after="0" w:line="280"/>
+            </w:pPr>
+            <w:r>
+              <w:rPr>
+                <w:rFonts w:ascii="Malgun Gothic" w:cs="Malgun Gothic" w:eastAsia="Malgun Gothic" w:hAnsi="Malgun Gothic"/>
+                <w:b w:val="false"/>
+                <w:bCs w:val="false"/>
+                <w:sz w:val="19"/>
+                <w:szCs w:val="19"/>
+              </w:rPr>
+              <w:t xml:space="preserve">77.2%</w:t>
+            </w:r>
+          </w:p>
+        </w:tc>
+        <w:tc>
+          <w:tcPr>
+            <w:tcW w:type="dxa" w:w="1160"/>
+            <w:tcBorders>
+              <w:top w:val="single" w:color="BBBBBB" w:sz="4"/>
+              <w:left w:val="single" w:color="BBBBBB" w:sz="4"/>
+              <w:bottom w:val="single" w:color="BBBBBB" w:sz="4"/>
+              <w:right w:val="single" w:color="BBBBBB" w:sz="4"/>
+            </w:tcBorders>
+            <w:tcMar>
+              <w:top w:type="dxa" w:w="70"/>
+              <w:left w:type="dxa" w:w="100"/>
+              <w:bottom w:type="dxa" w:w="70"/>
+              <w:right w:type="dxa" w:w="100"/>
+            </w:tcMar>
+          </w:tcPr>
+          <w:p>
+            <w:pPr>
+              <w:spacing w:after="0" w:line="280"/>
+            </w:pPr>
+            <w:r>
+              <w:rPr>
+                <w:rFonts w:ascii="Malgun Gothic" w:cs="Malgun Gothic" w:eastAsia="Malgun Gothic" w:hAnsi="Malgun Gothic"/>
+                <w:b w:val="false"/>
+                <w:bCs w:val="false"/>
+                <w:sz w:val="19"/>
+                <w:szCs w:val="19"/>
+              </w:rPr>
+              <w:t xml:space="preserve">−2.28</w:t>
+            </w:r>
+          </w:p>
+        </w:tc>
+      </w:tr>
+      <w:tr>
+        <w:tc>
+          <w:tcPr>
+            <w:tcW w:type="dxa" w:w="2200"/>
+            <w:tcBorders>
+              <w:top w:val="single" w:color="BBBBBB" w:sz="4"/>
+              <w:left w:val="single" w:color="BBBBBB" w:sz="4"/>
+              <w:bottom w:val="single" w:color="BBBBBB" w:sz="4"/>
+              <w:right w:val="single" w:color="BBBBBB" w:sz="4"/>
+            </w:tcBorders>
+            <w:tcMar>
+              <w:top w:type="dxa" w:w="70"/>
+              <w:left w:type="dxa" w:w="100"/>
+              <w:bottom w:type="dxa" w:w="70"/>
+              <w:right w:type="dxa" w:w="100"/>
+            </w:tcMar>
+          </w:tcPr>
+          <w:p>
+            <w:pPr>
+              <w:spacing w:after="0" w:line="280"/>
+            </w:pPr>
+            <w:r>
+              <w:rPr>
+                <w:rFonts w:ascii="Malgun Gothic" w:cs="Malgun Gothic" w:eastAsia="Malgun Gothic" w:hAnsi="Malgun Gothic"/>
+                <w:b w:val="false"/>
+                <w:bCs w:val="false"/>
+                <w:sz w:val="19"/>
+                <w:szCs w:val="19"/>
+              </w:rPr>
+              <w:t xml:space="preserve">R</w:t>
+            </w:r>
+          </w:p>
+        </w:tc>
+        <w:tc>
+          <w:tcPr>
+            <w:tcW w:type="dxa" w:w="1500"/>
+            <w:tcBorders>
+              <w:top w:val="single" w:color="BBBBBB" w:sz="4"/>
+              <w:left w:val="single" w:color="BBBBBB" w:sz="4"/>
+              <w:bottom w:val="single" w:color="BBBBBB" w:sz="4"/>
+              <w:right w:val="single" w:color="BBBBBB" w:sz="4"/>
+            </w:tcBorders>
+            <w:tcMar>
+              <w:top w:type="dxa" w:w="70"/>
+              <w:left w:type="dxa" w:w="100"/>
+              <w:bottom w:type="dxa" w:w="70"/>
+              <w:right w:type="dxa" w:w="100"/>
+            </w:tcMar>
+          </w:tcPr>
+          <w:p>
+            <w:pPr>
+              <w:spacing w:after="0" w:line="280"/>
+            </w:pPr>
+            <w:r>
+              <w:rPr>
+                <w:rFonts w:ascii="Malgun Gothic" w:cs="Malgun Gothic" w:eastAsia="Malgun Gothic" w:hAnsi="Malgun Gothic"/>
+                <w:b w:val="false"/>
+                <w:bCs w:val="false"/>
+                <w:sz w:val="19"/>
+                <w:szCs w:val="19"/>
+              </w:rPr>
+              <w:t xml:space="preserve">50.7%</w:t>
+            </w:r>
+          </w:p>
+        </w:tc>
+        <w:tc>
+          <w:tcPr>
+            <w:tcW w:type="dxa" w:w="1500"/>
+            <w:tcBorders>
+              <w:top w:val="single" w:color="BBBBBB" w:sz="4"/>
+              <w:left w:val="single" w:color="BBBBBB" w:sz="4"/>
+              <w:bottom w:val="single" w:color="BBBBBB" w:sz="4"/>
+              <w:right w:val="single" w:color="BBBBBB" w:sz="4"/>
+            </w:tcBorders>
+            <w:tcMar>
+              <w:top w:type="dxa" w:w="70"/>
+              <w:left w:type="dxa" w:w="100"/>
+              <w:bottom w:type="dxa" w:w="70"/>
+              <w:right w:type="dxa" w:w="100"/>
+            </w:tcMar>
+          </w:tcPr>
+          <w:p>
+            <w:pPr>
+              <w:spacing w:after="0" w:line="280"/>
+            </w:pPr>
+            <w:r>
+              <w:rPr>
+                <w:rFonts w:ascii="Malgun Gothic" w:cs="Malgun Gothic" w:eastAsia="Malgun Gothic" w:hAnsi="Malgun Gothic"/>
+                <w:b w:val="false"/>
+                <w:bCs w:val="false"/>
+                <w:sz w:val="19"/>
+                <w:szCs w:val="19"/>
+              </w:rPr>
+              <w:t xml:space="preserve">65.1%</w:t>
+            </w:r>
+          </w:p>
+        </w:tc>
+        <w:tc>
+          <w:tcPr>
+            <w:tcW w:type="dxa" w:w="1500"/>
+            <w:tcBorders>
+              <w:top w:val="single" w:color="BBBBBB" w:sz="4"/>
+              <w:left w:val="single" w:color="BBBBBB" w:sz="4"/>
+              <w:bottom w:val="single" w:color="BBBBBB" w:sz="4"/>
+              <w:right w:val="single" w:color="BBBBBB" w:sz="4"/>
+            </w:tcBorders>
+            <w:tcMar>
+              <w:top w:type="dxa" w:w="70"/>
+              <w:left w:type="dxa" w:w="100"/>
+              <w:bottom w:type="dxa" w:w="70"/>
+              <w:right w:type="dxa" w:w="100"/>
+            </w:tcMar>
+          </w:tcPr>
+          <w:p>
+            <w:pPr>
+              <w:spacing w:after="0" w:line="280"/>
+            </w:pPr>
+            <w:r>
+              <w:rPr>
+                <w:rFonts w:ascii="Malgun Gothic" w:cs="Malgun Gothic" w:eastAsia="Malgun Gothic" w:hAnsi="Malgun Gothic"/>
+                <w:b w:val="false"/>
+                <w:bCs w:val="false"/>
+                <w:sz w:val="19"/>
+                <w:szCs w:val="19"/>
+              </w:rPr>
+              <w:t xml:space="preserve">78.0%</w:t>
+            </w:r>
+          </w:p>
+        </w:tc>
+        <w:tc>
+          <w:tcPr>
+            <w:tcW w:type="dxa" w:w="1500"/>
+            <w:tcBorders>
+              <w:top w:val="single" w:color="BBBBBB" w:sz="4"/>
+              <w:left w:val="single" w:color="BBBBBB" w:sz="4"/>
+              <w:bottom w:val="single" w:color="BBBBBB" w:sz="4"/>
+              <w:right w:val="single" w:color="BBBBBB" w:sz="4"/>
+            </w:tcBorders>
+            <w:tcMar>
+              <w:top w:type="dxa" w:w="70"/>
+              <w:left w:type="dxa" w:w="100"/>
+              <w:bottom w:type="dxa" w:w="70"/>
+              <w:right w:type="dxa" w:w="100"/>
+            </w:tcMar>
+          </w:tcPr>
+          <w:p>
+            <w:pPr>
+              <w:spacing w:after="0" w:line="280"/>
+            </w:pPr>
+            <w:r>
+              <w:rPr>
+                <w:rFonts w:ascii="Malgun Gothic" w:cs="Malgun Gothic" w:eastAsia="Malgun Gothic" w:hAnsi="Malgun Gothic"/>
+                <w:b w:val="false"/>
+                <w:bCs w:val="false"/>
+                <w:sz w:val="19"/>
+                <w:szCs w:val="19"/>
+              </w:rPr>
+              <w:t xml:space="preserve">55.7%</w:t>
+            </w:r>
+          </w:p>
+        </w:tc>
+        <w:tc>
+          <w:tcPr>
+            <w:tcW w:type="dxa" w:w="1160"/>
+            <w:tcBorders>
+              <w:top w:val="single" w:color="BBBBBB" w:sz="4"/>
+              <w:left w:val="single" w:color="BBBBBB" w:sz="4"/>
+              <w:bottom w:val="single" w:color="BBBBBB" w:sz="4"/>
+              <w:right w:val="single" w:color="BBBBBB" w:sz="4"/>
+            </w:tcBorders>
+            <w:tcMar>
+              <w:top w:type="dxa" w:w="70"/>
+              <w:left w:type="dxa" w:w="100"/>
+              <w:bottom w:type="dxa" w:w="70"/>
+              <w:right w:type="dxa" w:w="100"/>
+            </w:tcMar>
+          </w:tcPr>
+          <w:p>
+            <w:pPr>
+              <w:spacing w:after="0" w:line="280"/>
+            </w:pPr>
+            <w:r>
+              <w:rPr>
+                <w:rFonts w:ascii="Malgun Gothic" w:cs="Malgun Gothic" w:eastAsia="Malgun Gothic" w:hAnsi="Malgun Gothic"/>
+                <w:b w:val="false"/>
+                <w:bCs w:val="false"/>
+                <w:sz w:val="19"/>
+                <w:szCs w:val="19"/>
+              </w:rPr>
+              <w:t xml:space="preserve">−2.59</w:t>
+            </w:r>
+          </w:p>
+        </w:tc>
+      </w:tr>
+    </w:tbl>
+    <w:p>
+      <w:pPr>
+        <w:spacing w:after="80"/>
+      </w:pPr>
+    </w:p>
+    <w:p>
+      <w:pPr>
+        <w:spacing w:after="120" w:line="320"/>
+      </w:pPr>
+      <w:r>
+        <w:rPr>
+          <w:rFonts w:ascii="Malgun Gothic" w:cs="Malgun Gothic" w:eastAsia="Malgun Gothic" w:hAnsi="Malgun Gothic"/>
+          <w:sz w:val="21"/>
+          <w:szCs w:val="21"/>
+        </w:rPr>
+        <w:t xml:space="preserve">AI 사용률과 질문 감소의 상관은 2024년 −0.87, 2025년 −0.79, 2026년 −0.39였다(언어 8개). 사용률이 높은 언어일수록 질문이 더 많이 줄었다는 방향이지만, 표본이 8개뿐이어서 정황 증거로만 본다. 언어 간 AI 사용률 표준편차는 2023년에서 2025년에 약 6%p에서 7%p, 2026년에 12.5%p로 크지 않다.</w:t>
+      </w:r>
+    </w:p>
+    <w:p>
+      <w:pPr>
         <w:pStyle w:val="Heading1"/>
         <w:spacing w:after="140" w:before="320"/>
       </w:pPr>
@@ -4486,7 +6365,7 @@
           <w:sz w:val="21"/>
           <w:szCs w:val="21"/>
         </w:rPr>
-        <w:t xml:space="preserve">X는 태그의 출시 이전 인기도, 기술 성숙도, 대체 데이터량(문서 분량, GitHub 활동)이다.</w:t>
+        <w:t xml:space="preserve">X는 태그의 출시 이전 인기도, 기술 성숙도, 대체 데이터량(문서 분량, GitHub 활동)이다. 언어 태그에는 설문에서 만든 언어별 AI 사용률을 추가로 통제한다(4.3절).</w:t>
       </w:r>
     </w:p>
     <w:p>
@@ -4552,6 +6431,24 @@
           <w:szCs w:val="21"/>
         </w:rPr>
         <w:t xml:space="preserve">H3 (대체 데이터): D_i와 대체 데이터량의 상호작용항을 추가한다.</w:t>
+      </w:r>
+    </w:p>
+    <w:p>
+      <w:pPr>
+        <w:pStyle w:val="ListParagraph"/>
+        <w:numPr>
+          <w:ilvl w:val="0"/>
+          <w:numId w:val="2"/>
+        </w:numPr>
+        <w:spacing w:after="80" w:line="300"/>
+      </w:pPr>
+      <w:r>
+        <w:rPr>
+          <w:rFonts w:ascii="Malgun Gothic" w:cs="Malgun Gothic" w:eastAsia="Malgun Gothic" w:hAnsi="Malgun Gothic"/>
+          <w:sz w:val="21"/>
+          <w:szCs w:val="21"/>
+        </w:rPr>
+        <w:t xml:space="preserve">AI 채택 강도: 언어 태그만으로 제한한 부분표본에서 D_i와 언어별 AI 사용률(특히 2026년 문항)의 상호작용을 추정해, 질문 감소가 모델 역량이 아니라 사용 강도 때문인지 구분한다. 표본이 언어 8개 안팎이라 보조 분석으로만 둔다.</w:t>
       </w:r>
     </w:p>
     <w:p>
@@ -5656,6 +7553,104 @@
                 <w:sz w:val="19"/>
                 <w:szCs w:val="19"/>
               </w:rPr>
+              <w:t xml:space="preserve">AI 사용 강도의 미관측</w:t>
+            </w:r>
+          </w:p>
+        </w:tc>
+        <w:tc>
+          <w:tcPr>
+            <w:tcW w:type="dxa" w:w="3560"/>
+            <w:tcBorders>
+              <w:top w:val="single" w:color="BBBBBB" w:sz="4"/>
+              <w:left w:val="single" w:color="BBBBBB" w:sz="4"/>
+              <w:bottom w:val="single" w:color="BBBBBB" w:sz="4"/>
+              <w:right w:val="single" w:color="BBBBBB" w:sz="4"/>
+            </w:tcBorders>
+            <w:tcMar>
+              <w:top w:type="dxa" w:w="70"/>
+              <w:left w:type="dxa" w:w="100"/>
+              <w:bottom w:type="dxa" w:w="70"/>
+              <w:right w:type="dxa" w:w="100"/>
+            </w:tcMar>
+          </w:tcPr>
+          <w:p>
+            <w:pPr>
+              <w:spacing w:after="0" w:line="280"/>
+            </w:pPr>
+            <w:r>
+              <w:rPr>
+                <w:rFonts w:ascii="Malgun Gothic" w:cs="Malgun Gothic" w:eastAsia="Malgun Gothic" w:hAnsi="Malgun Gothic"/>
+                <w:b w:val="false"/>
+                <w:bCs w:val="false"/>
+                <w:sz w:val="19"/>
+                <w:szCs w:val="19"/>
+              </w:rPr>
+              <w:t xml:space="preserve">태그별 AI 사용 강도를 직접 관측하지 못한다. Economic Index는 기술 단위가 없고, 설문은 언어 단위(8개 태그)만 있다.</w:t>
+            </w:r>
+          </w:p>
+        </w:tc>
+        <w:tc>
+          <w:tcPr>
+            <w:tcW w:type="dxa" w:w="3600"/>
+            <w:tcBorders>
+              <w:top w:val="single" w:color="BBBBBB" w:sz="4"/>
+              <w:left w:val="single" w:color="BBBBBB" w:sz="4"/>
+              <w:bottom w:val="single" w:color="BBBBBB" w:sz="4"/>
+              <w:right w:val="single" w:color="BBBBBB" w:sz="4"/>
+            </w:tcBorders>
+            <w:tcMar>
+              <w:top w:type="dxa" w:w="70"/>
+              <w:left w:type="dxa" w:w="100"/>
+              <w:bottom w:type="dxa" w:w="70"/>
+              <w:right w:type="dxa" w:w="100"/>
+            </w:tcMar>
+          </w:tcPr>
+          <w:p>
+            <w:pPr>
+              <w:spacing w:after="0" w:line="280"/>
+            </w:pPr>
+            <w:r>
+              <w:rPr>
+                <w:rFonts w:ascii="Malgun Gothic" w:cs="Malgun Gothic" w:eastAsia="Malgun Gothic" w:hAnsi="Malgun Gothic"/>
+                <w:b w:val="false"/>
+                <w:bCs w:val="false"/>
+                <w:sz w:val="19"/>
+                <w:szCs w:val="19"/>
+              </w:rPr>
+              <w:t xml:space="preserve">언어 태그 부분표본에서 설문 기반 사용률을 통제하고, 전체 표본에서는 집계 채택 추세를 시간 고정효과로 흡수한다. 한계로 명시한다.</w:t>
+            </w:r>
+          </w:p>
+        </w:tc>
+      </w:tr>
+      <w:tr>
+        <w:tc>
+          <w:tcPr>
+            <w:tcW w:type="dxa" w:w="2200"/>
+            <w:tcBorders>
+              <w:top w:val="single" w:color="BBBBBB" w:sz="4"/>
+              <w:left w:val="single" w:color="BBBBBB" w:sz="4"/>
+              <w:bottom w:val="single" w:color="BBBBBB" w:sz="4"/>
+              <w:right w:val="single" w:color="BBBBBB" w:sz="4"/>
+            </w:tcBorders>
+            <w:tcMar>
+              <w:top w:type="dxa" w:w="70"/>
+              <w:left w:type="dxa" w:w="100"/>
+              <w:bottom w:type="dxa" w:w="70"/>
+              <w:right w:type="dxa" w:w="100"/>
+            </w:tcMar>
+          </w:tcPr>
+          <w:p>
+            <w:pPr>
+              <w:spacing w:after="0" w:line="280"/>
+            </w:pPr>
+            <w:r>
+              <w:rPr>
+                <w:rFonts w:ascii="Malgun Gothic" w:cs="Malgun Gothic" w:eastAsia="Malgun Gothic" w:hAnsi="Malgun Gothic"/>
+                <w:b w:val="false"/>
+                <w:bCs w:val="false"/>
+                <w:sz w:val="19"/>
+                <w:szCs w:val="19"/>
+              </w:rPr>
               <w:t xml:space="preserve">인과 방향</w:t>
             </w:r>
           </w:p>
@@ -5939,36 +7934,7 @@
           <w:sz w:val="21"/>
           <w:szCs w:val="21"/>
         </w:rPr>
-        <w:t xml:space="preserve">방법론 문헌(연속 처치 이중차분, 군집 부트스트랩)은 투고 전 원문을 확인해 추가한다.</w:t>
-      </w:r>
-    </w:p>
-    <w:p>
-      <w:pPr>
-        <w:spacing w:after="120" w:line="320"/>
-      </w:pPr>
-      <w:r>
-        <w:rPr>
-          <w:rFonts w:ascii="Malgun Gothic" w:cs="Malgun Gothic" w:eastAsia="Malgun Gothic" w:hAnsi="Malgun Gothic"/>
-          <w:sz w:val="21"/>
-          <w:szCs w:val="21"/>
-        </w:rPr>
-        <w:t xml:space="preserve">다음 단계는 (1) 모델 후보와 학습 시점 확정, (2) 태그 50개 기준 구간별 문항 수 확정, (3) 소규모 파일럿으로 격차 G의 태그 간 변이 확인이다. 파일럿의 판단 기준은 이전과 같다. 같은 모델 안에서 태그 간 격차 변이가 표본 노이즈보다 충분히 커야 한다.</w:t>
-      </w:r>
-    </w:p>
-    <w:p>
-      <w:pPr>
-        <w:pStyle w:val="Heading1"/>
-        <w:spacing w:after="140" w:before="320"/>
-      </w:pPr>
-      <w:r>
-        <w:rPr>
-          <w:rFonts w:ascii="Malgun Gothic" w:cs="Malgun Gothic" w:eastAsia="Malgun Gothic" w:hAnsi="Malgun Gothic"/>
-          <w:b/>
-          <w:bCs/>
-          <w:sz w:val="28"/>
-          <w:szCs w:val="28"/>
-        </w:rPr>
-        <w:t xml:space="preserve">참고문헌</w:t>
+        <w:t xml:space="preserve">태그별 AI 사용 강도를 직접 측정한 자료가 없다. 설문의 언어별 사용률은 8개 언어에만 연결되고 2023년에서 2025년 지표는 언어에 특정된 사용이 아니다.</w:t>
       </w:r>
     </w:p>
     <w:p>
@@ -5986,7 +7952,36 @@
           <w:sz w:val="21"/>
           <w:szCs w:val="21"/>
         </w:rPr>
-        <w:t xml:space="preserve">Burtch, G., Lee, D., &amp; Chen, Z. (2024). The consequences of generative AI for online knowledge communities. Scientific Reports, 14, 10413.</w:t>
+        <w:t xml:space="preserve">방법론 문헌(연속 처치 이중차분, 군집 부트스트랩)은 투고 전 원문을 확인해 추가한다.</w:t>
+      </w:r>
+    </w:p>
+    <w:p>
+      <w:pPr>
+        <w:spacing w:after="120" w:line="320"/>
+      </w:pPr>
+      <w:r>
+        <w:rPr>
+          <w:rFonts w:ascii="Malgun Gothic" w:cs="Malgun Gothic" w:eastAsia="Malgun Gothic" w:hAnsi="Malgun Gothic"/>
+          <w:sz w:val="21"/>
+          <w:szCs w:val="21"/>
+        </w:rPr>
+        <w:t xml:space="preserve">다음 단계는 (1) 모델 후보와 학습 시점 확정, (2) 태그 50개 기준 구간별 문항 수 확정, (3) 소규모 파일럿으로 격차 G의 태그 간 변이 확인이다. 파일럿의 판단 기준은 이전과 같다. 같은 모델 안에서 태그 간 격차 변이가 표본 노이즈보다 충분히 커야 한다.</w:t>
+      </w:r>
+    </w:p>
+    <w:p>
+      <w:pPr>
+        <w:pStyle w:val="Heading1"/>
+        <w:spacing w:after="140" w:before="320"/>
+      </w:pPr>
+      <w:r>
+        <w:rPr>
+          <w:rFonts w:ascii="Malgun Gothic" w:cs="Malgun Gothic" w:eastAsia="Malgun Gothic" w:hAnsi="Malgun Gothic"/>
+          <w:b/>
+          <w:bCs/>
+          <w:sz w:val="28"/>
+          <w:szCs w:val="28"/>
+        </w:rPr>
+        <w:t xml:space="preserve">참고문헌</w:t>
       </w:r>
     </w:p>
     <w:p>
@@ -6004,7 +7999,7 @@
           <w:sz w:val="21"/>
           <w:szCs w:val="21"/>
         </w:rPr>
-        <w:t xml:space="preserve">del Rio-Chanona, R. M., Laurentsyeva, N., &amp; Wachs, J. (2024). Large language models reduce public knowledge sharing on online Q&amp;A platforms. PNAS Nexus, 3(9), pgae400.</w:t>
+        <w:t xml:space="preserve">Burtch, G., Lee, D., &amp; Chen, Z. (2024). The consequences of generative AI for online knowledge communities. Scientific Reports, 14, 10413.</w:t>
       </w:r>
     </w:p>
     <w:p>
@@ -6022,7 +8017,7 @@
           <w:sz w:val="21"/>
           <w:szCs w:val="21"/>
         </w:rPr>
-        <w:t xml:space="preserve">Zheng, J. 외. Can ChatGPT kill user-generated Q&amp;A platforms? Information Systems Research. https://doi.org/10.1287/isre.2023.0561 (저자 명단 확인 필요)</w:t>
+        <w:t xml:space="preserve">del Rio-Chanona, R. M., Laurentsyeva, N., &amp; Wachs, J. (2024). Large language models reduce public knowledge sharing on online Q&amp;A platforms. PNAS Nexus, 3(9), pgae400.</w:t>
       </w:r>
     </w:p>
     <w:p>
@@ -6040,7 +8035,7 @@
           <w:sz w:val="21"/>
           <w:szCs w:val="21"/>
         </w:rPr>
-        <w:t xml:space="preserve">arXiv:2311.16822. Large Language Models Suffer From Their Own Output: An Analysis of the Self-Consuming Training Loop. (저자 확인 필요)</w:t>
+        <w:t xml:space="preserve">Zheng, J. 외. Can ChatGPT kill user-generated Q&amp;A platforms? Information Systems Research. https://doi.org/10.1287/isre.2023.0561 (저자 명단 확인 필요)</w:t>
       </w:r>
     </w:p>
     <w:p>
@@ -6058,7 +8053,7 @@
           <w:sz w:val="21"/>
           <w:szCs w:val="21"/>
         </w:rPr>
-        <w:t xml:space="preserve">arXiv:2402.08801. LLMs and Stack Overflow Discussions: Reliability, Impact, and Challenges. (저자 확인 필요)</w:t>
+        <w:t xml:space="preserve">arXiv:2311.16822. Large Language Models Suffer From Their Own Output: An Analysis of the Self-Consuming Training Loop. (저자 확인 필요)</w:t>
       </w:r>
     </w:p>
     <w:p>
@@ -6076,7 +8071,7 @@
           <w:sz w:val="21"/>
           <w:szCs w:val="21"/>
         </w:rPr>
-        <w:t xml:space="preserve">arXiv:2509.05879. Stack Overflow Is Not Dead Yet: Crowd Answers Still Matter. (저자 확인 필요)</w:t>
+        <w:t xml:space="preserve">arXiv:2402.08801. LLMs and Stack Overflow Discussions: Reliability, Impact, and Challenges. (저자 확인 필요)</w:t>
       </w:r>
     </w:p>
     <w:p>
@@ -6094,7 +8089,7 @@
           <w:sz w:val="21"/>
           <w:szCs w:val="21"/>
         </w:rPr>
-        <w:t xml:space="preserve">Cheng, J. 외. Dated Data: Tracing Knowledge Cutoffs in Large Language Models. arXiv:2403.12958. (저자 전체 확인 필요)</w:t>
+        <w:t xml:space="preserve">arXiv:2509.05879. Stack Overflow Is Not Dead Yet: Crowd Answers Still Matter. (저자 확인 필요)</w:t>
       </w:r>
     </w:p>
     <w:p>
@@ -6112,7 +8107,61 @@
           <w:sz w:val="21"/>
           <w:szCs w:val="21"/>
         </w:rPr>
+        <w:t xml:space="preserve">Cheng, J. 외. Dated Data: Tracing Knowledge Cutoffs in Large Language Models. arXiv:2403.12958. (저자 전체 확인 필요)</w:t>
+      </w:r>
+    </w:p>
+    <w:p>
+      <w:pPr>
+        <w:pStyle w:val="ListParagraph"/>
+        <w:numPr>
+          <w:ilvl w:val="0"/>
+          <w:numId w:val="2"/>
+        </w:numPr>
+        <w:spacing w:after="80" w:line="300"/>
+      </w:pPr>
+      <w:r>
+        <w:rPr>
+          <w:rFonts w:ascii="Malgun Gothic" w:cs="Malgun Gothic" w:eastAsia="Malgun Gothic" w:hAnsi="Malgun Gothic"/>
+          <w:sz w:val="21"/>
+          <w:szCs w:val="21"/>
+        </w:rPr>
         <w:t xml:space="preserve">LibEvoBench: Probing Temporal Knowledge Stratification in Code Generation Models. (게재 학회와 저자 확인 필요; 요약 페이지 기준)</w:t>
+      </w:r>
+    </w:p>
+    <w:p>
+      <w:pPr>
+        <w:pStyle w:val="ListParagraph"/>
+        <w:numPr>
+          <w:ilvl w:val="0"/>
+          <w:numId w:val="2"/>
+        </w:numPr>
+        <w:spacing w:after="80" w:line="300"/>
+      </w:pPr>
+      <w:r>
+        <w:rPr>
+          <w:rFonts w:ascii="Malgun Gothic" w:cs="Malgun Gothic" w:eastAsia="Malgun Gothic" w:hAnsi="Malgun Gothic"/>
+          <w:sz w:val="21"/>
+          <w:szCs w:val="21"/>
+        </w:rPr>
+        <w:t xml:space="preserve">Stack Overflow Developer Survey 2023-2026. ODbL 1.0. https://github.com/StackExchange/Survey</w:t>
+      </w:r>
+    </w:p>
+    <w:p>
+      <w:pPr>
+        <w:pStyle w:val="ListParagraph"/>
+        <w:numPr>
+          <w:ilvl w:val="0"/>
+          <w:numId w:val="2"/>
+        </w:numPr>
+        <w:spacing w:after="80" w:line="300"/>
+      </w:pPr>
+      <w:r>
+        <w:rPr>
+          <w:rFonts w:ascii="Malgun Gothic" w:cs="Malgun Gothic" w:eastAsia="Malgun Gothic" w:hAnsi="Malgun Gothic"/>
+          <w:sz w:val="21"/>
+          <w:szCs w:val="21"/>
+        </w:rPr>
+        <w:t xml:space="preserve">Anthropic Economic Index. CC-BY-4.0. https://huggingface.co/datasets/Anthropic/EconomicIndex</w:t>
       </w:r>
     </w:p>
     <w:p>

</xml_diff>